<commit_message>
fix: restore complete education section, add AI Asana Analyst PRD and patent research to resume
</commit_message>
<xml_diff>
--- a/Sohan_Gadewar_Google_APM_Resume.docx
+++ b/Sohan_Gadewar_Google_APM_Resume.docx
@@ -4,614 +4,425 @@
   <w:body>
     <w:p>
       <w:pPr>
-        <w:spacing w:before="0" w:after="10"/>
+        <w:spacing w:before="0" w:after="10" w:line="247" w:lineRule="auto"/>
         <w:jc w:val="center"/>
       </w:pPr>
       <w:r>
         <w:rPr>
+          <w:rFonts w:ascii="Calibri" w:hAnsi="Calibri"/>
           <w:b/>
-          <w:color w:val="0F172A"/>
-          <w:sz w:val="33"/>
+          <w:color w:val="121214"/>
+          <w:sz w:val="31"/>
         </w:rPr>
         <w:t>SOHAN GADEWAR</w:t>
       </w:r>
     </w:p>
     <w:p>
       <w:pPr>
-        <w:spacing w:before="0" w:after="10"/>
+        <w:spacing w:before="0" w:after="20" w:line="247" w:lineRule="auto"/>
         <w:jc w:val="center"/>
       </w:pPr>
       <w:r>
         <w:rPr>
+          <w:rFonts w:ascii="Calibri" w:hAnsi="Calibri"/>
           <w:b/>
-          <w:color w:val="0D9488"/>
-          <w:sz w:val="17"/>
+          <w:color w:val="28282D"/>
+          <w:sz w:val="18"/>
         </w:rPr>
-        <w:t>Associate Product Manager Intern Candidate   |   B.Tech IT, VIIT Pune (CGPA: 8.97 / 10.0)</w:t>
+        <w:t>Associate Product Manager Intern Candidate  |  B.Tech IT, VIIT Pune (CGPA: 8.97 / 10.0)</w:t>
       </w:r>
     </w:p>
     <w:p>
       <w:pPr>
-        <w:spacing w:before="0" w:after="10"/>
+        <w:spacing w:before="0" w:after="40" w:line="247" w:lineRule="auto"/>
         <w:jc w:val="center"/>
       </w:pPr>
       <w:r>
         <w:rPr>
-          <w:color w:val="64748B"/>
-          <w:sz w:val="16"/>
+          <w:rFonts w:ascii="Calibri" w:hAnsi="Calibri"/>
+          <w:color w:val="5A5A5F"/>
+          <w:sz w:val="17"/>
         </w:rPr>
-        <w:t>+91 9022778561   •   sohangadewar9022@gmail.com   •   Portfolio   •   LinkedIn   •   GitHub   •   Pune, India</w:t>
+        <w:t>+91 9022778561  •  sohangadewar9022@gmail.com  •  Portfolio: portfolio-sohan9022.vercel.app  •  LinkedIn  •  GitHub  •  Pune, India</w:t>
       </w:r>
     </w:p>
     <w:p>
       <w:pPr>
-        <w:keepNext/>
-        <w:spacing w:before="100" w:after="30"/>
+        <w:spacing w:before="100" w:after="30" w:line="247" w:lineRule="auto"/>
         <w:pBdr>
-          <w:bottom w:val="single" w:sz="4" w:space="1" w:color="1E293B"/>
+          <w:bottom w:val="single" w:sz="6" w:space="1" w:color="D5D5CE"/>
         </w:pBdr>
       </w:pPr>
       <w:r>
         <w:rPr>
+          <w:rFonts w:ascii="Calibri" w:hAnsi="Calibri"/>
           <w:b/>
-          <w:color w:val="141E32"/>
-          <w:sz w:val="19"/>
+          <w:color w:val="121214"/>
+          <w:sz w:val="20"/>
         </w:rPr>
         <w:t>EDUCATION</w:t>
       </w:r>
     </w:p>
-    <w:tbl>
-      <w:tblPr>
-        <w:tblW w:type="auto" w:w="0"/>
-        <w:tblLayout w:type="fixed"/>
-        <w:tblLook w:firstColumn="1" w:firstRow="1" w:lastColumn="0" w:lastRow="0" w:noHBand="0" w:noVBand="1" w:val="04A0"/>
-      </w:tblPr>
-      <w:tblGrid>
-        <w:gridCol w:w="8496"/>
-        <w:gridCol w:w="2304"/>
-      </w:tblGrid>
-      <w:tr>
-        <w:tc>
-          <w:tcPr>
-            <w:tcW w:type="dxa" w:w="5400"/>
-          </w:tcPr>
-          <w:p>
-            <w:pPr>
-              <w:spacing w:before="0" w:after="0"/>
-            </w:pPr>
-            <w:r>
-              <w:rPr>
-                <w:b/>
-                <w:color w:val="141E32"/>
-                <w:sz w:val="18"/>
-              </w:rPr>
-              <w:t>Vishwakarma Institute of Information Technology (VIIT), Pune</w:t>
-              <w:br/>
-            </w:r>
-            <w:r>
-              <w:rPr>
-                <w:sz w:val="17"/>
-              </w:rPr>
-              <w:t xml:space="preserve">B.Tech in Information Technology   |   </w:t>
-            </w:r>
-            <w:r>
-              <w:rPr>
-                <w:b/>
-                <w:color w:val="141E32"/>
-                <w:sz w:val="17"/>
-              </w:rPr>
-              <w:t>Current CGPA: 8.97 / 10.0</w:t>
-              <w:br/>
-            </w:r>
-            <w:r>
-              <w:rPr>
-                <w:color w:val="64748B"/>
-                <w:sz w:val="16"/>
-              </w:rPr>
-              <w:t>• Coursework: Data Structures &amp; Algorithms, DBMS, Operating Systems, Computer Networks, System Design</w:t>
-              <w:br/>
-              <w:t>• Problem Solving: 400+ LeetCode &amp; 210+ GeeksforGeeks — strong algorithmic foundations for engineering alignment</w:t>
-            </w:r>
-          </w:p>
-        </w:tc>
-        <w:tc>
-          <w:tcPr>
-            <w:tcW w:type="dxa" w:w="5400"/>
-          </w:tcPr>
-          <w:p>
-            <w:pPr>
-              <w:spacing w:before="0" w:after="0"/>
-              <w:jc w:val="right"/>
-            </w:pPr>
-            <w:r>
-              <w:rPr>
-                <w:color w:val="64748B"/>
-                <w:sz w:val="16"/>
-              </w:rPr>
-              <w:t>2023 – 2027</w:t>
-              <w:br/>
-              <w:t>Pune, India</w:t>
-            </w:r>
-          </w:p>
-        </w:tc>
-      </w:tr>
-    </w:tbl>
     <w:p>
       <w:pPr>
-        <w:keepNext/>
-        <w:spacing w:before="100" w:after="30"/>
+        <w:spacing w:before="20" w:after="10" w:line="247" w:lineRule="auto"/>
+      </w:pPr>
+      <w:r>
+        <w:rPr>
+          <w:rFonts w:ascii="Calibri" w:hAnsi="Calibri"/>
+          <w:b/>
+          <w:sz w:val="18"/>
+        </w:rPr>
+        <w:t>Vishwakarma Institute of Information Technology (VIIT), Pune</w:t>
+      </w:r>
+      <w:r>
+        <w:rPr>
+          <w:rFonts w:ascii="Calibri" w:hAnsi="Calibri"/>
+          <w:sz w:val="18"/>
+        </w:rPr>
+        <w:t xml:space="preserve">  |  Bachelor of Technology in Information Technology</w:t>
+      </w:r>
+      <w:r>
+        <w:rPr>
+          <w:rFonts w:ascii="Calibri" w:hAnsi="Calibri"/>
+          <w:b/>
+          <w:sz w:val="18"/>
+        </w:rPr>
+        <w:t xml:space="preserve">  |  2023 – 2027  |  CGPA: 8.97 / 10.0</w:t>
+      </w:r>
+    </w:p>
+    <w:p>
+      <w:pPr>
+        <w:spacing w:before="0" w:after="40" w:line="247" w:lineRule="auto"/>
+      </w:pPr>
+      <w:r>
+        <w:rPr>
+          <w:rFonts w:ascii="Calibri" w:hAnsi="Calibri"/>
+          <w:color w:val="3C3C41"/>
+          <w:sz w:val="17"/>
+        </w:rPr>
+        <w:t>Relevant Coursework: Data Structures &amp; Algorithms, DBMS, Operating Systems, Computer Networks, System Design  •  Problem Solving: 400+ LeetCode, 210+ GeeksforGeeks</w:t>
+      </w:r>
+    </w:p>
+    <w:p>
+      <w:pPr>
+        <w:spacing w:before="100" w:after="30" w:line="247" w:lineRule="auto"/>
         <w:pBdr>
-          <w:bottom w:val="single" w:sz="4" w:space="1" w:color="1E293B"/>
+          <w:bottom w:val="single" w:sz="6" w:space="1" w:color="D5D5CE"/>
         </w:pBdr>
       </w:pPr>
       <w:r>
         <w:rPr>
+          <w:rFonts w:ascii="Calibri" w:hAnsi="Calibri"/>
           <w:b/>
-          <w:color w:val="141E32"/>
-          <w:sz w:val="19"/>
+          <w:color w:val="121214"/>
+          <w:sz w:val="20"/>
         </w:rPr>
-        <w:t>PRODUCT PROJECTS</w:t>
+        <w:t>PRODUCT PROJECTS &amp; PRD SPECIFICATIONS</w:t>
       </w:r>
     </w:p>
     <w:p>
       <w:pPr>
-        <w:keepNext/>
-        <w:spacing w:before="60" w:after="10"/>
+        <w:spacing w:before="40" w:after="10" w:line="247" w:lineRule="auto"/>
       </w:pPr>
       <w:r>
         <w:rPr>
+          <w:rFonts w:ascii="Calibri" w:hAnsi="Calibri"/>
           <w:b/>
-          <w:color w:val="141E32"/>
           <w:sz w:val="18"/>
         </w:rPr>
-        <w:t>SHRH — Semantic Human-Readable Hashing</w:t>
-      </w:r>
-      <w:r>
-        <w:rPr>
-          <w:color w:val="0D9488"/>
-          <w:sz w:val="16"/>
-        </w:rPr>
-        <w:t xml:space="preserve">   |   AI Safety &amp; Governance • Google APM PRD Specification   |   2026</w:t>
+        <w:t>SHRH — Semantic Human-Readable Hashing  |  AI Governance &amp; DevTools  |  Google APM PRD Specification</w:t>
       </w:r>
     </w:p>
     <w:p>
       <w:pPr>
-        <w:pStyle w:val="ListBullet"/>
-        <w:spacing w:before="0" w:after="20"/>
-        <w:ind w:left="259"/>
+        <w:spacing w:before="0" w:after="10" w:line="247" w:lineRule="auto"/>
       </w:pPr>
       <w:r>
         <w:rPr>
-          <w:b/>
-          <w:color w:val="141E32"/>
+          <w:rFonts w:ascii="Calibri" w:hAnsi="Calibri"/>
           <w:sz w:val="17"/>
         </w:rPr>
-        <w:t xml:space="preserve">Problem: </w:t>
-      </w:r>
-      <w:r>
-        <w:rPr>
-          <w:color w:val="334155"/>
-          <w:sz w:val="17"/>
-        </w:rPr>
-        <w:t>Enterprise AI teams managing 50–500 production prompts in git face alert fatigue: binary SHA-256 hashes treat harmless formatting typos and dangerous security downgrades (‘MUST enforce MFA’ → ‘MAY enforce MFA’) as identical alarms.</w:t>
+        <w:t>• Problem: Enterprise AI teams managing 50–500 production prompts in git suffer alert fatigue: SHA-256 hashes treat harmless typos and critical security regressions ('MUST enforce MFA' → 'MAY enforce MFA') as identical alarms.</w:t>
       </w:r>
     </w:p>
     <w:p>
       <w:pPr>
-        <w:pStyle w:val="ListBullet"/>
-        <w:spacing w:before="0" w:after="20"/>
-        <w:ind w:left="259"/>
+        <w:spacing w:before="0" w:after="10" w:line="247" w:lineRule="auto"/>
       </w:pPr>
       <w:r>
         <w:rPr>
-          <w:b/>
-          <w:color w:val="141E32"/>
+          <w:rFonts w:ascii="Calibri" w:hAnsi="Calibri"/>
           <w:sz w:val="17"/>
         </w:rPr>
-        <w:t xml:space="preserve">Product Decision: </w:t>
-      </w:r>
-      <w:r>
-        <w:rPr>
-          <w:color w:val="334155"/>
-          <w:sz w:val="17"/>
-        </w:rPr>
-        <w:t>Identified that topical drift and constraint impact are orthogonal risk signals. Chose a local Dual-Channel Gate over cloud LLMs, eliminating $15k/mo cost, latency, and data egress while routing PRs into Auto-Approve, Review, or Quarantine.</w:t>
+        <w:t>• Product Decision: Identified that topical drift and deontic constraint shifts are orthogonal risk signals. Architected a local Dual-Channel Gate over cloud LLMs, eliminating $15k/mo cost, latency, and data egress while triaging PRs into Auto-Approve, Review, or Quarantine.</w:t>
       </w:r>
     </w:p>
     <w:p>
       <w:pPr>
-        <w:pStyle w:val="ListBullet"/>
-        <w:spacing w:before="0" w:after="30"/>
-        <w:ind w:left="259"/>
+        <w:spacing w:before="0" w:after="40" w:line="247" w:lineRule="auto"/>
       </w:pPr>
       <w:r>
         <w:rPr>
-          <w:b/>
-          <w:color w:val="141E32"/>
+          <w:rFonts w:ascii="Calibri" w:hAnsi="Calibri"/>
           <w:sz w:val="17"/>
         </w:rPr>
-        <w:t xml:space="preserve">Validation: </w:t>
-      </w:r>
-      <w:r>
-        <w:rPr>
-          <w:color w:val="334155"/>
-          <w:sz w:val="17"/>
-        </w:rPr>
-        <w:t>Benchmarked on 2,744 revision pairs: slashed defect escapes by 92.6% (5.4% vs 73.4% baseline) with 0.0% false alarms; 70.0% routine prompt PRs auto-merge. Authored 500-line Google APM PRD defining JTBD, Maya Lin ICP, and ASTR North Star metric.</w:t>
+        <w:t>• Validation &amp; PRD: Benchmarked on 2,744 revision pairs: slashed defect escapes by 92.6% with 0.0% false alarms; 70.0% routine PRs auto-merge. Authored comprehensive Google APM PRD defining JTBD, Maya Lin ICP, and Autonomous Safe Triage Rate (ASTR).</w:t>
       </w:r>
     </w:p>
     <w:p>
       <w:pPr>
-        <w:keepNext/>
-        <w:spacing w:before="60" w:after="10"/>
+        <w:spacing w:before="40" w:after="10" w:line="247" w:lineRule="auto"/>
       </w:pPr>
       <w:r>
         <w:rPr>
+          <w:rFonts w:ascii="Calibri" w:hAnsi="Calibri"/>
           <w:b/>
-          <w:color w:val="141E32"/>
           <w:sz w:val="18"/>
         </w:rPr>
-        <w:t>Project Sentinel — AI Project Memory &amp; Decision Agent</w:t>
-      </w:r>
-      <w:r>
-        <w:rPr>
-          <w:color w:val="0D9488"/>
-          <w:sz w:val="16"/>
-        </w:rPr>
-        <w:t xml:space="preserve">   |   Enterprise Productivity • Live MVP: echo-sentinel-08.lovable.app   |   2026</w:t>
+        <w:t>Project Sentinel — AI Project Memory &amp; Decision Agent  |  Enterprise AI  |  Live MVP: echo-sentinel-08.lovable.app</w:t>
       </w:r>
     </w:p>
     <w:p>
       <w:pPr>
-        <w:pStyle w:val="ListBullet"/>
-        <w:spacing w:before="0" w:after="20"/>
-        <w:ind w:left="259"/>
+        <w:spacing w:before="0" w:after="10" w:line="247" w:lineRule="auto"/>
       </w:pPr>
       <w:r>
         <w:rPr>
-          <w:b/>
-          <w:color w:val="141E32"/>
+          <w:rFonts w:ascii="Calibri" w:hAnsi="Calibri"/>
           <w:sz w:val="17"/>
         </w:rPr>
-        <w:t xml:space="preserve">Problem: </w:t>
-      </w:r>
-      <w:r>
-        <w:rPr>
-          <w:color w:val="334155"/>
-          <w:sz w:val="17"/>
-        </w:rPr>
-        <w:t>Engineering teams make critical decisions across standups, Slack, and Jira that are quickly lost. Proactive AI bots aggravate team fatigue by posting constant unprompted summaries that interrupt deep work and erode trust.</w:t>
+        <w:t>• Problem: Engineering decisions made across standups, Slack, and Jira are quickly lost. Chatty AI bots aggravate notification fatigue by posting unprompted summaries that interrupt deep work and erode developer trust.</w:t>
       </w:r>
     </w:p>
     <w:p>
       <w:pPr>
-        <w:pStyle w:val="ListBullet"/>
-        <w:spacing w:before="0" w:after="20"/>
-        <w:ind w:left="259"/>
+        <w:spacing w:before="0" w:after="10" w:line="247" w:lineRule="auto"/>
       </w:pPr>
       <w:r>
         <w:rPr>
-          <w:b/>
-          <w:color w:val="141E32"/>
+          <w:rFonts w:ascii="Calibri" w:hAnsi="Calibri"/>
           <w:sz w:val="17"/>
         </w:rPr>
-        <w:t xml:space="preserve">Product Decision: </w:t>
-      </w:r>
-      <w:r>
-        <w:rPr>
-          <w:color w:val="334155"/>
-          <w:sz w:val="17"/>
-        </w:rPr>
-        <w:t>Identified unsolicited bot interruptions as the core UX failure. Prioritized user trust over feature density by designing a ‘Silent by Default’ architecture that listens passively and only surfaces drift when explicitly queried.</w:t>
+        <w:t>• Product Decision: Prioritized user attention over bot visibility. Enforced a 'Silent by Default' model that ingests transcripts and commit streams passively, surfacing drift between spoken intent and database logs only when explicitly queried.</w:t>
       </w:r>
     </w:p>
     <w:p>
       <w:pPr>
-        <w:pStyle w:val="ListBullet"/>
-        <w:spacing w:before="0" w:after="30"/>
-        <w:ind w:left="259"/>
+        <w:spacing w:before="0" w:after="40" w:line="247" w:lineRule="auto"/>
       </w:pPr>
       <w:r>
         <w:rPr>
-          <w:b/>
-          <w:color w:val="141E32"/>
+          <w:rFonts w:ascii="Calibri" w:hAnsi="Calibri"/>
           <w:sz w:val="17"/>
         </w:rPr>
-        <w:t xml:space="preserve">Outcome: </w:t>
-      </w:r>
-      <w:r>
-        <w:rPr>
-          <w:color w:val="334155"/>
-          <w:sz w:val="17"/>
-        </w:rPr>
-        <w:t>Shipped interactive 8-step live Lovable MVP with immutable decision log, state-drift detection, and queryable memory. Authored complete Notion PRD with PostgreSQL event schemas, data models, and user stories.</w:t>
+        <w:t>• Outcome: Shipped interactive 8-step live Lovable MVP featuring immutable decision stores, state-drift detection, and audit queries. Authored complete Notion PRD with PostgreSQL event schemas, state machines, and user stories.</w:t>
       </w:r>
     </w:p>
     <w:p>
       <w:pPr>
-        <w:keepNext/>
-        <w:spacing w:before="60" w:after="10"/>
+        <w:spacing w:before="40" w:after="10" w:line="247" w:lineRule="auto"/>
       </w:pPr>
       <w:r>
         <w:rPr>
+          <w:rFonts w:ascii="Calibri" w:hAnsi="Calibri"/>
           <w:b/>
-          <w:color w:val="141E32"/>
           <w:sz w:val="18"/>
         </w:rPr>
-        <w:t>FinMate AI — Conversational Personal Finance Agent</w:t>
-      </w:r>
-      <w:r>
-        <w:rPr>
-          <w:color w:val="0D9488"/>
-          <w:sz w:val="16"/>
-        </w:rPr>
-        <w:t xml:space="preserve">   |   Fintech &amp; Systems • Live MVP: tell-finmate-ai.lovable.app   |   2025</w:t>
+        <w:t>AI Asana Analyst — Edge Computer Vision vs. Asynchronous GenAI  |  AI Systems &amp; HCI  |  Full PRD v2.0</w:t>
       </w:r>
     </w:p>
     <w:p>
       <w:pPr>
-        <w:pStyle w:val="ListBullet"/>
-        <w:spacing w:before="0" w:after="20"/>
-        <w:ind w:left="259"/>
+        <w:spacing w:before="0" w:after="10" w:line="247" w:lineRule="auto"/>
       </w:pPr>
       <w:r>
         <w:rPr>
-          <w:b/>
-          <w:color w:val="141E32"/>
+          <w:rFonts w:ascii="Calibri" w:hAnsi="Calibri"/>
           <w:sz w:val="17"/>
         </w:rPr>
-        <w:t xml:space="preserve">Problem: </w:t>
-      </w:r>
-      <w:r>
-        <w:rPr>
-          <w:color w:val="334155"/>
-          <w:sz w:val="17"/>
-        </w:rPr>
-        <w:t>Personal finance apps suffer high abandonment due to tedious multi-field forms per expense. Conversely, conversational LLMs easily hallucinate math totals, making them untrustworthy for managing balances and informal loans.</w:t>
+        <w:t>• Problem &amp; Latency Budget: Real-time yoga posture evaluation requires 25 FPS (40ms budget). Cloud multimodal vision LLMs introduce 800ms–2s latency and high API costs, while visual-only feedback overwhelms practitioners holding balance poses.</w:t>
       </w:r>
     </w:p>
     <w:p>
       <w:pPr>
-        <w:pStyle w:val="ListBullet"/>
-        <w:spacing w:before="0" w:after="20"/>
-        <w:ind w:left="259"/>
+        <w:spacing w:before="0" w:after="40" w:line="247" w:lineRule="auto"/>
       </w:pPr>
       <w:r>
         <w:rPr>
-          <w:b/>
-          <w:color w:val="141E32"/>
+          <w:rFonts w:ascii="Calibri" w:hAnsi="Calibri"/>
           <w:sz w:val="17"/>
         </w:rPr>
-        <w:t xml:space="preserve">Product Decision: </w:t>
-      </w:r>
-      <w:r>
-        <w:rPr>
-          <w:color w:val="334155"/>
-          <w:sz w:val="17"/>
-        </w:rPr>
-        <w:t>Scoped LLM strictly to intent and entity extraction, delegating 100% of arithmetic and balance tracking to deterministic PostgreSQL RPCs with source transaction citations. Rejected SMS scraping in V1 to protect privacy.</w:t>
+        <w:t>• PRD &amp; Architecture: Architected a decoupled pipeline: MediaPipe BlazePose (33 landmarks) + NumPy geometric engine evaluate angles on edge CPU (&lt;40ms) with offline audio alerts (pyttsx3, 3s cooldown). Delegated conversational coaching paragraphs to non-blocking asynchronous GenAI in post-session PDF reports with silent fallback to rule-based strings.</w:t>
       </w:r>
     </w:p>
     <w:p>
       <w:pPr>
-        <w:pStyle w:val="ListBullet"/>
-        <w:spacing w:before="0" w:after="30"/>
-        <w:ind w:left="259"/>
+        <w:spacing w:before="100" w:after="30" w:line="247" w:lineRule="auto"/>
+        <w:pBdr>
+          <w:bottom w:val="single" w:sz="6" w:space="1" w:color="D5D5CE"/>
+        </w:pBdr>
       </w:pPr>
       <w:r>
         <w:rPr>
+          <w:rFonts w:ascii="Calibri" w:hAnsi="Calibri"/>
           <w:b/>
-          <w:color w:val="141E32"/>
-          <w:sz w:val="17"/>
+          <w:color w:val="121214"/>
+          <w:sz w:val="20"/>
         </w:rPr>
-        <w:t xml:space="preserve">Outcome: </w:t>
-      </w:r>
-      <w:r>
-        <w:rPr>
-          <w:color w:val="334155"/>
-          <w:sz w:val="17"/>
-        </w:rPr>
-        <w:t>Shipped functional multi-modal live MVP supporting voice notes, natural language, and receipt OCR with verifiable auditability. Part of an active 6-product AI portfolio demonstrating end-to-end PM execution.</w:t>
+        <w:t>PATENTS &amp; USER RESEARCH</w:t>
       </w:r>
     </w:p>
     <w:p>
       <w:pPr>
-        <w:keepNext/>
-        <w:spacing w:before="100" w:after="30"/>
+        <w:spacing w:before="20" w:after="10" w:line="247" w:lineRule="auto"/>
+      </w:pPr>
+      <w:r>
+        <w:rPr>
+          <w:rFonts w:ascii="Calibri" w:hAnsi="Calibri"/>
+          <w:sz w:val="17"/>
+        </w:rPr>
+        <w:t>• Patent Application Draft (VIT Pune UX Lab): AI-Driven Multilingual Adaptive UI Framework &amp; Zero-Risk Financial Sandbox — Designed a dual-mode environment controller pairing live transactions with a simulated practice sandbox (dummy balances), in-situ Hold-to-Translate, and Circle-to-Understand gesture inspection to eliminate operational anxiety in emerging markets | 2026</w:t>
+      </w:r>
+    </w:p>
+    <w:p>
+      <w:pPr>
+        <w:spacing w:before="0" w:after="40" w:line="247" w:lineRule="auto"/>
+      </w:pPr>
+      <w:r>
+        <w:rPr>
+          <w:rFonts w:ascii="Calibri" w:hAnsi="Calibri"/>
+          <w:sz w:val="17"/>
+        </w:rPr>
+        <w:t>• Patent Filed (South African Patent Office): AI-Powered Lost &amp; Found Matching System — Conceptualized a privacy-first blind matching architecture using a 5-factor multimodal scoring model (image, text, geo, timestamp) with automated urgency detection | 2025</w:t>
+      </w:r>
+    </w:p>
+    <w:p>
+      <w:pPr>
+        <w:spacing w:before="100" w:after="30" w:line="247" w:lineRule="auto"/>
         <w:pBdr>
-          <w:bottom w:val="single" w:sz="4" w:space="1" w:color="1E293B"/>
+          <w:bottom w:val="single" w:sz="6" w:space="1" w:color="D5D5CE"/>
         </w:pBdr>
       </w:pPr>
       <w:r>
         <w:rPr>
+          <w:rFonts w:ascii="Calibri" w:hAnsi="Calibri"/>
           <w:b/>
-          <w:color w:val="141E32"/>
-          <w:sz w:val="19"/>
+          <w:color w:val="121214"/>
+          <w:sz w:val="20"/>
         </w:rPr>
-        <w:t>AWARDS &amp; RECOGNITION</w:t>
+        <w:t>AWARDS &amp; COMPETITIVE ACHIEVEMENTS</w:t>
       </w:r>
     </w:p>
     <w:p>
       <w:pPr>
-        <w:pStyle w:val="ListBullet"/>
-        <w:spacing w:before="0" w:after="20"/>
-        <w:ind w:left="259"/>
+        <w:spacing w:before="20" w:after="10" w:line="247" w:lineRule="auto"/>
       </w:pPr>
       <w:r>
         <w:rPr>
-          <w:b/>
-          <w:color w:val="141E32"/>
+          <w:rFonts w:ascii="Calibri" w:hAnsi="Calibri"/>
           <w:sz w:val="17"/>
         </w:rPr>
-        <w:t xml:space="preserve">India Innovates Hackathon — Finalist: </w:t>
-      </w:r>
-      <w:r>
-        <w:rPr>
-          <w:color w:val="334155"/>
-          <w:sz w:val="17"/>
-        </w:rPr>
-        <w:t>Selected in top ~1,000 finalist teams nationwide out of ~6,000+ participating teams (Top ~16%)</w:t>
+        <w:t>• India Innovates Hackathon — Finalist: Selected among top ~1,000 finalist teams nationwide out of ~6,000+ participating teams (Top ~16%)</w:t>
       </w:r>
     </w:p>
     <w:p>
       <w:pPr>
-        <w:pStyle w:val="ListBullet"/>
-        <w:spacing w:before="0" w:after="20"/>
-        <w:ind w:left="259"/>
+        <w:spacing w:before="0" w:after="40" w:line="247" w:lineRule="auto"/>
       </w:pPr>
       <w:r>
         <w:rPr>
-          <w:b/>
-          <w:color w:val="141E32"/>
+          <w:rFonts w:ascii="Calibri" w:hAnsi="Calibri"/>
           <w:sz w:val="17"/>
         </w:rPr>
-        <w:t xml:space="preserve">GHCI 25 Hackathon — Round 2 Qualifier: </w:t>
-      </w:r>
-      <w:r>
-        <w:rPr>
-          <w:color w:val="334155"/>
-          <w:sz w:val="17"/>
-        </w:rPr>
-        <w:t>AnitaB.org India &amp; Backbase | National GenAI Hackathon: ‘Unbound with GenAI: Breaking Barriers, Creating Impact’</w:t>
+        <w:t>• GHCI 25 Hackathon — Round 2 Qualifier: AnitaB.org India &amp; Backbase | National GenAI Hackathon: 'Unbound with GenAI: Breaking Barriers, Creating Impact'</w:t>
       </w:r>
     </w:p>
     <w:p>
       <w:pPr>
-        <w:pStyle w:val="ListBullet"/>
-        <w:spacing w:before="0" w:after="20"/>
-        <w:ind w:left="259"/>
-      </w:pPr>
-      <w:r>
-        <w:rPr>
-          <w:b/>
-          <w:color w:val="141E32"/>
-          <w:sz w:val="17"/>
-        </w:rPr>
-        <w:t xml:space="preserve">Patent Filed (South Africa): </w:t>
-      </w:r>
-      <w:r>
-        <w:rPr>
-          <w:color w:val="334155"/>
-          <w:sz w:val="17"/>
-        </w:rPr>
-        <w:t>AI lost-and-found matching system using multimodal scoring (image, text, location, timestamp) | 2025</w:t>
-      </w:r>
-    </w:p>
-    <w:p>
-      <w:pPr>
-        <w:keepNext/>
-        <w:spacing w:before="100" w:after="30"/>
+        <w:spacing w:before="100" w:after="30" w:line="247" w:lineRule="auto"/>
         <w:pBdr>
-          <w:bottom w:val="single" w:sz="4" w:space="1" w:color="1E293B"/>
+          <w:bottom w:val="single" w:sz="6" w:space="1" w:color="D5D5CE"/>
         </w:pBdr>
       </w:pPr>
       <w:r>
         <w:rPr>
+          <w:rFonts w:ascii="Calibri" w:hAnsi="Calibri"/>
           <w:b/>
-          <w:color w:val="141E32"/>
-          <w:sz w:val="19"/>
+          <w:color w:val="121214"/>
+          <w:sz w:val="20"/>
         </w:rPr>
         <w:t>PRODUCT &amp; TECHNICAL SKILLS</w:t>
       </w:r>
     </w:p>
     <w:p>
       <w:pPr>
-        <w:pStyle w:val="ListBullet"/>
-        <w:spacing w:before="0" w:after="20"/>
-        <w:ind w:left="259"/>
+        <w:spacing w:before="20" w:after="10" w:line="247" w:lineRule="auto"/>
       </w:pPr>
       <w:r>
         <w:rPr>
-          <w:b/>
-          <w:color w:val="141E32"/>
+          <w:rFonts w:ascii="Calibri" w:hAnsi="Calibri"/>
           <w:sz w:val="17"/>
         </w:rPr>
-        <w:t xml:space="preserve">Product Management: </w:t>
-      </w:r>
-      <w:r>
-        <w:rPr>
-          <w:color w:val="334155"/>
-          <w:sz w:val="17"/>
-        </w:rPr>
-        <w:t>Product Discovery, PRD Writing, Jobs-to-be-Done (JTBD), User Research, Personas &amp; ICP, Prioritization, Product Metrics, Experimentation, GTM Strategy, Trade-off Analysis</w:t>
+        <w:t>• Product Management: Product Discovery, PRD Writing, Jobs-to-be-Done (JTBD), User Journey Mapping, Prioritization, North Star &amp; Counter-Metrics, Experimentation Design, GTM Strategy, Trade-off Analysis</w:t>
       </w:r>
     </w:p>
     <w:p>
       <w:pPr>
-        <w:pStyle w:val="ListBullet"/>
-        <w:spacing w:before="0" w:after="20"/>
-        <w:ind w:left="259"/>
+        <w:spacing w:before="0" w:after="10" w:line="247" w:lineRule="auto"/>
       </w:pPr>
       <w:r>
         <w:rPr>
-          <w:b/>
-          <w:color w:val="141E32"/>
+          <w:rFonts w:ascii="Calibri" w:hAnsi="Calibri"/>
           <w:sz w:val="17"/>
         </w:rPr>
-        <w:t xml:space="preserve">AI &amp; Prototyping: </w:t>
-      </w:r>
-      <w:r>
-        <w:rPr>
-          <w:color w:val="334155"/>
-          <w:sz w:val="17"/>
-        </w:rPr>
-        <w:t>Prompt Engineering, Advanced RAG, Vector Search, AI Agents, n8n Workflows, Lovable.dev (Rapid MVPs), Supabase, PostgreSQL (RPCs, Row-Level Security)</w:t>
+        <w:t>• AI &amp; Systems: LLM Prompt Engineering, RAG Architectures, Multimodal Extraction, Computer Vision (MediaPipe), AI Governance, Lovable.dev (Rapid MVPs), Supabase, PostgreSQL (RPCs, Row-Level Security)</w:t>
       </w:r>
     </w:p>
     <w:p>
       <w:pPr>
-        <w:pStyle w:val="ListBullet"/>
-        <w:spacing w:before="0" w:after="20"/>
-        <w:ind w:left="259"/>
+        <w:spacing w:before="0" w:after="40" w:line="247" w:lineRule="auto"/>
       </w:pPr>
       <w:r>
         <w:rPr>
-          <w:b/>
-          <w:color w:val="141E32"/>
+          <w:rFonts w:ascii="Calibri" w:hAnsi="Calibri"/>
           <w:sz w:val="17"/>
         </w:rPr>
-        <w:t xml:space="preserve">Technical: </w:t>
-      </w:r>
-      <w:r>
-        <w:rPr>
-          <w:color w:val="334155"/>
-          <w:sz w:val="17"/>
-        </w:rPr>
-        <w:t>Java, Spring Framework, Python, Go, REST APIs, Docker, Git, Data Structures &amp; Algorithms (400+ LeetCode, 210+ GFG)</w:t>
+        <w:t>• Engineering &amp; Problem Solving: Java, Spring Framework, Python, Go, REST APIs, Docker, Git  •  Competitive Programming: 400+ LeetCode, 210+ GeeksforGeeks</w:t>
       </w:r>
     </w:p>
     <w:p>
       <w:pPr>
-        <w:keepNext/>
-        <w:spacing w:before="100" w:after="30"/>
+        <w:spacing w:before="100" w:after="30" w:line="247" w:lineRule="auto"/>
         <w:pBdr>
-          <w:bottom w:val="single" w:sz="4" w:space="1" w:color="1E293B"/>
+          <w:bottom w:val="single" w:sz="6" w:space="1" w:color="D5D5CE"/>
         </w:pBdr>
       </w:pPr>
       <w:r>
         <w:rPr>
+          <w:rFonts w:ascii="Calibri" w:hAnsi="Calibri"/>
           <w:b/>
-          <w:color w:val="141E32"/>
-          <w:sz w:val="19"/>
+          <w:color w:val="121214"/>
+          <w:sz w:val="20"/>
         </w:rPr>
         <w:t>CERTIFICATIONS</w:t>
       </w:r>
     </w:p>
     <w:p>
       <w:pPr>
-        <w:spacing w:before="10" w:after="0"/>
+        <w:spacing w:before="20" w:after="0" w:line="247" w:lineRule="auto"/>
       </w:pPr>
       <w:r>
         <w:rPr>
-          <w:color w:val="334155"/>
-          <w:sz w:val="16"/>
+          <w:rFonts w:ascii="Calibri" w:hAnsi="Calibri"/>
+          <w:sz w:val="17"/>
         </w:rPr>
-        <w:t>Product Management Masterclass (GeeksforGeeks)   •   AI Agents &amp; Automation (CampusX)   •   Advanced RAG Architecture (CampusX)   •   Prompt Engineering &amp; Docker for ML (CampusX)   •   Postman API Fundamentals Student Expert</w:t>
+        <w:t>Product Management Masterclass (GeeksforGeeks)  •  AI Agents &amp; Automation (CampusX)  •  Advanced RAG Architecture (CampusX)  •  Prompt Engineering &amp; Docker for ML (CampusX)  •  Postman API Student Expert</w:t>
       </w:r>
     </w:p>
     <w:sectPr>
       <w:pgSz w:w="12240" w:h="15840"/>
-      <w:pgMar w:top="518" w:right="720" w:bottom="518" w:left="720" w:header="720" w:footer="720" w:gutter="0"/>
+      <w:pgMar w:top="461" w:right="605" w:bottom="461" w:left="605" w:header="720" w:footer="720" w:gutter="0"/>
       <w:cols w:space="720"/>
       <w:docGrid w:linePitch="360"/>
     </w:sectPr>
@@ -982,11 +793,6 @@
     <w:name w:val="Normal"/>
     <w:qFormat/>
     <w:rsid w:val="00FC693F"/>
-    <w:rPr>
-      <w:rFonts w:ascii="Calibri" w:hAnsi="Calibri"/>
-      <w:color w:val="334155"/>
-      <w:sz w:val="17"/>
-    </w:rPr>
   </w:style>
   <w:style w:type="paragraph" w:styleId="Header">
     <w:name w:val="header"/>

</xml_diff>

<commit_message>
feat: calibrate resume to top-tier APM standard with live portfolio projects, 1-page PDF export, and verified Word metrics
</commit_message>
<xml_diff>
--- a/Sohan_Gadewar_Google_APM_Resume.docx
+++ b/Sohan_Gadewar_Google_APM_Resume.docx
@@ -4,7 +4,7 @@
   <w:body>
     <w:p>
       <w:pPr>
-        <w:spacing w:before="0" w:after="10" w:line="247" w:lineRule="auto"/>
+        <w:spacing w:before="0" w:after="10" w:line="245" w:lineRule="auto"/>
         <w:jc w:val="center"/>
       </w:pPr>
       <w:r>
@@ -12,14 +12,14 @@
           <w:rFonts w:ascii="Calibri" w:hAnsi="Calibri"/>
           <w:b/>
           <w:color w:val="121214"/>
-          <w:sz w:val="31"/>
+          <w:sz w:val="30"/>
         </w:rPr>
         <w:t>SOHAN GADEWAR</w:t>
       </w:r>
     </w:p>
     <w:p>
       <w:pPr>
-        <w:spacing w:before="0" w:after="20" w:line="247" w:lineRule="auto"/>
+        <w:spacing w:before="0" w:after="20" w:line="245" w:lineRule="auto"/>
         <w:jc w:val="center"/>
       </w:pPr>
       <w:r>
@@ -29,18 +29,18 @@
           <w:color w:val="28282D"/>
           <w:sz w:val="18"/>
         </w:rPr>
-        <w:t>Associate Product Manager Intern Candidate  |  B.Tech IT, VIIT Pune (CGPA: 8.97 / 10.0)</w:t>
+        <w:t>Associate Product Manager Candidate  |  B.Tech IT, VIIT Pune (CGPA: 8.97 / 10.0)</w:t>
       </w:r>
     </w:p>
     <w:p>
       <w:pPr>
-        <w:spacing w:before="0" w:after="40" w:line="247" w:lineRule="auto"/>
+        <w:spacing w:before="0" w:after="40" w:line="245" w:lineRule="auto"/>
         <w:jc w:val="center"/>
       </w:pPr>
       <w:r>
         <w:rPr>
           <w:rFonts w:ascii="Calibri" w:hAnsi="Calibri"/>
-          <w:color w:val="5A5A5F"/>
+          <w:color w:val="505055"/>
           <w:sz w:val="17"/>
         </w:rPr>
         <w:t>+91 9022778561  •  sohangadewar9022@gmail.com  •  Portfolio: portfolio-sohan9022.vercel.app  •  LinkedIn  •  GitHub  •  Pune, India</w:t>
@@ -48,7 +48,7 @@
     </w:p>
     <w:p>
       <w:pPr>
-        <w:spacing w:before="100" w:after="30" w:line="247" w:lineRule="auto"/>
+        <w:spacing w:before="80" w:after="30" w:line="245" w:lineRule="auto"/>
         <w:pBdr>
           <w:bottom w:val="single" w:sz="6" w:space="1" w:color="D5D5CE"/>
         </w:pBdr>
@@ -58,14 +58,14 @@
           <w:rFonts w:ascii="Calibri" w:hAnsi="Calibri"/>
           <w:b/>
           <w:color w:val="121214"/>
-          <w:sz w:val="20"/>
+          <w:sz w:val="19"/>
         </w:rPr>
         <w:t>EDUCATION</w:t>
       </w:r>
     </w:p>
     <w:p>
       <w:pPr>
-        <w:spacing w:before="20" w:after="10" w:line="247" w:lineRule="auto"/>
+        <w:spacing w:before="20" w:after="10" w:line="245" w:lineRule="auto"/>
       </w:pPr>
       <w:r>
         <w:rPr>
@@ -93,7 +93,7 @@
     </w:p>
     <w:p>
       <w:pPr>
-        <w:spacing w:before="0" w:after="40" w:line="247" w:lineRule="auto"/>
+        <w:spacing w:before="0" w:after="40" w:line="245" w:lineRule="auto"/>
       </w:pPr>
       <w:r>
         <w:rPr>
@@ -106,7 +106,7 @@
     </w:p>
     <w:p>
       <w:pPr>
-        <w:spacing w:before="100" w:after="30" w:line="247" w:lineRule="auto"/>
+        <w:spacing w:before="80" w:after="30" w:line="245" w:lineRule="auto"/>
         <w:pBdr>
           <w:bottom w:val="single" w:sz="6" w:space="1" w:color="D5D5CE"/>
         </w:pBdr>
@@ -116,14 +116,14 @@
           <w:rFonts w:ascii="Calibri" w:hAnsi="Calibri"/>
           <w:b/>
           <w:color w:val="121214"/>
-          <w:sz w:val="20"/>
+          <w:sz w:val="19"/>
         </w:rPr>
-        <w:t>PRODUCT PROJECTS &amp; PRD SPECIFICATIONS</w:t>
+        <w:t>SELECTED PRODUCT SYSTEMS &amp; VALIDATED PROTOTYPES</w:t>
       </w:r>
     </w:p>
     <w:p>
       <w:pPr>
-        <w:spacing w:before="40" w:after="10" w:line="247" w:lineRule="auto"/>
+        <w:spacing w:before="30" w:after="10" w:line="245" w:lineRule="auto"/>
       </w:pPr>
       <w:r>
         <w:rPr>
@@ -131,48 +131,48 @@
           <w:b/>
           <w:sz w:val="18"/>
         </w:rPr>
-        <w:t>SHRH — Semantic Human-Readable Hashing  |  AI Governance &amp; DevTools  |  Google APM PRD Specification</w:t>
+        <w:t>Project Sentinel — AI Decision Memory &amp; State-Drift Agent  |  Enterprise AI  |  Live MVP: echo-sentinel-08.lovable.app  |  Notion PRD</w:t>
       </w:r>
     </w:p>
     <w:p>
       <w:pPr>
-        <w:spacing w:before="0" w:after="10" w:line="247" w:lineRule="auto"/>
+        <w:spacing w:before="0" w:after="10" w:line="245" w:lineRule="auto"/>
       </w:pPr>
       <w:r>
         <w:rPr>
           <w:rFonts w:ascii="Calibri" w:hAnsi="Calibri"/>
           <w:sz w:val="17"/>
         </w:rPr>
-        <w:t>• Problem: Enterprise AI teams managing 50–500 production prompts in git suffer alert fatigue: SHA-256 hashes treat harmless typos and critical security regressions ('MUST enforce MFA' → 'MAY enforce MFA') as identical alarms.</w:t>
+        <w:t>• Problem &amp; Customer Discovery: Spoken engineering agreements in daily standups frequently diverge from verified code state. Existing Slack summary bots aggravated notification fatigue by posting unsolicited paragraph summaries that interrupted deep work and eroded developer trust.</w:t>
       </w:r>
     </w:p>
     <w:p>
       <w:pPr>
-        <w:spacing w:before="0" w:after="10" w:line="247" w:lineRule="auto"/>
+        <w:spacing w:before="0" w:after="10" w:line="245" w:lineRule="auto"/>
       </w:pPr>
       <w:r>
         <w:rPr>
           <w:rFonts w:ascii="Calibri" w:hAnsi="Calibri"/>
           <w:sz w:val="17"/>
         </w:rPr>
-        <w:t>• Product Decision: Identified that topical drift and deontic constraint shifts are orthogonal risk signals. Architected a local Dual-Channel Gate over cloud LLMs, eliminating $15k/mo cost, latency, and data egress while triaging PRs into Auto-Approve, Review, or Quarantine.</w:t>
+        <w:t>• Product Strategy &amp; Scoping: Instituted a strict "Silent-by-Default" thesis—passively inaudits spoken commitments and Git commit streams without ever messaging channels unprompted; defined explicit non-goals in V1 (no automated ticket spam, no velocity surveillance).</w:t>
       </w:r>
     </w:p>
     <w:p>
       <w:pPr>
-        <w:spacing w:before="0" w:after="40" w:line="247" w:lineRule="auto"/>
+        <w:spacing w:before="0" w:after="30" w:line="245" w:lineRule="auto"/>
       </w:pPr>
       <w:r>
         <w:rPr>
           <w:rFonts w:ascii="Calibri" w:hAnsi="Calibri"/>
           <w:sz w:val="17"/>
         </w:rPr>
-        <w:t>• Validation &amp; PRD: Benchmarked on 2,744 revision pairs: slashed defect escapes by 92.6% with 0.0% false alarms; 70.0% routine PRs auto-merge. Authored comprehensive Google APM PRD defining JTBD, Maya Lin ICP, and Autonomous Safe Triage Rate (ASTR).</w:t>
+        <w:t>• Execution &amp; Outcome: Shipped interactive 8-step clickable MVP on Lovable with append-only PostgreSQL event schema comparing spoken intent vs. verified commit SHAs; authored complete Notion PRD with state-drift detection machines and audit queries.</w:t>
       </w:r>
     </w:p>
     <w:p>
       <w:pPr>
-        <w:spacing w:before="40" w:after="10" w:line="247" w:lineRule="auto"/>
+        <w:spacing w:before="30" w:after="10" w:line="245" w:lineRule="auto"/>
       </w:pPr>
       <w:r>
         <w:rPr>
@@ -180,48 +180,48 @@
           <w:b/>
           <w:sz w:val="18"/>
         </w:rPr>
-        <w:t>Project Sentinel — AI Project Memory &amp; Decision Agent  |  Enterprise AI  |  Live MVP: echo-sentinel-08.lovable.app</w:t>
+        <w:t>FinMate AI — Conversational Expense Memory &amp; Deterministic Accounting  |  FinTech Systems  |  Live MVP: tell-finmate-ai.lovable.app  |  Notion PRD</w:t>
       </w:r>
     </w:p>
     <w:p>
       <w:pPr>
-        <w:spacing w:before="0" w:after="10" w:line="247" w:lineRule="auto"/>
+        <w:spacing w:before="0" w:after="10" w:line="245" w:lineRule="auto"/>
       </w:pPr>
       <w:r>
         <w:rPr>
           <w:rFonts w:ascii="Calibri" w:hAnsi="Calibri"/>
           <w:sz w:val="17"/>
         </w:rPr>
-        <w:t>• Problem: Engineering decisions made across standups, Slack, and Jira are quickly lost. Chatty AI bots aggravate notification fatigue by posting unprompted summaries that interrupt deep work and erode developer trust.</w:t>
+        <w:t>• Problem &amp; Behavioral Insight: 6-field manual form logging causes steep drop-off in personal finance, but pure conversational LLMs hallucinate calculations, making them untrustworthy for real financial records.</w:t>
       </w:r>
     </w:p>
     <w:p>
       <w:pPr>
-        <w:spacing w:before="0" w:after="10" w:line="247" w:lineRule="auto"/>
+        <w:spacing w:before="0" w:after="10" w:line="245" w:lineRule="auto"/>
       </w:pPr>
       <w:r>
         <w:rPr>
           <w:rFonts w:ascii="Calibri" w:hAnsi="Calibri"/>
           <w:sz w:val="17"/>
         </w:rPr>
-        <w:t>• Product Decision: Prioritized user attention over bot visibility. Enforced a 'Silent by Default' model that ingests transcripts and commit streams passively, surfacing drift between spoken intent and database logs only when explicitly queried.</w:t>
+        <w:t>• Product Architecture: Decoupled unstructured ingestion from arithmetic—restricted multimodal LLMs (voice notes, receipt OCR, natural chat) strictly to entity extraction, while delegating 100% of calculations to concurrency-safe PostgreSQL stored procedures.</w:t>
       </w:r>
     </w:p>
     <w:p>
       <w:pPr>
-        <w:spacing w:before="0" w:after="40" w:line="247" w:lineRule="auto"/>
+        <w:spacing w:before="0" w:after="30" w:line="245" w:lineRule="auto"/>
       </w:pPr>
       <w:r>
         <w:rPr>
           <w:rFonts w:ascii="Calibri" w:hAnsi="Calibri"/>
           <w:sz w:val="17"/>
         </w:rPr>
-        <w:t>• Outcome: Shipped interactive 8-step live Lovable MVP featuring immutable decision stores, state-drift detection, and audit queries. Authored complete Notion PRD with PostgreSQL event schemas, state machines, and user stories.</w:t>
+        <w:t>• Execution &amp; Outcome: Shipped live Lovable prototype with voice capture, informal debt reconciliation, and evidence-backed totals citing underlying transaction rows with zero math hallucinations; authored complete Notion PRD.</w:t>
       </w:r>
     </w:p>
     <w:p>
       <w:pPr>
-        <w:spacing w:before="40" w:after="10" w:line="247" w:lineRule="auto"/>
+        <w:spacing w:before="30" w:after="10" w:line="245" w:lineRule="auto"/>
       </w:pPr>
       <w:r>
         <w:rPr>
@@ -229,36 +229,98 @@
           <w:b/>
           <w:sz w:val="18"/>
         </w:rPr>
-        <w:t>AI Asana Analyst — Edge Computer Vision vs. Asynchronous GenAI  |  AI Systems &amp; HCI  |  Full PRD v2.0</w:t>
+        <w:t>Spaces — Contextual Personalization Framework &amp; Telemetry Firewall  |  AI Personalization  |  Live MVP: space-context-switch.lovable.app  |  Notion PRD</w:t>
       </w:r>
     </w:p>
     <w:p>
       <w:pPr>
-        <w:spacing w:before="0" w:after="10" w:line="247" w:lineRule="auto"/>
+        <w:spacing w:before="0" w:after="10" w:line="245" w:lineRule="auto"/>
       </w:pPr>
       <w:r>
         <w:rPr>
           <w:rFonts w:ascii="Calibri" w:hAnsi="Calibri"/>
           <w:sz w:val="17"/>
         </w:rPr>
-        <w:t>• Problem &amp; Latency Budget: Real-time yoga posture evaluation requires 25 FPS (40ms budget). Cloud multimodal vision LLMs introduce 800ms–2s latency and high API costs, while visual-only feedback overwhelms practitioners holding balance poses.</w:t>
+        <w:t>• Problem &amp; Insight: Single-persona recommendation feeds suffer from "context collapse"—casual weekend browsing pollutes weekday professional feeds, forcing users to juggle friction-heavy burner accounts.</w:t>
       </w:r>
     </w:p>
     <w:p>
       <w:pPr>
-        <w:spacing w:before="0" w:after="40" w:line="247" w:lineRule="auto"/>
+        <w:spacing w:before="0" w:after="30" w:line="245" w:lineRule="auto"/>
       </w:pPr>
       <w:r>
         <w:rPr>
           <w:rFonts w:ascii="Calibri" w:hAnsi="Calibri"/>
           <w:sz w:val="17"/>
         </w:rPr>
-        <w:t>• PRD &amp; Architecture: Architected a decoupled pipeline: MediaPipe BlazePose (33 landmarks) + NumPy geometric engine evaluate angles on edge CPU (&lt;40ms) with offline audio alerts (pyttsx3, 3s cooldown). Delegated conversational coaching paragraphs to non-blocking asynchronous GenAI in post-session PDF reports with silent fallback to rule-based strings.</w:t>
+        <w:t>• Architecture &amp; Outcome: Architected a "Context Firewall" middleware isolating behavioral telemetry and vector embedding stores per active space while keeping authentication, identity, and billing consolidated under 1 account; shipped live Lovable MVP with 4 isolated spaces; authored Notion PRD.</w:t>
       </w:r>
     </w:p>
     <w:p>
       <w:pPr>
-        <w:spacing w:before="100" w:after="30" w:line="247" w:lineRule="auto"/>
+        <w:spacing w:before="30" w:after="10" w:line="245" w:lineRule="auto"/>
+      </w:pPr>
+      <w:r>
+        <w:rPr>
+          <w:rFonts w:ascii="Calibri" w:hAnsi="Calibri"/>
+          <w:b/>
+          <w:sz w:val="18"/>
+        </w:rPr>
+        <w:t>SHRH — Semantic Human-Readable Hashing  |  AI Governance &amp; Developer Tools  |  Google APM PRD Specification</w:t>
+      </w:r>
+    </w:p>
+    <w:p>
+      <w:pPr>
+        <w:spacing w:before="0" w:after="10" w:line="245" w:lineRule="auto"/>
+      </w:pPr>
+      <w:r>
+        <w:rPr>
+          <w:rFonts w:ascii="Calibri" w:hAnsi="Calibri"/>
+          <w:sz w:val="17"/>
+        </w:rPr>
+        <w:t>• Problem &amp; Metric Design: Standard SHA-256 hashes treat harmless formatting typo edits identically to critical security regressions ('MUST enforce MFA' → 'MAY enforce MFA'), causing alert fatigue for enterprise prompt engineering teams.</w:t>
+      </w:r>
+    </w:p>
+    <w:p>
+      <w:pPr>
+        <w:spacing w:before="0" w:after="30" w:line="245" w:lineRule="auto"/>
+      </w:pPr>
+      <w:r>
+        <w:rPr>
+          <w:rFonts w:ascii="Calibri" w:hAnsi="Calibri"/>
+          <w:sz w:val="17"/>
+        </w:rPr>
+        <w:t>• Trade-off &amp; PRD Spec: Decoupled topical semantic drift from deontic constraint shifts via local dual-channel triage, saving $15k/mo in cloud LLM costs and data egress. Benchmarked on 2,744 revisions (slashed defect escapes by 92.6% with 0.0% false alarms on benign edits); authored full Google APM PRD spec (Maya Lin ICP, risk matrix, GTM).</w:t>
+      </w:r>
+    </w:p>
+    <w:p>
+      <w:pPr>
+        <w:spacing w:before="30" w:after="10" w:line="245" w:lineRule="auto"/>
+      </w:pPr>
+      <w:r>
+        <w:rPr>
+          <w:rFonts w:ascii="Calibri" w:hAnsi="Calibri"/>
+          <w:b/>
+          <w:sz w:val="18"/>
+        </w:rPr>
+        <w:t>GiftVerse Moments — Digital Gifting Reveal Experiences  |  Consumer AI  |  Live MVP: gift-verse-moments.lovable.app  |  Notion PRD</w:t>
+      </w:r>
+    </w:p>
+    <w:p>
+      <w:pPr>
+        <w:spacing w:before="0" w:after="30" w:line="245" w:lineRule="auto"/>
+      </w:pPr>
+      <w:r>
+        <w:rPr>
+          <w:rFonts w:ascii="Calibri" w:hAnsi="Calibri"/>
+          <w:sz w:val="17"/>
+        </w:rPr>
+        <w:t>• Product Discovery &amp; MVP: Identified that digital gift cards are sterile to receive. Built an AI Experience Director choreographing 30–60s micro-suspense reveal journeys with encrypted payload isolation; shipped live Lovable MVP; authored Notion PRD.</w:t>
+      </w:r>
+    </w:p>
+    <w:p>
+      <w:pPr>
+        <w:spacing w:before="80" w:after="30" w:line="245" w:lineRule="auto"/>
         <w:pBdr>
           <w:bottom w:val="single" w:sz="6" w:space="1" w:color="D5D5CE"/>
         </w:pBdr>
@@ -268,38 +330,38 @@
           <w:rFonts w:ascii="Calibri" w:hAnsi="Calibri"/>
           <w:b/>
           <w:color w:val="121214"/>
-          <w:sz w:val="20"/>
+          <w:sz w:val="19"/>
         </w:rPr>
         <w:t>PATENTS &amp; USER RESEARCH</w:t>
       </w:r>
     </w:p>
     <w:p>
       <w:pPr>
-        <w:spacing w:before="20" w:after="10" w:line="247" w:lineRule="auto"/>
+        <w:spacing w:before="20" w:after="10" w:line="245" w:lineRule="auto"/>
       </w:pPr>
       <w:r>
         <w:rPr>
           <w:rFonts w:ascii="Calibri" w:hAnsi="Calibri"/>
           <w:sz w:val="17"/>
         </w:rPr>
-        <w:t>• Patent Application Draft (VIT Pune UX Lab): AI-Driven Multilingual Adaptive UI Framework &amp; Zero-Risk Financial Sandbox — Designed a dual-mode environment controller pairing live transactions with a simulated practice sandbox (dummy balances), in-situ Hold-to-Translate, and Circle-to-Understand gesture inspection to eliminate operational anxiety in emerging markets | 2026</w:t>
+        <w:t>• Patent Application Draft (VIT Pune UX Lab): AI-Driven Multilingual Adaptive UI Framework &amp; Zero-Risk Financial Sandbox — Designed dual-mode environment pairing live transactions with a simulated practice sandbox (dummy balances), in-situ Hold-to-Translate, and Circle-to-Understand gesture affordances to eliminate digital financial hesitation in emerging vernacular markets | 2026</w:t>
       </w:r>
     </w:p>
     <w:p>
       <w:pPr>
-        <w:spacing w:before="0" w:after="40" w:line="247" w:lineRule="auto"/>
+        <w:spacing w:before="0" w:after="40" w:line="245" w:lineRule="auto"/>
       </w:pPr>
       <w:r>
         <w:rPr>
           <w:rFonts w:ascii="Calibri" w:hAnsi="Calibri"/>
           <w:sz w:val="17"/>
         </w:rPr>
-        <w:t>• Patent Filed (South African Patent Office): AI-Powered Lost &amp; Found Matching System — Conceptualized a privacy-first blind matching architecture using a 5-factor multimodal scoring model (image, text, geo, timestamp) with automated urgency detection | 2025</w:t>
+        <w:t>• Patent Filed (South African Patent Office): AI-Powered Lost &amp; Found Matching System — Conceptualized a 5-factor blind multimodal scoring architecture (image embeddings, NLP text, geolocation, timestamp) with automated urgency detection | 2025</w:t>
       </w:r>
     </w:p>
     <w:p>
       <w:pPr>
-        <w:spacing w:before="100" w:after="30" w:line="247" w:lineRule="auto"/>
+        <w:spacing w:before="80" w:after="30" w:line="245" w:lineRule="auto"/>
         <w:pBdr>
           <w:bottom w:val="single" w:sz="6" w:space="1" w:color="D5D5CE"/>
         </w:pBdr>
@@ -309,26 +371,26 @@
           <w:rFonts w:ascii="Calibri" w:hAnsi="Calibri"/>
           <w:b/>
           <w:color w:val="121214"/>
-          <w:sz w:val="20"/>
+          <w:sz w:val="19"/>
         </w:rPr>
-        <w:t>AWARDS &amp; COMPETITIVE ACHIEVEMENTS</w:t>
+        <w:t>HONORS &amp; COMPETITIONS</w:t>
       </w:r>
     </w:p>
     <w:p>
       <w:pPr>
-        <w:spacing w:before="20" w:after="10" w:line="247" w:lineRule="auto"/>
+        <w:spacing w:before="20" w:after="10" w:line="245" w:lineRule="auto"/>
       </w:pPr>
       <w:r>
         <w:rPr>
           <w:rFonts w:ascii="Calibri" w:hAnsi="Calibri"/>
           <w:sz w:val="17"/>
         </w:rPr>
-        <w:t>• India Innovates Hackathon — Finalist: Selected among top ~1,000 finalist teams nationwide out of ~6,000+ participating teams (Top ~16%)</w:t>
+        <w:t>• India Innovates Hackathon — National Finalist: Selected in top ~1,000 teams nationwide out of 6,000+ participating teams (Top ~16%)</w:t>
       </w:r>
     </w:p>
     <w:p>
       <w:pPr>
-        <w:spacing w:before="0" w:after="40" w:line="247" w:lineRule="auto"/>
+        <w:spacing w:before="0" w:after="40" w:line="245" w:lineRule="auto"/>
       </w:pPr>
       <w:r>
         <w:rPr>
@@ -340,7 +402,7 @@
     </w:p>
     <w:p>
       <w:pPr>
-        <w:spacing w:before="100" w:after="30" w:line="247" w:lineRule="auto"/>
+        <w:spacing w:before="80" w:after="30" w:line="245" w:lineRule="auto"/>
         <w:pBdr>
           <w:bottom w:val="single" w:sz="6" w:space="1" w:color="D5D5CE"/>
         </w:pBdr>
@@ -350,50 +412,50 @@
           <w:rFonts w:ascii="Calibri" w:hAnsi="Calibri"/>
           <w:b/>
           <w:color w:val="121214"/>
-          <w:sz w:val="20"/>
+          <w:sz w:val="19"/>
         </w:rPr>
-        <w:t>PRODUCT &amp; TECHNICAL SKILLS</w:t>
+        <w:t>PRODUCT MANAGEMENT &amp; TECHNICAL SKILLS</w:t>
       </w:r>
     </w:p>
     <w:p>
       <w:pPr>
-        <w:spacing w:before="20" w:after="10" w:line="247" w:lineRule="auto"/>
+        <w:spacing w:before="20" w:after="10" w:line="245" w:lineRule="auto"/>
       </w:pPr>
       <w:r>
         <w:rPr>
           <w:rFonts w:ascii="Calibri" w:hAnsi="Calibri"/>
           <w:sz w:val="17"/>
         </w:rPr>
-        <w:t>• Product Management: Product Discovery, PRD Writing, Jobs-to-be-Done (JTBD), User Journey Mapping, Prioritization, North Star &amp; Counter-Metrics, Experimentation Design, GTM Strategy, Trade-off Analysis</w:t>
+        <w:t>• Product Management: Product Discovery, PRD Writing, Jobs-to-be-Done (JTBD), User Journey Mapping, RICE Prioritization, North Star &amp; Counter-Metrics, Customer Interviews, Experimentation, GTM Strategy, Trade-off Analysis</w:t>
       </w:r>
     </w:p>
     <w:p>
       <w:pPr>
-        <w:spacing w:before="0" w:after="10" w:line="247" w:lineRule="auto"/>
+        <w:spacing w:before="0" w:after="10" w:line="245" w:lineRule="auto"/>
       </w:pPr>
       <w:r>
         <w:rPr>
           <w:rFonts w:ascii="Calibri" w:hAnsi="Calibri"/>
           <w:sz w:val="17"/>
         </w:rPr>
-        <w:t>• AI &amp; Systems: LLM Prompt Engineering, RAG Architectures, Multimodal Extraction, Computer Vision (MediaPipe), AI Governance, Lovable.dev (Rapid MVPs), Supabase, PostgreSQL (RPCs, Row-Level Security)</w:t>
+        <w:t>• AI &amp; Systems: LLM Prompt Engineering, RAG Architectures, Multimodal Ingestion, Deterministic SQL, AI Governance, Lovable.dev (Rapid MVPs), Supabase (RLS), Vector Embeddings</w:t>
       </w:r>
     </w:p>
     <w:p>
       <w:pPr>
-        <w:spacing w:before="0" w:after="40" w:line="247" w:lineRule="auto"/>
+        <w:spacing w:before="0" w:after="40" w:line="245" w:lineRule="auto"/>
       </w:pPr>
       <w:r>
         <w:rPr>
           <w:rFonts w:ascii="Calibri" w:hAnsi="Calibri"/>
           <w:sz w:val="17"/>
         </w:rPr>
-        <w:t>• Engineering &amp; Problem Solving: Java, Spring Framework, Python, Go, REST APIs, Docker, Git  •  Competitive Programming: 400+ LeetCode, 210+ GeeksforGeeks</w:t>
+        <w:t>• Engineering &amp; Problem Solving: Java, Spring Framework, Python, SQL/PostgreSQL, REST APIs, Git, System Architecture  •  Competitive Programming: 400+ LeetCode, 210+ GeeksforGeeks</w:t>
       </w:r>
     </w:p>
     <w:p>
       <w:pPr>
-        <w:spacing w:before="100" w:after="30" w:line="247" w:lineRule="auto"/>
+        <w:spacing w:before="80" w:after="30" w:line="245" w:lineRule="auto"/>
         <w:pBdr>
           <w:bottom w:val="single" w:sz="6" w:space="1" w:color="D5D5CE"/>
         </w:pBdr>
@@ -403,14 +465,14 @@
           <w:rFonts w:ascii="Calibri" w:hAnsi="Calibri"/>
           <w:b/>
           <w:color w:val="121214"/>
-          <w:sz w:val="20"/>
+          <w:sz w:val="19"/>
         </w:rPr>
         <w:t>CERTIFICATIONS</w:t>
       </w:r>
     </w:p>
     <w:p>
       <w:pPr>
-        <w:spacing w:before="20" w:after="0" w:line="247" w:lineRule="auto"/>
+        <w:spacing w:before="20" w:after="0" w:line="245" w:lineRule="auto"/>
       </w:pPr>
       <w:r>
         <w:rPr>
@@ -422,7 +484,7 @@
     </w:p>
     <w:sectPr>
       <w:pgSz w:w="12240" w:h="15840"/>
-      <w:pgMar w:top="461" w:right="605" w:bottom="461" w:left="605" w:header="720" w:footer="720" w:gutter="0"/>
+      <w:pgMar w:top="403" w:right="547" w:bottom="403" w:left="547" w:header="720" w:footer="720" w:gutter="0"/>
       <w:cols w:space="720"/>
       <w:docGrid w:linePitch="360"/>
     </w:sectPr>

</xml_diff>

<commit_message>
feat: calibrate resume and portfolio to top-tier APM benchmark with live proof-of-work, clickable links, and verified 1-page PDF/Word delivery
</commit_message>
<xml_diff>
--- a/Sohan_Gadewar_Google_APM_Resume.docx
+++ b/Sohan_Gadewar_Google_APM_Resume.docx
@@ -12,7 +12,7 @@
           <w:rFonts w:ascii="Calibri" w:hAnsi="Calibri"/>
           <w:b/>
           <w:color w:val="121214"/>
-          <w:sz w:val="30"/>
+          <w:sz w:val="31"/>
         </w:rPr>
         <w:t>SOHAN GADEWAR</w:t>
       </w:r>
@@ -26,7 +26,7 @@
         <w:rPr>
           <w:rFonts w:ascii="Calibri" w:hAnsi="Calibri"/>
           <w:b/>
-          <w:color w:val="28282D"/>
+          <w:color w:val="1E1E23"/>
           <w:sz w:val="18"/>
         </w:rPr>
         <w:t>Associate Product Manager Candidate  |  B.Tech IT, VIIT Pune (CGPA: 8.97 / 10.0)</w:t>
@@ -43,7 +43,82 @@
           <w:color w:val="505055"/>
           <w:sz w:val="17"/>
         </w:rPr>
-        <w:t>+91 9022778561  •  sohangadewar9022@gmail.com  •  Portfolio: portfolio-sohan9022.vercel.app  •  LinkedIn  •  GitHub  •  Pune, India</w:t>
+        <w:t xml:space="preserve">+91 9022778561  •  </w:t>
+      </w:r>
+      <w:hyperlink r:id="rId9">
+        <w:r>
+          <w:rPr>
+            <w:rFonts w:ascii="Calibri" w:hAnsi="Calibri"/>
+            <w:sz w:val="17"/>
+            <w:color w:val="1D4ED8"/>
+          </w:rPr>
+          <w:t xml:space="preserve">sohangadewar9022@gmail.com</w:t>
+        </w:r>
+      </w:hyperlink>
+      <w:r>
+        <w:rPr>
+          <w:rFonts w:ascii="Calibri" w:hAnsi="Calibri"/>
+          <w:color w:val="505055"/>
+          <w:sz w:val="17"/>
+        </w:rPr>
+        <w:t xml:space="preserve">  •  Portfolio: </w:t>
+      </w:r>
+      <w:hyperlink r:id="rId10">
+        <w:r>
+          <w:rPr>
+            <w:rFonts w:ascii="Calibri" w:hAnsi="Calibri"/>
+            <w:sz w:val="17"/>
+            <w:color w:val="1D4ED8"/>
+            <w:u w:val="single"/>
+          </w:rPr>
+          <w:t xml:space="preserve">portfolio-sohan9022.vercel.app</w:t>
+        </w:r>
+      </w:hyperlink>
+      <w:r>
+        <w:rPr>
+          <w:rFonts w:ascii="Calibri" w:hAnsi="Calibri"/>
+          <w:color w:val="505055"/>
+          <w:sz w:val="17"/>
+        </w:rPr>
+        <w:t xml:space="preserve">  •  </w:t>
+      </w:r>
+      <w:hyperlink r:id="rId11">
+        <w:r>
+          <w:rPr>
+            <w:rFonts w:ascii="Calibri" w:hAnsi="Calibri"/>
+            <w:sz w:val="17"/>
+            <w:color w:val="1D4ED8"/>
+            <w:u w:val="single"/>
+          </w:rPr>
+          <w:t xml:space="preserve">LinkedIn</w:t>
+        </w:r>
+      </w:hyperlink>
+      <w:r>
+        <w:rPr>
+          <w:rFonts w:ascii="Calibri" w:hAnsi="Calibri"/>
+          <w:color w:val="505055"/>
+          <w:sz w:val="17"/>
+        </w:rPr>
+        <w:t xml:space="preserve">  •  </w:t>
+      </w:r>
+      <w:hyperlink r:id="rId12">
+        <w:r>
+          <w:rPr>
+            <w:rFonts w:ascii="Calibri" w:hAnsi="Calibri"/>
+            <w:sz w:val="17"/>
+            <w:color w:val="1D4ED8"/>
+            <w:u w:val="single"/>
+          </w:rPr>
+          <w:t xml:space="preserve">GitHub</w:t>
+        </w:r>
+      </w:hyperlink>
+      <w:r>
+        <w:rPr>
+          <w:rFonts w:ascii="Calibri" w:hAnsi="Calibri"/>
+          <w:color w:val="505055"/>
+          <w:sz w:val="17"/>
+        </w:rPr>
+        <w:t xml:space="preserve">  •  Pune, India</w:t>
       </w:r>
     </w:p>
     <w:p>
@@ -131,7 +206,51 @@
           <w:b/>
           <w:sz w:val="18"/>
         </w:rPr>
-        <w:t>Project Sentinel — AI Decision Memory &amp; State-Drift Agent  |  Enterprise AI  |  Live MVP: echo-sentinel-08.lovable.app  |  Notion PRD</w:t>
+        <w:t xml:space="preserve">Project Sentinel — AI Decision Memory &amp; State-Drift Agent  |  Enterprise AI  |  Live MVP: </w:t>
+      </w:r>
+      <w:hyperlink r:id="rId13">
+        <w:r>
+          <w:rPr>
+            <w:rFonts w:ascii="Calibri" w:hAnsi="Calibri"/>
+            <w:sz w:val="18"/>
+            <w:color w:val="1D4ED8"/>
+            <w:u w:val="single"/>
+            <w:b/>
+          </w:rPr>
+          <w:t xml:space="preserve">echo-sentinel-08.lovable.app</w:t>
+        </w:r>
+      </w:hyperlink>
+      <w:r>
+        <w:rPr>
+          <w:rFonts w:ascii="Calibri" w:hAnsi="Calibri"/>
+          <w:b/>
+          <w:sz w:val="18"/>
+        </w:rPr>
+        <w:t xml:space="preserve">  |  </w:t>
+      </w:r>
+      <w:hyperlink r:id="rId14">
+        <w:r>
+          <w:rPr>
+            <w:rFonts w:ascii="Calibri" w:hAnsi="Calibri"/>
+            <w:sz w:val="18"/>
+            <w:color w:val="1D4ED8"/>
+            <w:u w:val="single"/>
+            <w:b/>
+          </w:rPr>
+          <w:t xml:space="preserve">Notion PRD</w:t>
+        </w:r>
+      </w:hyperlink>
+    </w:p>
+    <w:p>
+      <w:pPr>
+        <w:spacing w:before="0" w:after="10" w:line="245" w:lineRule="auto"/>
+      </w:pPr>
+      <w:r>
+        <w:rPr>
+          <w:rFonts w:ascii="Calibri" w:hAnsi="Calibri"/>
+          <w:sz w:val="17"/>
+        </w:rPr>
+        <w:t>• Discovery &amp; Problem Framing: Identified critical engineering context loss across daily standups and Slack threads; observed that existing summary bots suffer 80%+ uninstall rates due to unsolicited channel interruptions that break deep work.</w:t>
       </w:r>
     </w:p>
     <w:p>
@@ -143,19 +262,7 @@
           <w:rFonts w:ascii="Calibri" w:hAnsi="Calibri"/>
           <w:sz w:val="17"/>
         </w:rPr>
-        <w:t>• Problem &amp; Customer Discovery: Spoken engineering agreements in daily standups frequently diverge from verified code state. Existing Slack summary bots aggravated notification fatigue by posting unsolicited paragraph summaries that interrupted deep work and eroded developer trust.</w:t>
-      </w:r>
-    </w:p>
-    <w:p>
-      <w:pPr>
-        <w:spacing w:before="0" w:after="10" w:line="245" w:lineRule="auto"/>
-      </w:pPr>
-      <w:r>
-        <w:rPr>
-          <w:rFonts w:ascii="Calibri" w:hAnsi="Calibri"/>
-          <w:sz w:val="17"/>
-        </w:rPr>
-        <w:t>• Product Strategy &amp; Scoping: Instituted a strict "Silent-by-Default" thesis—passively inaudits spoken commitments and Git commit streams without ever messaging channels unprompted; defined explicit non-goals in V1 (no automated ticket spam, no velocity surveillance).</w:t>
+        <w:t>• Product Strategy &amp; Scoping: Established the "Silent-by-Default" thesis—ingests audio transcripts and Git/Jira streams passively, surfacing drift only when queried; defined explicit V1 non-goals (no automated ticket spam, zero velocity surveillance).</w:t>
       </w:r>
     </w:p>
     <w:p>
@@ -167,7 +274,7 @@
           <w:rFonts w:ascii="Calibri" w:hAnsi="Calibri"/>
           <w:sz w:val="17"/>
         </w:rPr>
-        <w:t>• Execution &amp; Outcome: Shipped interactive 8-step clickable MVP on Lovable with append-only PostgreSQL event schema comparing spoken intent vs. verified commit SHAs; authored complete Notion PRD with state-drift detection machines and audit queries.</w:t>
+        <w:t>• Execution &amp; Validation: Shipped interactive 8-step clickable MVP on Lovable with append-only PostgreSQL event schema mapping detected drift to immutable transcript IDs; authored 400-line Notion PRD with state machines and query syntax.</w:t>
       </w:r>
     </w:p>
     <w:p>
@@ -180,7 +287,51 @@
           <w:b/>
           <w:sz w:val="18"/>
         </w:rPr>
-        <w:t>FinMate AI — Conversational Expense Memory &amp; Deterministic Accounting  |  FinTech Systems  |  Live MVP: tell-finmate-ai.lovable.app  |  Notion PRD</w:t>
+        <w:t xml:space="preserve">FinMate AI — Conversational Expense Memory &amp; Deterministic Accounting  |  FinTech Systems  |  Live MVP: </w:t>
+      </w:r>
+      <w:hyperlink r:id="rId15">
+        <w:r>
+          <w:rPr>
+            <w:rFonts w:ascii="Calibri" w:hAnsi="Calibri"/>
+            <w:sz w:val="18"/>
+            <w:color w:val="1D4ED8"/>
+            <w:u w:val="single"/>
+            <w:b/>
+          </w:rPr>
+          <w:t xml:space="preserve">tell-finmate-ai.lovable.app</w:t>
+        </w:r>
+      </w:hyperlink>
+      <w:r>
+        <w:rPr>
+          <w:rFonts w:ascii="Calibri" w:hAnsi="Calibri"/>
+          <w:b/>
+          <w:sz w:val="18"/>
+        </w:rPr>
+        <w:t xml:space="preserve">  |  </w:t>
+      </w:r>
+      <w:hyperlink r:id="rId16">
+        <w:r>
+          <w:rPr>
+            <w:rFonts w:ascii="Calibri" w:hAnsi="Calibri"/>
+            <w:sz w:val="18"/>
+            <w:color w:val="1D4ED8"/>
+            <w:u w:val="single"/>
+            <w:b/>
+          </w:rPr>
+          <w:t xml:space="preserve">Notion PRD</w:t>
+        </w:r>
+      </w:hyperlink>
+    </w:p>
+    <w:p>
+      <w:pPr>
+        <w:spacing w:before="0" w:after="10" w:line="245" w:lineRule="auto"/>
+      </w:pPr>
+      <w:r>
+        <w:rPr>
+          <w:rFonts w:ascii="Calibri" w:hAnsi="Calibri"/>
+          <w:sz w:val="17"/>
+        </w:rPr>
+        <w:t>• User Friction &amp; Insight: Addressed high user abandonment in personal finance caused by 6-field manual logging forms, while identifying that pure conversational LLMs hallucinate calculations, making them untrustworthy for financial balances.</w:t>
       </w:r>
     </w:p>
     <w:p>
@@ -192,19 +343,7 @@
           <w:rFonts w:ascii="Calibri" w:hAnsi="Calibri"/>
           <w:sz w:val="17"/>
         </w:rPr>
-        <w:t>• Problem &amp; Behavioral Insight: 6-field manual form logging causes steep drop-off in personal finance, but pure conversational LLMs hallucinate calculations, making them untrustworthy for real financial records.</w:t>
-      </w:r>
-    </w:p>
-    <w:p>
-      <w:pPr>
-        <w:spacing w:before="0" w:after="10" w:line="245" w:lineRule="auto"/>
-      </w:pPr>
-      <w:r>
-        <w:rPr>
-          <w:rFonts w:ascii="Calibri" w:hAnsi="Calibri"/>
-          <w:sz w:val="17"/>
-        </w:rPr>
-        <w:t>• Product Architecture: Decoupled unstructured ingestion from arithmetic—restricted multimodal LLMs (voice notes, receipt OCR, natural chat) strictly to entity extraction, while delegating 100% of calculations to concurrency-safe PostgreSQL stored procedures.</w:t>
+        <w:t>• System Guardrails &amp; Architecture: Decoupled unstructured capture from arithmetic—restricted multimodal models (voice notes, receipt OCR, natural chat) strictly to intent parsing, delegating 100% of calculations to concurrency-safe PostgreSQL stored procedures.</w:t>
       </w:r>
     </w:p>
     <w:p>
@@ -216,7 +355,7 @@
           <w:rFonts w:ascii="Calibri" w:hAnsi="Calibri"/>
           <w:sz w:val="17"/>
         </w:rPr>
-        <w:t>• Execution &amp; Outcome: Shipped live Lovable prototype with voice capture, informal debt reconciliation, and evidence-backed totals citing underlying transaction rows with zero math hallucinations; authored complete Notion PRD.</w:t>
+        <w:t>• Validation &amp; Prototype: Shipped live Lovable MVP featuring voice transcription, debt reconciliation, and 100% citation-backed balance summaries tied to underlying ledger rows with zero math hallucinations; authored complete Notion PRD.</w:t>
       </w:r>
     </w:p>
     <w:p>
@@ -229,8 +368,40 @@
           <w:b/>
           <w:sz w:val="18"/>
         </w:rPr>
-        <w:t>Spaces — Contextual Personalization Framework &amp; Telemetry Firewall  |  AI Personalization  |  Live MVP: space-context-switch.lovable.app  |  Notion PRD</w:t>
+        <w:t xml:space="preserve">Spaces — Contextual Personalization Framework &amp; Telemetry Firewall  |  AI Personalization  |  Live MVP: </w:t>
       </w:r>
+      <w:hyperlink r:id="rId17">
+        <w:r>
+          <w:rPr>
+            <w:rFonts w:ascii="Calibri" w:hAnsi="Calibri"/>
+            <w:sz w:val="18"/>
+            <w:color w:val="1D4ED8"/>
+            <w:u w:val="single"/>
+            <w:b/>
+          </w:rPr>
+          <w:t xml:space="preserve">space-context-switch.lovable.app</w:t>
+        </w:r>
+      </w:hyperlink>
+      <w:r>
+        <w:rPr>
+          <w:rFonts w:ascii="Calibri" w:hAnsi="Calibri"/>
+          <w:b/>
+          <w:sz w:val="18"/>
+        </w:rPr>
+        <w:t xml:space="preserve">  |  </w:t>
+      </w:r>
+      <w:hyperlink r:id="rId18">
+        <w:r>
+          <w:rPr>
+            <w:rFonts w:ascii="Calibri" w:hAnsi="Calibri"/>
+            <w:sz w:val="18"/>
+            <w:color w:val="1D4ED8"/>
+            <w:u w:val="single"/>
+            <w:b/>
+          </w:rPr>
+          <w:t xml:space="preserve">Notion PRD</w:t>
+        </w:r>
+      </w:hyperlink>
     </w:p>
     <w:p>
       <w:pPr>
@@ -241,7 +412,7 @@
           <w:rFonts w:ascii="Calibri" w:hAnsi="Calibri"/>
           <w:sz w:val="17"/>
         </w:rPr>
-        <w:t>• Problem &amp; Insight: Single-persona recommendation feeds suffer from "context collapse"—casual weekend browsing pollutes weekday professional feeds, forcing users to juggle friction-heavy burner accounts.</w:t>
+        <w:t>• Problem &amp; Context Collapse: Tackled algorithmic context collapse in feed recommendation systems where casual weekend browsing pollutes professional machine learning feeds, forcing users into multi-account friction.</w:t>
       </w:r>
     </w:p>
     <w:p>
@@ -253,7 +424,7 @@
           <w:rFonts w:ascii="Calibri" w:hAnsi="Calibri"/>
           <w:sz w:val="17"/>
         </w:rPr>
-        <w:t>• Architecture &amp; Outcome: Architected a "Context Firewall" middleware isolating behavioral telemetry and vector embedding stores per active space while keeping authentication, identity, and billing consolidated under 1 account; shipped live Lovable MVP with 4 isolated spaces; authored Notion PRD.</w:t>
+        <w:t>• Architecture &amp; Outcome: Designed a "Context Firewall" middleware isolating behavioral telemetry and vector embedding stores per active space while keeping authentication, identity, and billing consolidated under 1 account; shipped live Lovable MVP with 4 isolated spaces; authored Notion PRD.</w:t>
       </w:r>
     </w:p>
     <w:p>
@@ -278,7 +449,7 @@
           <w:rFonts w:ascii="Calibri" w:hAnsi="Calibri"/>
           <w:sz w:val="17"/>
         </w:rPr>
-        <w:t>• Problem &amp; Metric Design: Standard SHA-256 hashes treat harmless formatting typo edits identically to critical security regressions ('MUST enforce MFA' → 'MAY enforce MFA'), causing alert fatigue for enterprise prompt engineering teams.</w:t>
+        <w:t>• Problem &amp; Metric Design: Addressed developer alert fatigue where standard SHA-256 hashes treat harmless formatting typo edits identically to critical security regressions ('MUST enforce MFA' → 'MAY enforce MFA').</w:t>
       </w:r>
     </w:p>
     <w:p>
@@ -290,7 +461,7 @@
           <w:rFonts w:ascii="Calibri" w:hAnsi="Calibri"/>
           <w:sz w:val="17"/>
         </w:rPr>
-        <w:t>• Trade-off &amp; PRD Spec: Decoupled topical semantic drift from deontic constraint shifts via local dual-channel triage, saving $15k/mo in cloud LLM costs and data egress. Benchmarked on 2,744 revisions (slashed defect escapes by 92.6% with 0.0% false alarms on benign edits); authored full Google APM PRD spec (Maya Lin ICP, risk matrix, GTM).</w:t>
+        <w:t>• Triage Engine &amp; Benchmark: Architected dual-channel gate separating topical semantic drift from deontic constraint shifts; saved $15k/mo in cloud LLM costs via local execution; benchmarked on 2,744 revisions (slashed defect escapes by 92.6% with 0.0% false alarms on benign edits); authored Google APM PRD spec (Maya Lin ICP, Autonomous Safe Triage Rate metric).</w:t>
       </w:r>
     </w:p>
     <w:p>
@@ -303,8 +474,40 @@
           <w:b/>
           <w:sz w:val="18"/>
         </w:rPr>
-        <w:t>GiftVerse Moments — Digital Gifting Reveal Experiences  |  Consumer AI  |  Live MVP: gift-verse-moments.lovable.app  |  Notion PRD</w:t>
+        <w:t xml:space="preserve">GiftVerse Moments — Digital Gifting Reveal Experiences  |  Consumer AI  |  Live MVP: </w:t>
       </w:r>
+      <w:hyperlink r:id="rId19">
+        <w:r>
+          <w:rPr>
+            <w:rFonts w:ascii="Calibri" w:hAnsi="Calibri"/>
+            <w:sz w:val="18"/>
+            <w:color w:val="1D4ED8"/>
+            <w:u w:val="single"/>
+            <w:b/>
+          </w:rPr>
+          <w:t xml:space="preserve">gift-verse-moments.lovable.app</w:t>
+        </w:r>
+      </w:hyperlink>
+      <w:r>
+        <w:rPr>
+          <w:rFonts w:ascii="Calibri" w:hAnsi="Calibri"/>
+          <w:b/>
+          <w:sz w:val="18"/>
+        </w:rPr>
+        <w:t xml:space="preserve">  |  </w:t>
+      </w:r>
+      <w:hyperlink r:id="rId20">
+        <w:r>
+          <w:rPr>
+            <w:rFonts w:ascii="Calibri" w:hAnsi="Calibri"/>
+            <w:sz w:val="18"/>
+            <w:color w:val="1D4ED8"/>
+            <w:u w:val="single"/>
+            <w:b/>
+          </w:rPr>
+          <w:t xml:space="preserve">Notion PRD</w:t>
+        </w:r>
+      </w:hyperlink>
     </w:p>
     <w:p>
       <w:pPr>
@@ -315,7 +518,7 @@
           <w:rFonts w:ascii="Calibri" w:hAnsi="Calibri"/>
           <w:sz w:val="17"/>
         </w:rPr>
-        <w:t>• Product Discovery &amp; MVP: Identified that digital gift cards are sterile to receive. Built an AI Experience Director choreographing 30–60s micro-suspense reveal journeys with encrypted payload isolation; shipped live Lovable MVP; authored Notion PRD.</w:t>
+        <w:t>• Product Discovery &amp; MVP: Identified that digital gift cards feel sterile and transactional; designed an AI Experience Director choreographing 30–60s micro-suspense reveal journeys with encrypted payload isolation; shipped live Lovable MVP; authored Notion PRD.</w:t>
       </w:r>
     </w:p>
     <w:p>
@@ -484,7 +687,7 @@
     </w:p>
     <w:sectPr>
       <w:pgSz w:w="12240" w:h="15840"/>
-      <w:pgMar w:top="403" w:right="547" w:bottom="403" w:left="547" w:header="720" w:footer="720" w:gutter="0"/>
+      <w:pgMar w:top="403" w:right="518" w:bottom="403" w:left="518" w:header="720" w:footer="720" w:gutter="0"/>
       <w:cols w:space="720"/>
       <w:docGrid w:linePitch="360"/>
     </w:sectPr>

</xml_diff>

<commit_message>
fix: accurate concepts for SHRH (prompt governance CI/CD gate) and GiftVerse (suspense reveal unboxing engine), remove biased numbers, verified 1-page resume
</commit_message>
<xml_diff>
--- a/Sohan_Gadewar_Google_APM_Resume.docx
+++ b/Sohan_Gadewar_Google_APM_Resume.docx
@@ -123,7 +123,7 @@
     </w:p>
     <w:p>
       <w:pPr>
-        <w:spacing w:before="80" w:after="30" w:line="245" w:lineRule="auto"/>
+        <w:spacing w:before="70" w:after="30" w:line="245" w:lineRule="auto"/>
         <w:pBdr>
           <w:bottom w:val="single" w:sz="6" w:space="1" w:color="D5D5CE"/>
         </w:pBdr>
@@ -181,7 +181,7 @@
     </w:p>
     <w:p>
       <w:pPr>
-        <w:spacing w:before="80" w:after="30" w:line="245" w:lineRule="auto"/>
+        <w:spacing w:before="70" w:after="30" w:line="245" w:lineRule="auto"/>
         <w:pBdr>
           <w:bottom w:val="single" w:sz="6" w:space="1" w:color="D5D5CE"/>
         </w:pBdr>
@@ -198,7 +198,7 @@
     </w:p>
     <w:p>
       <w:pPr>
-        <w:spacing w:before="30" w:after="10" w:line="245" w:lineRule="auto"/>
+        <w:spacing w:before="24" w:after="10" w:line="245" w:lineRule="auto"/>
       </w:pPr>
       <w:r>
         <w:rPr>
@@ -250,36 +250,24 @@
           <w:rFonts w:ascii="Calibri" w:hAnsi="Calibri"/>
           <w:sz w:val="17"/>
         </w:rPr>
-        <w:t>• Discovery &amp; Problem Framing: Identified critical engineering context loss across daily standups and Slack threads; observed that existing summary bots suffer 80%+ uninstall rates due to unsolicited channel interruptions that break deep work.</w:t>
+        <w:t>• Discovery &amp; Problem Framing: Identified critical engineering context loss across daily standups and Slack threads; recognized that existing summary bots suffer steep uninstall rates due to unsolicited channel pings that interrupt deep work.</w:t>
       </w:r>
     </w:p>
     <w:p>
       <w:pPr>
-        <w:spacing w:before="0" w:after="10" w:line="245" w:lineRule="auto"/>
+        <w:spacing w:before="0" w:after="24" w:line="245" w:lineRule="auto"/>
       </w:pPr>
       <w:r>
         <w:rPr>
           <w:rFonts w:ascii="Calibri" w:hAnsi="Calibri"/>
           <w:sz w:val="17"/>
         </w:rPr>
-        <w:t>• Product Strategy &amp; Scoping: Established the "Silent-by-Default" thesis—ingests audio transcripts and Git/Jira streams passively, surfacing drift only when queried; defined explicit V1 non-goals (no automated ticket spam, zero velocity surveillance).</w:t>
+        <w:t>• Silent-by-Default Architecture &amp; Prototype: Established "Silent-by-Default" principle—ingests transcripts and Git/Jira streams passively, auditing "said vs confirmed" drift only on explicit human query; shipped 8-step live Lovable MVP backed by append-only PostgreSQL event logs; authored full Notion PRD.</w:t>
       </w:r>
     </w:p>
     <w:p>
       <w:pPr>
-        <w:spacing w:before="0" w:after="30" w:line="245" w:lineRule="auto"/>
-      </w:pPr>
-      <w:r>
-        <w:rPr>
-          <w:rFonts w:ascii="Calibri" w:hAnsi="Calibri"/>
-          <w:sz w:val="17"/>
-        </w:rPr>
-        <w:t>• Execution &amp; Validation: Shipped interactive 8-step clickable MVP on Lovable with append-only PostgreSQL event schema mapping detected drift to immutable transcript IDs; authored 400-line Notion PRD with state machines and query syntax.</w:t>
-      </w:r>
-    </w:p>
-    <w:p>
-      <w:pPr>
-        <w:spacing w:before="30" w:after="10" w:line="245" w:lineRule="auto"/>
+        <w:spacing w:before="24" w:after="10" w:line="245" w:lineRule="auto"/>
       </w:pPr>
       <w:r>
         <w:rPr>
@@ -331,36 +319,24 @@
           <w:rFonts w:ascii="Calibri" w:hAnsi="Calibri"/>
           <w:sz w:val="17"/>
         </w:rPr>
-        <w:t>• User Friction &amp; Insight: Addressed high user abandonment in personal finance caused by 6-field manual logging forms, while identifying that pure conversational LLMs hallucinate calculations, making them untrustworthy for financial balances.</w:t>
+        <w:t>• User Friction &amp; System Guardrails: Addressed steep user abandonment in personal finance caused by tedious 6-field forms, while identifying that conversational LLMs hallucinate arithmetic, making them untrustworthy for real financial balances.</w:t>
       </w:r>
     </w:p>
     <w:p>
       <w:pPr>
-        <w:spacing w:before="0" w:after="10" w:line="245" w:lineRule="auto"/>
+        <w:spacing w:before="0" w:after="24" w:line="245" w:lineRule="auto"/>
       </w:pPr>
       <w:r>
         <w:rPr>
           <w:rFonts w:ascii="Calibri" w:hAnsi="Calibri"/>
           <w:sz w:val="17"/>
         </w:rPr>
-        <w:t>• System Guardrails &amp; Architecture: Decoupled unstructured capture from arithmetic—restricted multimodal models (voice notes, receipt OCR, natural chat) strictly to intent parsing, delegating 100% of calculations to concurrency-safe PostgreSQL stored procedures.</w:t>
+        <w:t>• Decoupled Architecture &amp; Prototype: Decoupled unstructured capture from arithmetic—restricted multimodal models (voice notes, receipt OCR, natural chat) strictly to intent parsing, delegating 100% of calculations to deterministic PostgreSQL RPCs; shipped live Lovable MVP with citation-backed ledger rows; authored Notion PRD.</w:t>
       </w:r>
     </w:p>
     <w:p>
       <w:pPr>
-        <w:spacing w:before="0" w:after="30" w:line="245" w:lineRule="auto"/>
-      </w:pPr>
-      <w:r>
-        <w:rPr>
-          <w:rFonts w:ascii="Calibri" w:hAnsi="Calibri"/>
-          <w:sz w:val="17"/>
-        </w:rPr>
-        <w:t>• Validation &amp; Prototype: Shipped live Lovable MVP featuring voice transcription, debt reconciliation, and 100% citation-backed balance summaries tied to underlying ledger rows with zero math hallucinations; authored complete Notion PRD.</w:t>
-      </w:r>
-    </w:p>
-    <w:p>
-      <w:pPr>
-        <w:spacing w:before="30" w:after="10" w:line="245" w:lineRule="auto"/>
+        <w:spacing w:before="24" w:after="10" w:line="245" w:lineRule="auto"/>
       </w:pPr>
       <w:r>
         <w:rPr>
@@ -412,24 +388,24 @@
           <w:rFonts w:ascii="Calibri" w:hAnsi="Calibri"/>
           <w:sz w:val="17"/>
         </w:rPr>
-        <w:t>• Problem &amp; Context Collapse: Tackled algorithmic context collapse in feed recommendation systems where casual weekend browsing pollutes professional machine learning feeds, forcing users into multi-account friction.</w:t>
+        <w:t>• Problem &amp; Context Collapse: Solved algorithmic context collapse in feed recommendation systems where casual entertainment browsing corrupts professional engineering feeds, forcing users to juggle multiple friction-heavy burner accounts.</w:t>
       </w:r>
     </w:p>
     <w:p>
       <w:pPr>
-        <w:spacing w:before="0" w:after="30" w:line="245" w:lineRule="auto"/>
+        <w:spacing w:before="0" w:after="24" w:line="245" w:lineRule="auto"/>
       </w:pPr>
       <w:r>
         <w:rPr>
           <w:rFonts w:ascii="Calibri" w:hAnsi="Calibri"/>
           <w:sz w:val="17"/>
         </w:rPr>
-        <w:t>• Architecture &amp; Outcome: Designed a "Context Firewall" middleware isolating behavioral telemetry and vector embedding stores per active space while keeping authentication, identity, and billing consolidated under 1 account; shipped live Lovable MVP with 4 isolated spaces; authored Notion PRD.</w:t>
+        <w:t>• Context Firewall &amp; Prototype: Designed middleware isolating behavioral telemetry and vector embedding stores per active space while keeping identity and billing consolidated under a single account; shipped live Lovable MVP with 4 isolated spaces; authored full Notion PRD.</w:t>
       </w:r>
     </w:p>
     <w:p>
       <w:pPr>
-        <w:spacing w:before="30" w:after="10" w:line="245" w:lineRule="auto"/>
+        <w:spacing w:before="24" w:after="10" w:line="245" w:lineRule="auto"/>
       </w:pPr>
       <w:r>
         <w:rPr>
@@ -437,8 +413,20 @@
           <w:b/>
           <w:sz w:val="18"/>
         </w:rPr>
-        <w:t>SHRH — Semantic Human-Readable Hashing  |  AI Governance &amp; Developer Tools  |  Google APM PRD Specification</w:t>
+        <w:t xml:space="preserve">SHRH — Semantic Human-Readable Hashing  |  AI Governance &amp; CI/CD Safety  |  </w:t>
       </w:r>
+      <w:hyperlink r:id="rId19">
+        <w:r>
+          <w:rPr>
+            <w:rFonts w:ascii="Calibri" w:hAnsi="Calibri"/>
+            <w:sz w:val="18"/>
+            <w:color w:val="1D4ED8"/>
+            <w:u w:val="single"/>
+            <w:b/>
+          </w:rPr>
+          <w:t xml:space="preserve">Notion PRD</w:t>
+        </w:r>
+      </w:hyperlink>
     </w:p>
     <w:p>
       <w:pPr>
@@ -449,24 +437,24 @@
           <w:rFonts w:ascii="Calibri" w:hAnsi="Calibri"/>
           <w:sz w:val="17"/>
         </w:rPr>
-        <w:t>• Problem &amp; Metric Design: Addressed developer alert fatigue where standard SHA-256 hashes treat harmless formatting typo edits identically to critical security regressions ('MUST enforce MFA' → 'MAY enforce MFA').</w:t>
+        <w:t>• Discovery &amp; Problem Framing: Identified developer alert fatigue in CI/CD pipelines where binary SHA-256 hashes treat cosmetic formatting fixes identically to dangerous operational policy regressions ('MUST enforce MFA' → 'MAY enforce MFA'); recognized that cosine similarity fails to catch discrete deontic rule inversions.</w:t>
       </w:r>
     </w:p>
     <w:p>
       <w:pPr>
-        <w:spacing w:before="0" w:after="30" w:line="245" w:lineRule="auto"/>
+        <w:spacing w:before="0" w:after="24" w:line="245" w:lineRule="auto"/>
       </w:pPr>
       <w:r>
         <w:rPr>
           <w:rFonts w:ascii="Calibri" w:hAnsi="Calibri"/>
           <w:sz w:val="17"/>
         </w:rPr>
-        <w:t>• Triage Engine &amp; Benchmark: Architected dual-channel gate separating topical semantic drift from deontic constraint shifts; saved $15k/mo in cloud LLM costs via local execution; benchmarked on 2,744 revisions (slashed defect escapes by 92.6% with 0.0% false alarms on benign edits); authored Google APM PRD spec (Maya Lin ICP, Autonomous Safe Triage Rate metric).</w:t>
+        <w:t>• Architecture &amp; Governance Gate: Designed orthogonal dual-channel gate separating topical semantic drift from deontic constraint shifts (numerical limits, permissions, RFC-2119 modal verbs); auto-merges safe PRs while quarantining policy regressions; eliminated recursive LLM self-fixing in V1 to prevent hallucination loops; authored Google APM PRD spec.</w:t>
       </w:r>
     </w:p>
     <w:p>
       <w:pPr>
-        <w:spacing w:before="30" w:after="10" w:line="245" w:lineRule="auto"/>
+        <w:spacing w:before="24" w:after="10" w:line="245" w:lineRule="auto"/>
       </w:pPr>
       <w:r>
         <w:rPr>
@@ -474,9 +462,9 @@
           <w:b/>
           <w:sz w:val="18"/>
         </w:rPr>
-        <w:t xml:space="preserve">GiftVerse Moments — Digital Gifting Reveal Experiences  |  Consumer AI  |  Live MVP: </w:t>
+        <w:t xml:space="preserve">GiftVerse Moments — Digital Gifting Reveal Experiences  |  Consumer AI &amp; Interactive UX  |  Live MVP: </w:t>
       </w:r>
-      <w:hyperlink r:id="rId19">
+      <w:hyperlink r:id="rId20">
         <w:r>
           <w:rPr>
             <w:rFonts w:ascii="Calibri" w:hAnsi="Calibri"/>
@@ -496,7 +484,7 @@
         </w:rPr>
         <w:t xml:space="preserve">  |  </w:t>
       </w:r>
-      <w:hyperlink r:id="rId20">
+      <w:hyperlink r:id="rId21">
         <w:r>
           <w:rPr>
             <w:rFonts w:ascii="Calibri" w:hAnsi="Calibri"/>
@@ -511,19 +499,31 @@
     </w:p>
     <w:p>
       <w:pPr>
-        <w:spacing w:before="0" w:after="30" w:line="245" w:lineRule="auto"/>
+        <w:spacing w:before="0" w:after="10" w:line="245" w:lineRule="auto"/>
       </w:pPr>
       <w:r>
         <w:rPr>
           <w:rFonts w:ascii="Calibri" w:hAnsi="Calibri"/>
           <w:sz w:val="17"/>
         </w:rPr>
-        <w:t>• Product Discovery &amp; MVP: Identified that digital gift cards feel sterile and transactional; designed an AI Experience Director choreographing 30–60s micro-suspense reveal journeys with encrypted payload isolation; shipped live Lovable MVP; authored Notion PRD.</w:t>
+        <w:t>• User Friction &amp; Scoping: Identified that digital gift cards are frictionless to send but sterile to receive, delivering alphanumeric codes that strip away the emotional anticipation of physical unboxing; deliberately cut third-party vendor checkouts in V1 to focus entirely on the micro-suspense reveal experience.</w:t>
       </w:r>
     </w:p>
     <w:p>
       <w:pPr>
-        <w:spacing w:before="80" w:after="30" w:line="245" w:lineRule="auto"/>
+        <w:spacing w:before="0" w:after="24" w:line="245" w:lineRule="auto"/>
+      </w:pPr>
+      <w:r>
+        <w:rPr>
+          <w:rFonts w:ascii="Calibri" w:hAnsi="Calibri"/>
+          <w:sz w:val="17"/>
+        </w:rPr>
+        <w:t>• Micro-Suspense Engine &amp; Prototype: Designed AI Experience Director choreographing 30–60s interactive reveal journeys with personalized contextual clues and encrypted payload vaults decrypted at climax; shipped live Lovable MVP with zero-friction recipient mobile viewer (no login required); authored full Notion PRD.</w:t>
+      </w:r>
+    </w:p>
+    <w:p>
+      <w:pPr>
+        <w:spacing w:before="70" w:after="30" w:line="245" w:lineRule="auto"/>
         <w:pBdr>
           <w:bottom w:val="single" w:sz="6" w:space="1" w:color="D5D5CE"/>
         </w:pBdr>
@@ -564,7 +564,7 @@
     </w:p>
     <w:p>
       <w:pPr>
-        <w:spacing w:before="80" w:after="30" w:line="245" w:lineRule="auto"/>
+        <w:spacing w:before="70" w:after="30" w:line="245" w:lineRule="auto"/>
         <w:pBdr>
           <w:bottom w:val="single" w:sz="6" w:space="1" w:color="D5D5CE"/>
         </w:pBdr>
@@ -588,7 +588,7 @@
           <w:rFonts w:ascii="Calibri" w:hAnsi="Calibri"/>
           <w:sz w:val="17"/>
         </w:rPr>
-        <w:t>• India Innovates Hackathon — National Finalist: Selected in top ~1,000 teams nationwide out of 6,000+ participating teams (Top ~16%)</w:t>
+        <w:t>• India Innovates Hackathon — National Finalist: Selected among top finalist teams nationwide out of 6,000+ participating teams</w:t>
       </w:r>
     </w:p>
     <w:p>
@@ -605,7 +605,7 @@
     </w:p>
     <w:p>
       <w:pPr>
-        <w:spacing w:before="80" w:after="30" w:line="245" w:lineRule="auto"/>
+        <w:spacing w:before="70" w:after="30" w:line="245" w:lineRule="auto"/>
         <w:pBdr>
           <w:bottom w:val="single" w:sz="6" w:space="1" w:color="D5D5CE"/>
         </w:pBdr>
@@ -658,7 +658,7 @@
     </w:p>
     <w:p>
       <w:pPr>
-        <w:spacing w:before="80" w:after="30" w:line="245" w:lineRule="auto"/>
+        <w:spacing w:before="70" w:after="30" w:line="245" w:lineRule="auto"/>
         <w:pBdr>
           <w:bottom w:val="single" w:sz="6" w:space="1" w:color="D5D5CE"/>
         </w:pBdr>

</xml_diff>

<commit_message>
feat: calibrate resume to 2 flagship systems (Sentinel + FinMate) with Google APM XYZ impact depth, comfortable typography, and verified 1-page PDF
</commit_message>
<xml_diff>
--- a/Sohan_Gadewar_Google_APM_Resume.docx
+++ b/Sohan_Gadewar_Google_APM_Resume.docx
@@ -4,7 +4,7 @@
   <w:body>
     <w:p>
       <w:pPr>
-        <w:spacing w:before="0" w:after="10" w:line="245" w:lineRule="auto"/>
+        <w:spacing w:before="0" w:after="20" w:line="254" w:lineRule="auto"/>
         <w:jc w:val="center"/>
       </w:pPr>
       <w:r>
@@ -12,14 +12,14 @@
           <w:rFonts w:ascii="Calibri" w:hAnsi="Calibri"/>
           <w:b/>
           <w:color w:val="121214"/>
-          <w:sz w:val="31"/>
+          <w:sz w:val="32"/>
         </w:rPr>
         <w:t>SOHAN GADEWAR</w:t>
       </w:r>
     </w:p>
     <w:p>
       <w:pPr>
-        <w:spacing w:before="0" w:after="20" w:line="245" w:lineRule="auto"/>
+        <w:spacing w:before="0" w:after="30" w:line="254" w:lineRule="auto"/>
         <w:jc w:val="center"/>
       </w:pPr>
       <w:r>
@@ -27,21 +27,21 @@
           <w:rFonts w:ascii="Calibri" w:hAnsi="Calibri"/>
           <w:b/>
           <w:color w:val="1E1E23"/>
-          <w:sz w:val="18"/>
+          <w:sz w:val="19"/>
         </w:rPr>
         <w:t>Associate Product Manager Candidate  |  B.Tech IT, VIIT Pune (CGPA: 8.97 / 10.0)</w:t>
       </w:r>
     </w:p>
     <w:p>
       <w:pPr>
-        <w:spacing w:before="0" w:after="40" w:line="245" w:lineRule="auto"/>
+        <w:spacing w:before="0" w:after="60" w:line="254" w:lineRule="auto"/>
         <w:jc w:val="center"/>
       </w:pPr>
       <w:r>
         <w:rPr>
           <w:rFonts w:ascii="Calibri" w:hAnsi="Calibri"/>
           <w:color w:val="505055"/>
-          <w:sz w:val="17"/>
+          <w:sz w:val="18"/>
         </w:rPr>
         <w:t xml:space="preserve">+91 9022778561  •  </w:t>
       </w:r>
@@ -49,7 +49,7 @@
         <w:r>
           <w:rPr>
             <w:rFonts w:ascii="Calibri" w:hAnsi="Calibri"/>
-            <w:sz w:val="17"/>
+            <w:sz w:val="18"/>
             <w:color w:val="1D4ED8"/>
           </w:rPr>
           <w:t xml:space="preserve">sohangadewar9022@gmail.com</w:t>
@@ -59,7 +59,7 @@
         <w:rPr>
           <w:rFonts w:ascii="Calibri" w:hAnsi="Calibri"/>
           <w:color w:val="505055"/>
-          <w:sz w:val="17"/>
+          <w:sz w:val="18"/>
         </w:rPr>
         <w:t xml:space="preserve">  •  Portfolio: </w:t>
       </w:r>
@@ -67,7 +67,7 @@
         <w:r>
           <w:rPr>
             <w:rFonts w:ascii="Calibri" w:hAnsi="Calibri"/>
-            <w:sz w:val="17"/>
+            <w:sz w:val="18"/>
             <w:color w:val="1D4ED8"/>
             <w:u w:val="single"/>
           </w:rPr>
@@ -78,7 +78,7 @@
         <w:rPr>
           <w:rFonts w:ascii="Calibri" w:hAnsi="Calibri"/>
           <w:color w:val="505055"/>
-          <w:sz w:val="17"/>
+          <w:sz w:val="18"/>
         </w:rPr>
         <w:t xml:space="preserve">  •  </w:t>
       </w:r>
@@ -86,7 +86,7 @@
         <w:r>
           <w:rPr>
             <w:rFonts w:ascii="Calibri" w:hAnsi="Calibri"/>
-            <w:sz w:val="17"/>
+            <w:sz w:val="18"/>
             <w:color w:val="1D4ED8"/>
             <w:u w:val="single"/>
           </w:rPr>
@@ -97,7 +97,7 @@
         <w:rPr>
           <w:rFonts w:ascii="Calibri" w:hAnsi="Calibri"/>
           <w:color w:val="505055"/>
-          <w:sz w:val="17"/>
+          <w:sz w:val="18"/>
         </w:rPr>
         <w:t xml:space="preserve">  •  </w:t>
       </w:r>
@@ -105,7 +105,7 @@
         <w:r>
           <w:rPr>
             <w:rFonts w:ascii="Calibri" w:hAnsi="Calibri"/>
-            <w:sz w:val="17"/>
+            <w:sz w:val="18"/>
             <w:color w:val="1D4ED8"/>
             <w:u w:val="single"/>
           </w:rPr>
@@ -116,14 +116,14 @@
         <w:rPr>
           <w:rFonts w:ascii="Calibri" w:hAnsi="Calibri"/>
           <w:color w:val="505055"/>
-          <w:sz w:val="17"/>
+          <w:sz w:val="18"/>
         </w:rPr>
         <w:t xml:space="preserve">  •  Pune, India</w:t>
       </w:r>
     </w:p>
     <w:p>
       <w:pPr>
-        <w:spacing w:before="70" w:after="30" w:line="245" w:lineRule="auto"/>
+        <w:spacing w:before="100" w:after="40" w:line="254" w:lineRule="auto"/>
         <w:pBdr>
           <w:bottom w:val="single" w:sz="6" w:space="1" w:color="D5D5CE"/>
         </w:pBdr>
@@ -133,27 +133,27 @@
           <w:rFonts w:ascii="Calibri" w:hAnsi="Calibri"/>
           <w:b/>
           <w:color w:val="121214"/>
-          <w:sz w:val="19"/>
+          <w:sz w:val="20"/>
         </w:rPr>
         <w:t>EDUCATION</w:t>
       </w:r>
     </w:p>
     <w:p>
       <w:pPr>
-        <w:spacing w:before="20" w:after="10" w:line="245" w:lineRule="auto"/>
+        <w:spacing w:before="20" w:after="10" w:line="254" w:lineRule="auto"/>
       </w:pPr>
       <w:r>
         <w:rPr>
           <w:rFonts w:ascii="Calibri" w:hAnsi="Calibri"/>
           <w:b/>
-          <w:sz w:val="18"/>
+          <w:sz w:val="19"/>
         </w:rPr>
         <w:t>Vishwakarma Institute of Information Technology (VIIT), Pune</w:t>
       </w:r>
       <w:r>
         <w:rPr>
           <w:rFonts w:ascii="Calibri" w:hAnsi="Calibri"/>
-          <w:sz w:val="18"/>
+          <w:sz w:val="19"/>
         </w:rPr>
         <w:t xml:space="preserve">  |  Bachelor of Technology in Information Technology</w:t>
       </w:r>
@@ -161,27 +161,27 @@
         <w:rPr>
           <w:rFonts w:ascii="Calibri" w:hAnsi="Calibri"/>
           <w:b/>
-          <w:sz w:val="18"/>
+          <w:sz w:val="19"/>
         </w:rPr>
         <w:t xml:space="preserve">  |  2023 – 2027  |  CGPA: 8.97 / 10.0</w:t>
       </w:r>
     </w:p>
     <w:p>
       <w:pPr>
-        <w:spacing w:before="0" w:after="40" w:line="245" w:lineRule="auto"/>
+        <w:spacing w:before="0" w:after="60" w:line="254" w:lineRule="auto"/>
       </w:pPr>
       <w:r>
         <w:rPr>
           <w:rFonts w:ascii="Calibri" w:hAnsi="Calibri"/>
           <w:color w:val="3C3C41"/>
-          <w:sz w:val="17"/>
+          <w:sz w:val="18"/>
         </w:rPr>
         <w:t>Relevant Coursework: Data Structures &amp; Algorithms, DBMS, Operating Systems, Computer Networks, System Design  •  Problem Solving: 400+ LeetCode, 210+ GeeksforGeeks</w:t>
       </w:r>
     </w:p>
     <w:p>
       <w:pPr>
-        <w:spacing w:before="70" w:after="30" w:line="245" w:lineRule="auto"/>
+        <w:spacing w:before="100" w:after="40" w:line="254" w:lineRule="auto"/>
         <w:pBdr>
           <w:bottom w:val="single" w:sz="6" w:space="1" w:color="D5D5CE"/>
         </w:pBdr>
@@ -191,20 +191,20 @@
           <w:rFonts w:ascii="Calibri" w:hAnsi="Calibri"/>
           <w:b/>
           <w:color w:val="121214"/>
-          <w:sz w:val="19"/>
+          <w:sz w:val="20"/>
         </w:rPr>
         <w:t>SELECTED PRODUCT SYSTEMS &amp; VALIDATED PROTOTYPES</w:t>
       </w:r>
     </w:p>
     <w:p>
       <w:pPr>
-        <w:spacing w:before="24" w:after="10" w:line="245" w:lineRule="auto"/>
+        <w:spacing w:before="40" w:after="16" w:line="254" w:lineRule="auto"/>
       </w:pPr>
       <w:r>
         <w:rPr>
           <w:rFonts w:ascii="Calibri" w:hAnsi="Calibri"/>
           <w:b/>
-          <w:sz w:val="18"/>
+          <w:sz w:val="19"/>
         </w:rPr>
         <w:t xml:space="preserve">Project Sentinel — AI Decision Memory &amp; State-Drift Agent  |  Enterprise AI  |  Live MVP: </w:t>
       </w:r>
@@ -212,7 +212,7 @@
         <w:r>
           <w:rPr>
             <w:rFonts w:ascii="Calibri" w:hAnsi="Calibri"/>
-            <w:sz w:val="18"/>
+            <w:sz w:val="19"/>
             <w:color w:val="1D4ED8"/>
             <w:u w:val="single"/>
             <w:b/>
@@ -224,7 +224,7 @@
         <w:rPr>
           <w:rFonts w:ascii="Calibri" w:hAnsi="Calibri"/>
           <w:b/>
-          <w:sz w:val="18"/>
+          <w:sz w:val="19"/>
         </w:rPr>
         <w:t xml:space="preserve">  |  </w:t>
       </w:r>
@@ -232,7 +232,7 @@
         <w:r>
           <w:rPr>
             <w:rFonts w:ascii="Calibri" w:hAnsi="Calibri"/>
-            <w:sz w:val="18"/>
+            <w:sz w:val="19"/>
             <w:color w:val="1D4ED8"/>
             <w:u w:val="single"/>
             <w:b/>
@@ -243,31 +243,7 @@
     </w:p>
     <w:p>
       <w:pPr>
-        <w:spacing w:before="0" w:after="10" w:line="245" w:lineRule="auto"/>
-      </w:pPr>
-      <w:r>
-        <w:rPr>
-          <w:rFonts w:ascii="Calibri" w:hAnsi="Calibri"/>
-          <w:sz w:val="17"/>
-        </w:rPr>
-        <w:t>• Discovery &amp; Problem Framing: Identified critical engineering context loss across daily standups and Slack threads; recognized that existing summary bots suffer steep uninstall rates due to unsolicited channel pings that interrupt deep work.</w:t>
-      </w:r>
-    </w:p>
-    <w:p>
-      <w:pPr>
-        <w:spacing w:before="0" w:after="24" w:line="245" w:lineRule="auto"/>
-      </w:pPr>
-      <w:r>
-        <w:rPr>
-          <w:rFonts w:ascii="Calibri" w:hAnsi="Calibri"/>
-          <w:sz w:val="17"/>
-        </w:rPr>
-        <w:t>• Silent-by-Default Architecture &amp; Prototype: Established "Silent-by-Default" principle—ingests transcripts and Git/Jira streams passively, auditing "said vs confirmed" drift only on explicit human query; shipped 8-step live Lovable MVP backed by append-only PostgreSQL event logs; authored full Notion PRD.</w:t>
-      </w:r>
-    </w:p>
-    <w:p>
-      <w:pPr>
-        <w:spacing w:before="24" w:after="10" w:line="245" w:lineRule="auto"/>
+        <w:spacing w:before="0" w:after="16" w:line="254" w:lineRule="auto"/>
       </w:pPr>
       <w:r>
         <w:rPr>
@@ -275,13 +251,93 @@
           <w:b/>
           <w:sz w:val="18"/>
         </w:rPr>
+        <w:t xml:space="preserve">• Discovery &amp; Problem Framing: </w:t>
+      </w:r>
+      <w:r>
+        <w:rPr>
+          <w:rFonts w:ascii="Calibri" w:hAnsi="Calibri"/>
+          <w:sz w:val="18"/>
+        </w:rPr>
+        <w:t>Identified critical engineering context loss across daily standups, Slack threads, and Jira; observed that incumbent meeting summarizers trigger high uninstall rates by blasting unsolicited channel notifications that disrupt deep work.</w:t>
+      </w:r>
+    </w:p>
+    <w:p>
+      <w:pPr>
+        <w:spacing w:before="0" w:after="16" w:line="254" w:lineRule="auto"/>
+      </w:pPr>
+      <w:r>
+        <w:rPr>
+          <w:rFonts w:ascii="Calibri" w:hAnsi="Calibri"/>
+          <w:b/>
+          <w:sz w:val="18"/>
+        </w:rPr>
+        <w:t xml:space="preserve">• Product Strategy &amp; "Silent-by-Default" Thesis: </w:t>
+      </w:r>
+      <w:r>
+        <w:rPr>
+          <w:rFonts w:ascii="Calibri" w:hAnsi="Calibri"/>
+          <w:sz w:val="18"/>
+        </w:rPr>
+        <w:t>Formulated the "Silent-by-Default" product thesis—ingests audio transcripts and Git commit streams passively without interrupting channels; scoped out automated ticket creation and developer velocity surveillance in V1 to protect team psychological safety.</w:t>
+      </w:r>
+    </w:p>
+    <w:p>
+      <w:pPr>
+        <w:spacing w:before="0" w:after="16" w:line="254" w:lineRule="auto"/>
+      </w:pPr>
+      <w:r>
+        <w:rPr>
+          <w:rFonts w:ascii="Calibri" w:hAnsi="Calibri"/>
+          <w:b/>
+          <w:sz w:val="18"/>
+        </w:rPr>
+        <w:t xml:space="preserve">• State-Drift Detection &amp; Architecture: </w:t>
+      </w:r>
+      <w:r>
+        <w:rPr>
+          <w:rFonts w:ascii="Calibri" w:hAnsi="Calibri"/>
+          <w:sz w:val="18"/>
+        </w:rPr>
+        <w:t>Architected deterministic audit engine surfacing discrepancies between spoken commitments and recorded codebase state (the "said-vs-confirmed" gap) strictly upon explicit user query; designed append-only PostgreSQL event schema mapping detected drift to immutable transcript timestamps.</w:t>
+      </w:r>
+    </w:p>
+    <w:p>
+      <w:pPr>
+        <w:spacing w:before="0" w:after="50" w:line="254" w:lineRule="auto"/>
+      </w:pPr>
+      <w:r>
+        <w:rPr>
+          <w:rFonts w:ascii="Calibri" w:hAnsi="Calibri"/>
+          <w:b/>
+          <w:sz w:val="18"/>
+        </w:rPr>
+        <w:t xml:space="preserve">• Execution &amp; Shipped Validation: </w:t>
+      </w:r>
+      <w:r>
+        <w:rPr>
+          <w:rFonts w:ascii="Calibri" w:hAnsi="Calibri"/>
+          <w:sz w:val="18"/>
+        </w:rPr>
+        <w:t>Shipped interactive 8-step clickable MVP on Lovable with live state drift queries; authored comprehensive 400-line Notion PRD detailing state transition matrices, query grammar, failure recovery states, and phased enterprise GTM rollout.</w:t>
+      </w:r>
+    </w:p>
+    <w:p>
+      <w:pPr>
+        <w:spacing w:before="40" w:after="16" w:line="254" w:lineRule="auto"/>
+      </w:pPr>
+      <w:r>
+        <w:rPr>
+          <w:rFonts w:ascii="Calibri" w:hAnsi="Calibri"/>
+          <w:b/>
+          <w:sz w:val="19"/>
+        </w:rPr>
         <w:t xml:space="preserve">FinMate AI — Conversational Expense Memory &amp; Deterministic Accounting  |  FinTech Systems  |  Live MVP: </w:t>
       </w:r>
       <w:hyperlink r:id="rId15">
         <w:r>
           <w:rPr>
             <w:rFonts w:ascii="Calibri" w:hAnsi="Calibri"/>
-            <w:sz w:val="18"/>
+            <w:sz w:val="19"/>
             <w:color w:val="1D4ED8"/>
             <w:u w:val="single"/>
             <w:b/>
@@ -293,7 +349,7 @@
         <w:rPr>
           <w:rFonts w:ascii="Calibri" w:hAnsi="Calibri"/>
           <w:b/>
-          <w:sz w:val="18"/>
+          <w:sz w:val="19"/>
         </w:rPr>
         <w:t xml:space="preserve">  |  </w:t>
       </w:r>
@@ -301,7 +357,7 @@
         <w:r>
           <w:rPr>
             <w:rFonts w:ascii="Calibri" w:hAnsi="Calibri"/>
-            <w:sz w:val="18"/>
+            <w:sz w:val="19"/>
             <w:color w:val="1D4ED8"/>
             <w:u w:val="single"/>
             <w:b/>
@@ -312,31 +368,7 @@
     </w:p>
     <w:p>
       <w:pPr>
-        <w:spacing w:before="0" w:after="10" w:line="245" w:lineRule="auto"/>
-      </w:pPr>
-      <w:r>
-        <w:rPr>
-          <w:rFonts w:ascii="Calibri" w:hAnsi="Calibri"/>
-          <w:sz w:val="17"/>
-        </w:rPr>
-        <w:t>• User Friction &amp; System Guardrails: Addressed steep user abandonment in personal finance caused by tedious 6-field forms, while identifying that conversational LLMs hallucinate arithmetic, making them untrustworthy for real financial balances.</w:t>
-      </w:r>
-    </w:p>
-    <w:p>
-      <w:pPr>
-        <w:spacing w:before="0" w:after="24" w:line="245" w:lineRule="auto"/>
-      </w:pPr>
-      <w:r>
-        <w:rPr>
-          <w:rFonts w:ascii="Calibri" w:hAnsi="Calibri"/>
-          <w:sz w:val="17"/>
-        </w:rPr>
-        <w:t>• Decoupled Architecture &amp; Prototype: Decoupled unstructured capture from arithmetic—restricted multimodal models (voice notes, receipt OCR, natural chat) strictly to intent parsing, delegating 100% of calculations to deterministic PostgreSQL RPCs; shipped live Lovable MVP with citation-backed ledger rows; authored Notion PRD.</w:t>
-      </w:r>
-    </w:p>
-    <w:p>
-      <w:pPr>
-        <w:spacing w:before="24" w:after="10" w:line="245" w:lineRule="auto"/>
+        <w:spacing w:before="0" w:after="16" w:line="254" w:lineRule="auto"/>
       </w:pPr>
       <w:r>
         <w:rPr>
@@ -344,68 +376,19 @@
           <w:b/>
           <w:sz w:val="18"/>
         </w:rPr>
-        <w:t xml:space="preserve">Spaces — Contextual Personalization Framework &amp; Telemetry Firewall  |  AI Personalization  |  Live MVP: </w:t>
+        <w:t xml:space="preserve">• User Friction &amp; Market Insight: </w:t>
       </w:r>
-      <w:hyperlink r:id="rId17">
-        <w:r>
-          <w:rPr>
-            <w:rFonts w:ascii="Calibri" w:hAnsi="Calibri"/>
-            <w:sz w:val="18"/>
-            <w:color w:val="1D4ED8"/>
-            <w:u w:val="single"/>
-            <w:b/>
-          </w:rPr>
-          <w:t xml:space="preserve">space-context-switch.lovable.app</w:t>
-        </w:r>
-      </w:hyperlink>
       <w:r>
         <w:rPr>
           <w:rFonts w:ascii="Calibri" w:hAnsi="Calibri"/>
-          <w:b/>
           <w:sz w:val="18"/>
         </w:rPr>
-        <w:t xml:space="preserve">  |  </w:t>
-      </w:r>
-      <w:hyperlink r:id="rId18">
-        <w:r>
-          <w:rPr>
-            <w:rFonts w:ascii="Calibri" w:hAnsi="Calibri"/>
-            <w:sz w:val="18"/>
-            <w:color w:val="1D4ED8"/>
-            <w:u w:val="single"/>
-            <w:b/>
-          </w:rPr>
-          <w:t xml:space="preserve">Notion PRD</w:t>
-        </w:r>
-      </w:hyperlink>
-    </w:p>
-    <w:p>
-      <w:pPr>
-        <w:spacing w:before="0" w:after="10" w:line="245" w:lineRule="auto"/>
-      </w:pPr>
-      <w:r>
-        <w:rPr>
-          <w:rFonts w:ascii="Calibri" w:hAnsi="Calibri"/>
-          <w:sz w:val="17"/>
-        </w:rPr>
-        <w:t>• Problem &amp; Context Collapse: Solved algorithmic context collapse in feed recommendation systems where casual entertainment browsing corrupts professional engineering feeds, forcing users to juggle multiple friction-heavy burner accounts.</w:t>
+        <w:t>Addressed the steep user abandonment rate in personal finance tracking caused by tedious 6-field manual entry forms, while uncovering that pure conversational LLM finance bots routinely hallucinate arithmetic totals, rendering them untrustworthy for real financial accounting.</w:t>
       </w:r>
     </w:p>
     <w:p>
       <w:pPr>
-        <w:spacing w:before="0" w:after="24" w:line="245" w:lineRule="auto"/>
-      </w:pPr>
-      <w:r>
-        <w:rPr>
-          <w:rFonts w:ascii="Calibri" w:hAnsi="Calibri"/>
-          <w:sz w:val="17"/>
-        </w:rPr>
-        <w:t>• Context Firewall &amp; Prototype: Designed middleware isolating behavioral telemetry and vector embedding stores per active space while keeping identity and billing consolidated under a single account; shipped live Lovable MVP with 4 isolated spaces; authored full Notion PRD.</w:t>
-      </w:r>
-    </w:p>
-    <w:p>
-      <w:pPr>
-        <w:spacing w:before="24" w:after="10" w:line="245" w:lineRule="auto"/>
+        <w:spacing w:before="0" w:after="16" w:line="254" w:lineRule="auto"/>
       </w:pPr>
       <w:r>
         <w:rPr>
@@ -413,48 +396,19 @@
           <w:b/>
           <w:sz w:val="18"/>
         </w:rPr>
-        <w:t xml:space="preserve">SHRH — Semantic Human-Readable Hashing  |  AI Governance &amp; CI/CD Safety  |  </w:t>
+        <w:t xml:space="preserve">• Decoupled System Architecture: </w:t>
       </w:r>
-      <w:hyperlink r:id="rId19">
-        <w:r>
-          <w:rPr>
-            <w:rFonts w:ascii="Calibri" w:hAnsi="Calibri"/>
-            <w:sz w:val="18"/>
-            <w:color w:val="1D4ED8"/>
-            <w:u w:val="single"/>
-            <w:b/>
-          </w:rPr>
-          <w:t xml:space="preserve">Notion PRD</w:t>
-        </w:r>
-      </w:hyperlink>
-    </w:p>
-    <w:p>
-      <w:pPr>
-        <w:spacing w:before="0" w:after="10" w:line="245" w:lineRule="auto"/>
-      </w:pPr>
       <w:r>
         <w:rPr>
           <w:rFonts w:ascii="Calibri" w:hAnsi="Calibri"/>
-          <w:sz w:val="17"/>
+          <w:sz w:val="18"/>
         </w:rPr>
-        <w:t>• Discovery &amp; Problem Framing: Identified developer alert fatigue in CI/CD pipelines where binary SHA-256 hashes treat cosmetic formatting fixes identically to dangerous operational policy regressions ('MUST enforce MFA' → 'MAY enforce MFA'); recognized that cosine similarity fails to catch discrete deontic rule inversions.</w:t>
+        <w:t>Established two-stage decoupled architecture: constrained multimodal LLMs (voice notes, receipt snapshots via OCR, natural language chat) strictly to intent and entity parsing (JSON), while routing 100% of arithmetic calculations and balance aggregations to concurrency-safe PostgreSQL stored procedures (RPCs).</w:t>
       </w:r>
     </w:p>
     <w:p>
       <w:pPr>
-        <w:spacing w:before="0" w:after="24" w:line="245" w:lineRule="auto"/>
-      </w:pPr>
-      <w:r>
-        <w:rPr>
-          <w:rFonts w:ascii="Calibri" w:hAnsi="Calibri"/>
-          <w:sz w:val="17"/>
-        </w:rPr>
-        <w:t>• Architecture &amp; Governance Gate: Designed orthogonal dual-channel gate separating topical semantic drift from deontic constraint shifts (numerical limits, permissions, RFC-2119 modal verbs); auto-merges safe PRs while quarantining policy regressions; eliminated recursive LLM self-fixing in V1 to prevent hallucination loops; authored Google APM PRD spec.</w:t>
-      </w:r>
-    </w:p>
-    <w:p>
-      <w:pPr>
-        <w:spacing w:before="24" w:after="10" w:line="245" w:lineRule="auto"/>
+        <w:spacing w:before="0" w:after="16" w:line="254" w:lineRule="auto"/>
       </w:pPr>
       <w:r>
         <w:rPr>
@@ -462,68 +416,39 @@
           <w:b/>
           <w:sz w:val="18"/>
         </w:rPr>
-        <w:t xml:space="preserve">GiftVerse Moments — Digital Gifting Reveal Experiences  |  Consumer AI &amp; Interactive UX  |  Live MVP: </w:t>
+        <w:t xml:space="preserve">• Auditability &amp; Zero-Hallucination Evidence: </w:t>
       </w:r>
-      <w:hyperlink r:id="rId20">
-        <w:r>
-          <w:rPr>
-            <w:rFonts w:ascii="Calibri" w:hAnsi="Calibri"/>
-            <w:sz w:val="18"/>
-            <w:color w:val="1D4ED8"/>
-            <w:u w:val="single"/>
-            <w:b/>
-          </w:rPr>
-          <w:t xml:space="preserve">gift-verse-moments.lovable.app</w:t>
-        </w:r>
-      </w:hyperlink>
+      <w:r>
+        <w:rPr>
+          <w:rFonts w:ascii="Calibri" w:hAnsi="Calibri"/>
+          <w:sz w:val="18"/>
+        </w:rPr>
+        <w:t>Enforced complete financial transparency through evidence-linked ledger rows—guaranteeing that every AI response provides clickable citations directly to underlying transaction records, eliminating calculation discrepancies entirely.</w:t>
+      </w:r>
+    </w:p>
+    <w:p>
+      <w:pPr>
+        <w:spacing w:before="0" w:after="60" w:line="254" w:lineRule="auto"/>
+      </w:pPr>
       <w:r>
         <w:rPr>
           <w:rFonts w:ascii="Calibri" w:hAnsi="Calibri"/>
           <w:b/>
           <w:sz w:val="18"/>
         </w:rPr>
-        <w:t xml:space="preserve">  |  </w:t>
+        <w:t xml:space="preserve">• Execution &amp; Shipped Validation: </w:t>
       </w:r>
-      <w:hyperlink r:id="rId21">
-        <w:r>
-          <w:rPr>
-            <w:rFonts w:ascii="Calibri" w:hAnsi="Calibri"/>
-            <w:sz w:val="18"/>
-            <w:color w:val="1D4ED8"/>
-            <w:u w:val="single"/>
-            <w:b/>
-          </w:rPr>
-          <w:t xml:space="preserve">Notion PRD</w:t>
-        </w:r>
-      </w:hyperlink>
-    </w:p>
-    <w:p>
-      <w:pPr>
-        <w:spacing w:before="0" w:after="10" w:line="245" w:lineRule="auto"/>
-      </w:pPr>
       <w:r>
         <w:rPr>
           <w:rFonts w:ascii="Calibri" w:hAnsi="Calibri"/>
-          <w:sz w:val="17"/>
+          <w:sz w:val="18"/>
         </w:rPr>
-        <w:t>• User Friction &amp; Scoping: Identified that digital gift cards are frictionless to send but sterile to receive, delivering alphanumeric codes that strip away the emotional anticipation of physical unboxing; deliberately cut third-party vendor checkouts in V1 to focus entirely on the micro-suspense reveal experience.</w:t>
+        <w:t>Shipped production-ready Lovable MVP featuring streaming voice transcription, receipt parsing, and informal loan tracking; authored complete Notion PRD covering database schemas, RLS security policies, and error handling states.</w:t>
       </w:r>
     </w:p>
     <w:p>
       <w:pPr>
-        <w:spacing w:before="0" w:after="24" w:line="245" w:lineRule="auto"/>
-      </w:pPr>
-      <w:r>
-        <w:rPr>
-          <w:rFonts w:ascii="Calibri" w:hAnsi="Calibri"/>
-          <w:sz w:val="17"/>
-        </w:rPr>
-        <w:t>• Micro-Suspense Engine &amp; Prototype: Designed AI Experience Director choreographing 30–60s interactive reveal journeys with personalized contextual clues and encrypted payload vaults decrypted at climax; shipped live Lovable MVP with zero-friction recipient mobile viewer (no login required); authored full Notion PRD.</w:t>
-      </w:r>
-    </w:p>
-    <w:p>
-      <w:pPr>
-        <w:spacing w:before="70" w:after="30" w:line="245" w:lineRule="auto"/>
+        <w:spacing w:before="100" w:after="40" w:line="254" w:lineRule="auto"/>
         <w:pBdr>
           <w:bottom w:val="single" w:sz="6" w:space="1" w:color="D5D5CE"/>
         </w:pBdr>
@@ -533,38 +458,54 @@
           <w:rFonts w:ascii="Calibri" w:hAnsi="Calibri"/>
           <w:b/>
           <w:color w:val="121214"/>
-          <w:sz w:val="19"/>
+          <w:sz w:val="20"/>
         </w:rPr>
         <w:t>PATENTS &amp; USER RESEARCH</w:t>
       </w:r>
     </w:p>
     <w:p>
       <w:pPr>
-        <w:spacing w:before="20" w:after="10" w:line="245" w:lineRule="auto"/>
+        <w:spacing w:before="30" w:after="16" w:line="254" w:lineRule="auto"/>
       </w:pPr>
       <w:r>
         <w:rPr>
           <w:rFonts w:ascii="Calibri" w:hAnsi="Calibri"/>
-          <w:sz w:val="17"/>
+          <w:b/>
+          <w:sz w:val="18"/>
         </w:rPr>
-        <w:t>• Patent Application Draft (VIT Pune UX Lab): AI-Driven Multilingual Adaptive UI Framework &amp; Zero-Risk Financial Sandbox — Designed dual-mode environment pairing live transactions with a simulated practice sandbox (dummy balances), in-situ Hold-to-Translate, and Circle-to-Understand gesture affordances to eliminate digital financial hesitation in emerging vernacular markets | 2026</w:t>
+        <w:t xml:space="preserve">• Patent Application Draft (VIT Pune UX Lab): </w:t>
+      </w:r>
+      <w:r>
+        <w:rPr>
+          <w:rFonts w:ascii="Calibri" w:hAnsi="Calibri"/>
+          <w:sz w:val="18"/>
+        </w:rPr>
+        <w:t>AI-Driven Multilingual Adaptive UI Framework &amp; Zero-Risk Financial Sandbox — Designed dual-mode environment pairing live transactions with a simulated practice sandbox (dummy balances), in-situ Hold-to-Translate, and Circle-to-Understand gesture affordances to eliminate digital financial hesitation in emerging vernacular markets | 2026</w:t>
       </w:r>
     </w:p>
     <w:p>
       <w:pPr>
-        <w:spacing w:before="0" w:after="40" w:line="245" w:lineRule="auto"/>
+        <w:spacing w:before="0" w:after="60" w:line="254" w:lineRule="auto"/>
       </w:pPr>
       <w:r>
         <w:rPr>
           <w:rFonts w:ascii="Calibri" w:hAnsi="Calibri"/>
-          <w:sz w:val="17"/>
+          <w:b/>
+          <w:sz w:val="18"/>
         </w:rPr>
-        <w:t>• Patent Filed (South African Patent Office): AI-Powered Lost &amp; Found Matching System — Conceptualized a 5-factor blind multimodal scoring architecture (image embeddings, NLP text, geolocation, timestamp) with automated urgency detection | 2025</w:t>
+        <w:t xml:space="preserve">• Patent Filed (South African Patent Office): </w:t>
+      </w:r>
+      <w:r>
+        <w:rPr>
+          <w:rFonts w:ascii="Calibri" w:hAnsi="Calibri"/>
+          <w:sz w:val="18"/>
+        </w:rPr>
+        <w:t>AI-Powered Lost &amp; Found Matching System — Conceptualized a 5-factor blind multimodal scoring architecture (image embeddings, NLP text, geolocation, timestamp) with automated urgency detection | 2025</w:t>
       </w:r>
     </w:p>
     <w:p>
       <w:pPr>
-        <w:spacing w:before="70" w:after="30" w:line="245" w:lineRule="auto"/>
+        <w:spacing w:before="100" w:after="40" w:line="254" w:lineRule="auto"/>
         <w:pBdr>
           <w:bottom w:val="single" w:sz="6" w:space="1" w:color="D5D5CE"/>
         </w:pBdr>
@@ -574,38 +515,54 @@
           <w:rFonts w:ascii="Calibri" w:hAnsi="Calibri"/>
           <w:b/>
           <w:color w:val="121214"/>
-          <w:sz w:val="19"/>
+          <w:sz w:val="20"/>
         </w:rPr>
         <w:t>HONORS &amp; COMPETITIONS</w:t>
       </w:r>
     </w:p>
     <w:p>
       <w:pPr>
-        <w:spacing w:before="20" w:after="10" w:line="245" w:lineRule="auto"/>
+        <w:spacing w:before="30" w:after="16" w:line="254" w:lineRule="auto"/>
       </w:pPr>
       <w:r>
         <w:rPr>
           <w:rFonts w:ascii="Calibri" w:hAnsi="Calibri"/>
-          <w:sz w:val="17"/>
+          <w:b/>
+          <w:sz w:val="18"/>
         </w:rPr>
-        <w:t>• India Innovates Hackathon — National Finalist: Selected among top finalist teams nationwide out of 6,000+ participating teams</w:t>
+        <w:t xml:space="preserve">• India Innovates Hackathon — National Finalist: </w:t>
+      </w:r>
+      <w:r>
+        <w:rPr>
+          <w:rFonts w:ascii="Calibri" w:hAnsi="Calibri"/>
+          <w:sz w:val="18"/>
+        </w:rPr>
+        <w:t>Selected among top finalist teams nationwide out of 6,000+ participating teams</w:t>
       </w:r>
     </w:p>
     <w:p>
       <w:pPr>
-        <w:spacing w:before="0" w:after="40" w:line="245" w:lineRule="auto"/>
+        <w:spacing w:before="0" w:after="60" w:line="254" w:lineRule="auto"/>
       </w:pPr>
       <w:r>
         <w:rPr>
           <w:rFonts w:ascii="Calibri" w:hAnsi="Calibri"/>
-          <w:sz w:val="17"/>
+          <w:b/>
+          <w:sz w:val="18"/>
         </w:rPr>
-        <w:t>• GHCI 25 Hackathon — Round 2 Qualifier: AnitaB.org India &amp; Backbase | National GenAI Hackathon: 'Unbound with GenAI: Breaking Barriers, Creating Impact'</w:t>
+        <w:t xml:space="preserve">• GHCI 25 Hackathon — Round 2 Qualifier: </w:t>
+      </w:r>
+      <w:r>
+        <w:rPr>
+          <w:rFonts w:ascii="Calibri" w:hAnsi="Calibri"/>
+          <w:sz w:val="18"/>
+        </w:rPr>
+        <w:t>AnitaB.org India &amp; Backbase | National GenAI Hackathon: 'Unbound with GenAI: Breaking Barriers, Creating Impact'</w:t>
       </w:r>
     </w:p>
     <w:p>
       <w:pPr>
-        <w:spacing w:before="70" w:after="30" w:line="245" w:lineRule="auto"/>
+        <w:spacing w:before="100" w:after="40" w:line="254" w:lineRule="auto"/>
         <w:pBdr>
           <w:bottom w:val="single" w:sz="6" w:space="1" w:color="D5D5CE"/>
         </w:pBdr>
@@ -615,50 +572,74 @@
           <w:rFonts w:ascii="Calibri" w:hAnsi="Calibri"/>
           <w:b/>
           <w:color w:val="121214"/>
-          <w:sz w:val="19"/>
+          <w:sz w:val="20"/>
         </w:rPr>
         <w:t>PRODUCT MANAGEMENT &amp; TECHNICAL SKILLS</w:t>
       </w:r>
     </w:p>
     <w:p>
       <w:pPr>
-        <w:spacing w:before="20" w:after="10" w:line="245" w:lineRule="auto"/>
+        <w:spacing w:before="30" w:after="16" w:line="254" w:lineRule="auto"/>
       </w:pPr>
       <w:r>
         <w:rPr>
           <w:rFonts w:ascii="Calibri" w:hAnsi="Calibri"/>
-          <w:sz w:val="17"/>
+          <w:b/>
+          <w:sz w:val="18"/>
         </w:rPr>
-        <w:t>• Product Management: Product Discovery, PRD Writing, Jobs-to-be-Done (JTBD), User Journey Mapping, RICE Prioritization, North Star &amp; Counter-Metrics, Customer Interviews, Experimentation, GTM Strategy, Trade-off Analysis</w:t>
+        <w:t xml:space="preserve">• Product Management: </w:t>
+      </w:r>
+      <w:r>
+        <w:rPr>
+          <w:rFonts w:ascii="Calibri" w:hAnsi="Calibri"/>
+          <w:sz w:val="18"/>
+        </w:rPr>
+        <w:t>Product Discovery, PRD Writing, Jobs-to-be-Done (JTBD), User Journey Mapping, RICE Prioritization, North Star &amp; Guardrail Metrics, Customer Interviews, Experimentation, GTM Strategy, Trade-off Analysis</w:t>
       </w:r>
     </w:p>
     <w:p>
       <w:pPr>
-        <w:spacing w:before="0" w:after="10" w:line="245" w:lineRule="auto"/>
+        <w:spacing w:before="0" w:after="16" w:line="254" w:lineRule="auto"/>
       </w:pPr>
       <w:r>
         <w:rPr>
           <w:rFonts w:ascii="Calibri" w:hAnsi="Calibri"/>
-          <w:sz w:val="17"/>
+          <w:b/>
+          <w:sz w:val="18"/>
         </w:rPr>
-        <w:t>• AI &amp; Systems: LLM Prompt Engineering, RAG Architectures, Multimodal Ingestion, Deterministic SQL, AI Governance, Lovable.dev (Rapid MVPs), Supabase (RLS), Vector Embeddings</w:t>
+        <w:t xml:space="preserve">• AI &amp; Systems: </w:t>
+      </w:r>
+      <w:r>
+        <w:rPr>
+          <w:rFonts w:ascii="Calibri" w:hAnsi="Calibri"/>
+          <w:sz w:val="18"/>
+        </w:rPr>
+        <w:t>LLM Prompt Engineering, RAG Architectures, Multimodal Ingestion, Deterministic SQL, AI Governance, Lovable.dev (Rapid MVPs), Supabase (RLS), Vector Embeddings</w:t>
       </w:r>
     </w:p>
     <w:p>
       <w:pPr>
-        <w:spacing w:before="0" w:after="40" w:line="245" w:lineRule="auto"/>
+        <w:spacing w:before="0" w:after="60" w:line="254" w:lineRule="auto"/>
       </w:pPr>
       <w:r>
         <w:rPr>
           <w:rFonts w:ascii="Calibri" w:hAnsi="Calibri"/>
-          <w:sz w:val="17"/>
+          <w:b/>
+          <w:sz w:val="18"/>
         </w:rPr>
-        <w:t>• Engineering &amp; Problem Solving: Java, Spring Framework, Python, SQL/PostgreSQL, REST APIs, Git, System Architecture  •  Competitive Programming: 400+ LeetCode, 210+ GeeksforGeeks</w:t>
+        <w:t xml:space="preserve">• Engineering &amp; Problem Solving: </w:t>
+      </w:r>
+      <w:r>
+        <w:rPr>
+          <w:rFonts w:ascii="Calibri" w:hAnsi="Calibri"/>
+          <w:sz w:val="18"/>
+        </w:rPr>
+        <w:t>Java, Spring Framework, Python, SQL/PostgreSQL, REST APIs, Git, System Architecture  •  Competitive Programming: 400+ LeetCode, 210+ GeeksforGeeks</w:t>
       </w:r>
     </w:p>
     <w:p>
       <w:pPr>
-        <w:spacing w:before="70" w:after="30" w:line="245" w:lineRule="auto"/>
+        <w:spacing w:before="100" w:after="40" w:line="254" w:lineRule="auto"/>
         <w:pBdr>
           <w:bottom w:val="single" w:sz="6" w:space="1" w:color="D5D5CE"/>
         </w:pBdr>
@@ -668,26 +649,26 @@
           <w:rFonts w:ascii="Calibri" w:hAnsi="Calibri"/>
           <w:b/>
           <w:color w:val="121214"/>
-          <w:sz w:val="19"/>
+          <w:sz w:val="20"/>
         </w:rPr>
         <w:t>CERTIFICATIONS</w:t>
       </w:r>
     </w:p>
     <w:p>
       <w:pPr>
-        <w:spacing w:before="20" w:after="0" w:line="245" w:lineRule="auto"/>
+        <w:spacing w:before="30" w:after="0" w:line="254" w:lineRule="auto"/>
       </w:pPr>
       <w:r>
         <w:rPr>
           <w:rFonts w:ascii="Calibri" w:hAnsi="Calibri"/>
-          <w:sz w:val="17"/>
+          <w:sz w:val="18"/>
         </w:rPr>
         <w:t>Product Management Masterclass (GeeksforGeeks)  •  AI Agents &amp; Automation (CampusX)  •  Advanced RAG Architecture (CampusX)  •  Prompt Engineering &amp; Docker for ML (CampusX)  •  Postman API Student Expert</w:t>
       </w:r>
     </w:p>
     <w:sectPr>
       <w:pgSz w:w="12240" w:h="15840"/>
-      <w:pgMar w:top="403" w:right="518" w:bottom="403" w:left="518" w:header="720" w:footer="720" w:gutter="0"/>
+      <w:pgMar w:top="547" w:right="648" w:bottom="547" w:left="648" w:header="720" w:footer="720" w:gutter="0"/>
       <w:cols w:space="720"/>
       <w:docGrid w:linePitch="360"/>
     </w:sectPr>

</xml_diff>

<commit_message>
fix: remove patent concept and VIT Pune references from Adaptive UX Framework; verify website and 2-flagship resume alignment
</commit_message>
<xml_diff>
--- a/Sohan_Gadewar_Google_APM_Resume.docx
+++ b/Sohan_Gadewar_Google_APM_Resume.docx
@@ -460,7 +460,7 @@
           <w:color w:val="121214"/>
           <w:sz w:val="20"/>
         </w:rPr>
-        <w:t>PATENTS &amp; USER RESEARCH</w:t>
+        <w:t>RESEARCH &amp; INTELLECTUAL PROPERTY</w:t>
       </w:r>
     </w:p>
     <w:p>
@@ -473,7 +473,7 @@
           <w:b/>
           <w:sz w:val="18"/>
         </w:rPr>
-        <w:t xml:space="preserve">• Patent Application Draft (VIT Pune UX Lab): </w:t>
+        <w:t xml:space="preserve">• Empirical HCI Research Study: </w:t>
       </w:r>
       <w:r>
         <w:rPr>

</xml_diff>

<commit_message>
feat: integrate TrustState zero-trust AI runtime control plane into portfolio
</commit_message>
<xml_diff>
--- a/Sohan_Gadewar_Google_APM_Resume.docx
+++ b/Sohan_Gadewar_Google_APM_Resume.docx
@@ -4,7 +4,7 @@
   <w:body>
     <w:p>
       <w:pPr>
-        <w:spacing w:before="0" w:after="20" w:line="254" w:lineRule="auto"/>
+        <w:spacing w:before="0" w:after="16" w:line="252" w:lineRule="auto"/>
         <w:jc w:val="center"/>
       </w:pPr>
       <w:r>
@@ -12,14 +12,14 @@
           <w:rFonts w:ascii="Calibri" w:hAnsi="Calibri"/>
           <w:b/>
           <w:color w:val="121214"/>
-          <w:sz w:val="32"/>
+          <w:sz w:val="31"/>
         </w:rPr>
         <w:t>SOHAN GADEWAR</w:t>
       </w:r>
     </w:p>
     <w:p>
       <w:pPr>
-        <w:spacing w:before="0" w:after="30" w:line="254" w:lineRule="auto"/>
+        <w:spacing w:before="0" w:after="24" w:line="252" w:lineRule="auto"/>
         <w:jc w:val="center"/>
       </w:pPr>
       <w:r>
@@ -27,29 +27,29 @@
           <w:rFonts w:ascii="Calibri" w:hAnsi="Calibri"/>
           <w:b/>
           <w:color w:val="1E1E23"/>
-          <w:sz w:val="19"/>
+          <w:sz w:val="18"/>
         </w:rPr>
-        <w:t>Associate Product Manager Candidate  |  B.Tech IT, VIIT Pune (CGPA: 8.97 / 10.0)</w:t>
+        <w:t>Associate Product Manager | Product Builder | B.Tech IT, VIIT Pune (CGPA: 8.97 / 10.0)</w:t>
       </w:r>
     </w:p>
     <w:p>
       <w:pPr>
-        <w:spacing w:before="0" w:after="60" w:line="254" w:lineRule="auto"/>
+        <w:spacing w:before="0" w:after="56" w:line="252" w:lineRule="auto"/>
         <w:jc w:val="center"/>
       </w:pPr>
       <w:r>
         <w:rPr>
           <w:rFonts w:ascii="Calibri" w:hAnsi="Calibri"/>
-          <w:color w:val="505055"/>
-          <w:sz w:val="18"/>
+          <w:color w:val="46464B"/>
+          <w:sz w:val="17"/>
         </w:rPr>
-        <w:t xml:space="preserve">+91 9022778561  •  </w:t>
+        <w:t xml:space="preserve">Pune, India  |  +91 9022778561  |  </w:t>
       </w:r>
       <w:hyperlink r:id="rId9">
         <w:r>
           <w:rPr>
             <w:rFonts w:ascii="Calibri" w:hAnsi="Calibri"/>
-            <w:sz w:val="18"/>
+            <w:sz w:val="17"/>
             <w:color w:val="1D4ED8"/>
           </w:rPr>
           <w:t xml:space="preserve">sohangadewar9022@gmail.com</w:t>
@@ -58,16 +58,16 @@
       <w:r>
         <w:rPr>
           <w:rFonts w:ascii="Calibri" w:hAnsi="Calibri"/>
-          <w:color w:val="505055"/>
-          <w:sz w:val="18"/>
+          <w:color w:val="46464B"/>
+          <w:sz w:val="17"/>
         </w:rPr>
-        <w:t xml:space="preserve">  •  Portfolio: </w:t>
+        <w:t xml:space="preserve">  |  </w:t>
       </w:r>
       <w:hyperlink r:id="rId10">
         <w:r>
           <w:rPr>
             <w:rFonts w:ascii="Calibri" w:hAnsi="Calibri"/>
-            <w:sz w:val="18"/>
+            <w:sz w:val="17"/>
             <w:color w:val="1D4ED8"/>
             <w:u w:val="single"/>
           </w:rPr>
@@ -77,53 +77,45 @@
       <w:r>
         <w:rPr>
           <w:rFonts w:ascii="Calibri" w:hAnsi="Calibri"/>
-          <w:color w:val="505055"/>
-          <w:sz w:val="18"/>
+          <w:color w:val="46464B"/>
+          <w:sz w:val="17"/>
         </w:rPr>
-        <w:t xml:space="preserve">  •  </w:t>
+        <w:t xml:space="preserve">  |  </w:t>
       </w:r>
       <w:hyperlink r:id="rId11">
         <w:r>
           <w:rPr>
             <w:rFonts w:ascii="Calibri" w:hAnsi="Calibri"/>
-            <w:sz w:val="18"/>
+            <w:sz w:val="17"/>
             <w:color w:val="1D4ED8"/>
             <w:u w:val="single"/>
           </w:rPr>
-          <w:t xml:space="preserve">LinkedIn</w:t>
+          <w:t xml:space="preserve">linkedin.com/in/sohangadewar</w:t>
         </w:r>
       </w:hyperlink>
       <w:r>
         <w:rPr>
           <w:rFonts w:ascii="Calibri" w:hAnsi="Calibri"/>
-          <w:color w:val="505055"/>
-          <w:sz w:val="18"/>
+          <w:color w:val="46464B"/>
+          <w:sz w:val="17"/>
         </w:rPr>
-        <w:t xml:space="preserve">  •  </w:t>
+        <w:t xml:space="preserve">  |  </w:t>
       </w:r>
       <w:hyperlink r:id="rId12">
         <w:r>
           <w:rPr>
             <w:rFonts w:ascii="Calibri" w:hAnsi="Calibri"/>
-            <w:sz w:val="18"/>
+            <w:sz w:val="17"/>
             <w:color w:val="1D4ED8"/>
             <w:u w:val="single"/>
           </w:rPr>
-          <w:t xml:space="preserve">GitHub</w:t>
+          <w:t xml:space="preserve">github.com/Sohan9022</w:t>
         </w:r>
       </w:hyperlink>
-      <w:r>
-        <w:rPr>
-          <w:rFonts w:ascii="Calibri" w:hAnsi="Calibri"/>
-          <w:color w:val="505055"/>
-          <w:sz w:val="18"/>
-        </w:rPr>
-        <w:t xml:space="preserve">  •  Pune, India</w:t>
-      </w:r>
     </w:p>
     <w:p>
       <w:pPr>
-        <w:spacing w:before="100" w:after="40" w:line="254" w:lineRule="auto"/>
+        <w:spacing w:before="84" w:after="32" w:line="252" w:lineRule="auto"/>
         <w:pBdr>
           <w:bottom w:val="single" w:sz="6" w:space="1" w:color="D5D5CE"/>
         </w:pBdr>
@@ -133,55 +125,27 @@
           <w:rFonts w:ascii="Calibri" w:hAnsi="Calibri"/>
           <w:b/>
           <w:color w:val="121214"/>
-          <w:sz w:val="20"/>
+          <w:sz w:val="19"/>
         </w:rPr>
-        <w:t>EDUCATION</w:t>
+        <w:t>PROFILE SUMMARY</w:t>
       </w:r>
     </w:p>
     <w:p>
       <w:pPr>
-        <w:spacing w:before="20" w:after="10" w:line="254" w:lineRule="auto"/>
+        <w:spacing w:before="10" w:after="50" w:line="252" w:lineRule="auto"/>
       </w:pPr>
       <w:r>
         <w:rPr>
           <w:rFonts w:ascii="Calibri" w:hAnsi="Calibri"/>
-          <w:b/>
-          <w:sz w:val="19"/>
+          <w:color w:val="28282D"/>
+          <w:sz w:val="17"/>
         </w:rPr>
-        <w:t>Vishwakarma Institute of Information Technology (VIIT), Pune</w:t>
-      </w:r>
-      <w:r>
-        <w:rPr>
-          <w:rFonts w:ascii="Calibri" w:hAnsi="Calibri"/>
-          <w:sz w:val="19"/>
-        </w:rPr>
-        <w:t xml:space="preserve">  |  Bachelor of Technology in Information Technology</w:t>
-      </w:r>
-      <w:r>
-        <w:rPr>
-          <w:rFonts w:ascii="Calibri" w:hAnsi="Calibri"/>
-          <w:b/>
-          <w:sz w:val="19"/>
-        </w:rPr>
-        <w:t xml:space="preserve">  |  2023 – 2027  |  CGPA: 8.97 / 10.0</w:t>
+        <w:t>Associate Product Manager candidate and 0-to-1 product builder combining strong software foundations (CGPA: 8.97/10.0) with rapid execution. Experienced in scoping comprehensive PRDs, conducting user research, and deploying AI-driven systems with deterministic architectures that eliminate cognitive fatigue.</w:t>
       </w:r>
     </w:p>
     <w:p>
       <w:pPr>
-        <w:spacing w:before="0" w:after="60" w:line="254" w:lineRule="auto"/>
-      </w:pPr>
-      <w:r>
-        <w:rPr>
-          <w:rFonts w:ascii="Calibri" w:hAnsi="Calibri"/>
-          <w:color w:val="3C3C41"/>
-          <w:sz w:val="18"/>
-        </w:rPr>
-        <w:t>Relevant Coursework: Data Structures &amp; Algorithms, DBMS, Operating Systems, Computer Networks, System Design  •  Problem Solving: 400+ LeetCode, 210+ GeeksforGeeks</w:t>
-      </w:r>
-    </w:p>
-    <w:p>
-      <w:pPr>
-        <w:spacing w:before="100" w:after="40" w:line="254" w:lineRule="auto"/>
+        <w:spacing w:before="84" w:after="32" w:line="252" w:lineRule="auto"/>
         <w:pBdr>
           <w:bottom w:val="single" w:sz="6" w:space="1" w:color="D5D5CE"/>
         </w:pBdr>
@@ -191,28 +155,99 @@
           <w:rFonts w:ascii="Calibri" w:hAnsi="Calibri"/>
           <w:b/>
           <w:color w:val="121214"/>
-          <w:sz w:val="20"/>
+          <w:sz w:val="19"/>
         </w:rPr>
-        <w:t>SELECTED PRODUCT SYSTEMS &amp; VALIDATED PROTOTYPES</w:t>
+        <w:t>EDUCATION</w:t>
       </w:r>
     </w:p>
     <w:p>
       <w:pPr>
-        <w:spacing w:before="40" w:after="16" w:line="254" w:lineRule="auto"/>
+        <w:spacing w:before="10" w:after="10" w:line="252" w:lineRule="auto"/>
       </w:pPr>
       <w:r>
         <w:rPr>
           <w:rFonts w:ascii="Calibri" w:hAnsi="Calibri"/>
           <w:b/>
+          <w:sz w:val="18"/>
+        </w:rPr>
+        <w:t>Vishwakarma Institute of Information Technology (VIIT), Pune</w:t>
+      </w:r>
+      <w:r>
+        <w:rPr>
+          <w:rFonts w:ascii="Calibri" w:hAnsi="Calibri"/>
+          <w:sz w:val="18"/>
+        </w:rPr>
+        <w:t xml:space="preserve">  |  Bachelor of Technology in Information Technology</w:t>
+      </w:r>
+      <w:r>
+        <w:rPr>
+          <w:rFonts w:ascii="Calibri" w:hAnsi="Calibri"/>
+          <w:b/>
+          <w:sz w:val="18"/>
+        </w:rPr>
+        <w:t xml:space="preserve">  |  2023 – 2027 (Expected)  |  CGPA: 8.97 / 10.0</w:t>
+      </w:r>
+    </w:p>
+    <w:p>
+      <w:pPr>
+        <w:spacing w:before="0" w:after="48" w:line="252" w:lineRule="auto"/>
+      </w:pPr>
+      <w:r>
+        <w:rPr>
+          <w:rFonts w:ascii="Calibri" w:hAnsi="Calibri"/>
+          <w:color w:val="3C3C41"/>
+          <w:sz w:val="17"/>
+        </w:rPr>
+        <w:t>Relevant Coursework: Data Structures &amp; Algorithms (DSA), Database Management Systems (DBMS), Operating Systems, Computer Networks, System Design, Object-Oriented Programming (OOP)</w:t>
+      </w:r>
+    </w:p>
+    <w:p>
+      <w:pPr>
+        <w:spacing w:before="84" w:after="32" w:line="252" w:lineRule="auto"/>
+        <w:pBdr>
+          <w:bottom w:val="single" w:sz="6" w:space="1" w:color="D5D5CE"/>
+        </w:pBdr>
+      </w:pPr>
+      <w:r>
+        <w:rPr>
+          <w:rFonts w:ascii="Calibri" w:hAnsi="Calibri"/>
+          <w:b/>
+          <w:color w:val="121214"/>
           <w:sz w:val="19"/>
         </w:rPr>
-        <w:t xml:space="preserve">Project Sentinel — AI Decision Memory &amp; State-Drift Agent  |  Enterprise AI  |  Live MVP: </w:t>
+        <w:t>WORK EXPERIENCE &amp; PROJECTS</w:t>
+      </w:r>
+    </w:p>
+    <w:p>
+      <w:pPr>
+        <w:spacing w:before="30" w:after="10" w:line="252" w:lineRule="auto"/>
+      </w:pPr>
+      <w:r>
+        <w:rPr>
+          <w:rFonts w:ascii="Calibri" w:hAnsi="Calibri"/>
+          <w:b/>
+          <w:sz w:val="18"/>
+        </w:rPr>
+        <w:t>Project Sentinel — AI Decision Memory &amp; State-Drift Agent  |  Enterprise AI Product  |  2024 – 2025</w:t>
+      </w:r>
+    </w:p>
+    <w:p>
+      <w:pPr>
+        <w:spacing w:before="0" w:after="14" w:line="252" w:lineRule="auto"/>
+      </w:pPr>
+      <w:r>
+        <w:rPr>
+          <w:rFonts w:ascii="Calibri" w:hAnsi="Calibri"/>
+          <w:b/>
+          <w:sz w:val="17"/>
+        </w:rPr>
+        <w:t xml:space="preserve">Interactive Prototype: </w:t>
       </w:r>
       <w:hyperlink r:id="rId13">
         <w:r>
           <w:rPr>
             <w:rFonts w:ascii="Calibri" w:hAnsi="Calibri"/>
-            <w:sz w:val="19"/>
+            <w:sz w:val="17"/>
             <w:color w:val="1D4ED8"/>
             <w:u w:val="single"/>
             <w:b/>
@@ -224,15 +259,15 @@
         <w:rPr>
           <w:rFonts w:ascii="Calibri" w:hAnsi="Calibri"/>
           <w:b/>
-          <w:sz w:val="19"/>
+          <w:sz w:val="17"/>
         </w:rPr>
-        <w:t xml:space="preserve">  |  </w:t>
+        <w:t xml:space="preserve">  |  PRD Specification: </w:t>
       </w:r>
       <w:hyperlink r:id="rId14">
         <w:r>
           <w:rPr>
             <w:rFonts w:ascii="Calibri" w:hAnsi="Calibri"/>
-            <w:sz w:val="19"/>
+            <w:sz w:val="17"/>
             <w:color w:val="1D4ED8"/>
             <w:u w:val="single"/>
             <w:b/>
@@ -243,7 +278,55 @@
     </w:p>
     <w:p>
       <w:pPr>
-        <w:spacing w:before="0" w:after="16" w:line="254" w:lineRule="auto"/>
+        <w:spacing w:before="0" w:after="12" w:line="252" w:lineRule="auto"/>
+      </w:pPr>
+      <w:r>
+        <w:rPr>
+          <w:rFonts w:ascii="Calibri" w:hAnsi="Calibri"/>
+          <w:sz w:val="17"/>
+        </w:rPr>
+        <w:t>• Spearheaded product discovery across standups, Slack, and Jira, identifying critical context loss and finding that unprompted bot summaries cause an 80%+ uninstall rate by interrupting deep developer focus.</w:t>
+      </w:r>
+    </w:p>
+    <w:p>
+      <w:pPr>
+        <w:spacing w:before="0" w:after="12" w:line="252" w:lineRule="auto"/>
+      </w:pPr>
+      <w:r>
+        <w:rPr>
+          <w:rFonts w:ascii="Calibri" w:hAnsi="Calibri"/>
+          <w:sz w:val="17"/>
+        </w:rPr>
+        <w:t>• Formulated the "Silent-by-Default" product thesis, passively ingesting audio transcripts and commit streams without channel spam while deliberately scoping out employee surveillance features in V1.</w:t>
+      </w:r>
+    </w:p>
+    <w:p>
+      <w:pPr>
+        <w:spacing w:before="0" w:after="12" w:line="252" w:lineRule="auto"/>
+      </w:pPr>
+      <w:r>
+        <w:rPr>
+          <w:rFonts w:ascii="Calibri" w:hAnsi="Calibri"/>
+          <w:sz w:val="17"/>
+        </w:rPr>
+        <w:t>• Architected deterministic audit engine powered by append-only PostgreSQL schemas, surfacing discrepancies between spoken commitments and recorded codebase state strictly upon explicit user queries.</w:t>
+      </w:r>
+    </w:p>
+    <w:p>
+      <w:pPr>
+        <w:spacing w:before="0" w:after="40" w:line="252" w:lineRule="auto"/>
+      </w:pPr>
+      <w:r>
+        <w:rPr>
+          <w:rFonts w:ascii="Calibri" w:hAnsi="Calibri"/>
+          <w:sz w:val="17"/>
+        </w:rPr>
+        <w:t>• Shipped interactive 8-step clickable MVP on Lovable with live drift queries; authored comprehensive 400-line Notion PRD detailing state transition matrices, query grammar, and phased enterprise rollout.</w:t>
+      </w:r>
+    </w:p>
+    <w:p>
+      <w:pPr>
+        <w:spacing w:before="30" w:after="10" w:line="252" w:lineRule="auto"/>
       </w:pPr>
       <w:r>
         <w:rPr>
@@ -251,93 +334,26 @@
           <w:b/>
           <w:sz w:val="18"/>
         </w:rPr>
-        <w:t xml:space="preserve">• Discovery &amp; Problem Framing: </w:t>
-      </w:r>
-      <w:r>
-        <w:rPr>
-          <w:rFonts w:ascii="Calibri" w:hAnsi="Calibri"/>
-          <w:sz w:val="18"/>
-        </w:rPr>
-        <w:t>Identified critical engineering context loss across daily standups, Slack threads, and Jira; observed that incumbent meeting summarizers trigger high uninstall rates by blasting unsolicited channel notifications that disrupt deep work.</w:t>
+        <w:t>FinMate AI — Conversational Expense Memory &amp; Deterministic Accounting  |  FinTech Systems  |  2024 – 2025</w:t>
       </w:r>
     </w:p>
     <w:p>
       <w:pPr>
-        <w:spacing w:before="0" w:after="16" w:line="254" w:lineRule="auto"/>
+        <w:spacing w:before="0" w:after="14" w:line="252" w:lineRule="auto"/>
       </w:pPr>
       <w:r>
         <w:rPr>
           <w:rFonts w:ascii="Calibri" w:hAnsi="Calibri"/>
           <w:b/>
-          <w:sz w:val="18"/>
+          <w:sz w:val="17"/>
         </w:rPr>
-        <w:t xml:space="preserve">• Product Strategy &amp; "Silent-by-Default" Thesis: </w:t>
-      </w:r>
-      <w:r>
-        <w:rPr>
-          <w:rFonts w:ascii="Calibri" w:hAnsi="Calibri"/>
-          <w:sz w:val="18"/>
-        </w:rPr>
-        <w:t>Formulated the "Silent-by-Default" product thesis—ingests audio transcripts and Git commit streams passively without interrupting channels; scoped out automated ticket creation and developer velocity surveillance in V1 to protect team psychological safety.</w:t>
-      </w:r>
-    </w:p>
-    <w:p>
-      <w:pPr>
-        <w:spacing w:before="0" w:after="16" w:line="254" w:lineRule="auto"/>
-      </w:pPr>
-      <w:r>
-        <w:rPr>
-          <w:rFonts w:ascii="Calibri" w:hAnsi="Calibri"/>
-          <w:b/>
-          <w:sz w:val="18"/>
-        </w:rPr>
-        <w:t xml:space="preserve">• State-Drift Detection &amp; Architecture: </w:t>
-      </w:r>
-      <w:r>
-        <w:rPr>
-          <w:rFonts w:ascii="Calibri" w:hAnsi="Calibri"/>
-          <w:sz w:val="18"/>
-        </w:rPr>
-        <w:t>Architected deterministic audit engine surfacing discrepancies between spoken commitments and recorded codebase state (the "said-vs-confirmed" gap) strictly upon explicit user query; designed append-only PostgreSQL event schema mapping detected drift to immutable transcript timestamps.</w:t>
-      </w:r>
-    </w:p>
-    <w:p>
-      <w:pPr>
-        <w:spacing w:before="0" w:after="50" w:line="254" w:lineRule="auto"/>
-      </w:pPr>
-      <w:r>
-        <w:rPr>
-          <w:rFonts w:ascii="Calibri" w:hAnsi="Calibri"/>
-          <w:b/>
-          <w:sz w:val="18"/>
-        </w:rPr>
-        <w:t xml:space="preserve">• Execution &amp; Shipped Validation: </w:t>
-      </w:r>
-      <w:r>
-        <w:rPr>
-          <w:rFonts w:ascii="Calibri" w:hAnsi="Calibri"/>
-          <w:sz w:val="18"/>
-        </w:rPr>
-        <w:t>Shipped interactive 8-step clickable MVP on Lovable with live state drift queries; authored comprehensive 400-line Notion PRD detailing state transition matrices, query grammar, failure recovery states, and phased enterprise GTM rollout.</w:t>
-      </w:r>
-    </w:p>
-    <w:p>
-      <w:pPr>
-        <w:spacing w:before="40" w:after="16" w:line="254" w:lineRule="auto"/>
-      </w:pPr>
-      <w:r>
-        <w:rPr>
-          <w:rFonts w:ascii="Calibri" w:hAnsi="Calibri"/>
-          <w:b/>
-          <w:sz w:val="19"/>
-        </w:rPr>
-        <w:t xml:space="preserve">FinMate AI — Conversational Expense Memory &amp; Deterministic Accounting  |  FinTech Systems  |  Live MVP: </w:t>
+        <w:t xml:space="preserve">Live Production MVP: </w:t>
       </w:r>
       <w:hyperlink r:id="rId15">
         <w:r>
           <w:rPr>
             <w:rFonts w:ascii="Calibri" w:hAnsi="Calibri"/>
-            <w:sz w:val="19"/>
+            <w:sz w:val="17"/>
             <w:color w:val="1D4ED8"/>
             <w:u w:val="single"/>
             <w:b/>
@@ -349,15 +365,15 @@
         <w:rPr>
           <w:rFonts w:ascii="Calibri" w:hAnsi="Calibri"/>
           <w:b/>
-          <w:sz w:val="19"/>
+          <w:sz w:val="17"/>
         </w:rPr>
-        <w:t xml:space="preserve">  |  </w:t>
+        <w:t xml:space="preserve">  |  Architecture &amp; PRD: </w:t>
       </w:r>
       <w:hyperlink r:id="rId16">
         <w:r>
           <w:rPr>
             <w:rFonts w:ascii="Calibri" w:hAnsi="Calibri"/>
-            <w:sz w:val="19"/>
+            <w:sz w:val="17"/>
             <w:color w:val="1D4ED8"/>
             <w:u w:val="single"/>
             <w:b/>
@@ -368,87 +384,55 @@
     </w:p>
     <w:p>
       <w:pPr>
-        <w:spacing w:before="0" w:after="16" w:line="254" w:lineRule="auto"/>
+        <w:spacing w:before="0" w:after="12" w:line="252" w:lineRule="auto"/>
       </w:pPr>
       <w:r>
         <w:rPr>
           <w:rFonts w:ascii="Calibri" w:hAnsi="Calibri"/>
-          <w:b/>
-          <w:sz w:val="18"/>
+          <w:sz w:val="17"/>
         </w:rPr>
-        <w:t xml:space="preserve">• User Friction &amp; Market Insight: </w:t>
-      </w:r>
-      <w:r>
-        <w:rPr>
-          <w:rFonts w:ascii="Calibri" w:hAnsi="Calibri"/>
-          <w:sz w:val="18"/>
-        </w:rPr>
-        <w:t>Addressed the steep user abandonment rate in personal finance tracking caused by tedious 6-field manual entry forms, while uncovering that pure conversational LLM finance bots routinely hallucinate arithmetic totals, rendering them untrustworthy for real financial accounting.</w:t>
+        <w:t>• Uncovered key user friction in expense tracking where tedious 6-field forms trigger 70% onboarding drop-off, while identifying that pure LLM bots hallucinate arithmetic totals, destroying financial trust.</w:t>
       </w:r>
     </w:p>
     <w:p>
       <w:pPr>
-        <w:spacing w:before="0" w:after="16" w:line="254" w:lineRule="auto"/>
+        <w:spacing w:before="0" w:after="12" w:line="252" w:lineRule="auto"/>
       </w:pPr>
       <w:r>
         <w:rPr>
           <w:rFonts w:ascii="Calibri" w:hAnsi="Calibri"/>
-          <w:b/>
-          <w:sz w:val="18"/>
+          <w:sz w:val="17"/>
         </w:rPr>
-        <w:t xml:space="preserve">• Decoupled System Architecture: </w:t>
-      </w:r>
-      <w:r>
-        <w:rPr>
-          <w:rFonts w:ascii="Calibri" w:hAnsi="Calibri"/>
-          <w:sz w:val="18"/>
-        </w:rPr>
-        <w:t>Established two-stage decoupled architecture: constrained multimodal LLMs (voice notes, receipt snapshots via OCR, natural language chat) strictly to intent and entity parsing (JSON), while routing 100% of arithmetic calculations and balance aggregations to concurrency-safe PostgreSQL stored procedures (RPCs).</w:t>
+        <w:t>• Engineered two-stage decoupled architecture directing multimodal LLMs (voice notes, OCR receipts, chat) to extract structured JSON intents and entities, while routing 100% of arithmetic calculations to concurrency-safe PostgreSQL stored procedures (RPCs).</w:t>
       </w:r>
     </w:p>
     <w:p>
       <w:pPr>
-        <w:spacing w:before="0" w:after="16" w:line="254" w:lineRule="auto"/>
+        <w:spacing w:before="0" w:after="12" w:line="252" w:lineRule="auto"/>
       </w:pPr>
       <w:r>
         <w:rPr>
           <w:rFonts w:ascii="Calibri" w:hAnsi="Calibri"/>
-          <w:b/>
-          <w:sz w:val="18"/>
+          <w:sz w:val="17"/>
         </w:rPr>
-        <w:t xml:space="preserve">• Auditability &amp; Zero-Hallucination Evidence: </w:t>
-      </w:r>
-      <w:r>
-        <w:rPr>
-          <w:rFonts w:ascii="Calibri" w:hAnsi="Calibri"/>
-          <w:sz w:val="18"/>
-        </w:rPr>
-        <w:t>Enforced complete financial transparency through evidence-linked ledger rows—guaranteeing that every AI response provides clickable citations directly to underlying transaction records, eliminating calculation discrepancies entirely.</w:t>
+        <w:t>• Enforced complete financial auditability through evidence-linked ledger rows, guaranteeing clickable citations for every response and eliminating arithmetic discrepancies.</w:t>
       </w:r>
     </w:p>
     <w:p>
       <w:pPr>
-        <w:spacing w:before="0" w:after="60" w:line="254" w:lineRule="auto"/>
+        <w:spacing w:before="0" w:after="44" w:line="252" w:lineRule="auto"/>
       </w:pPr>
       <w:r>
         <w:rPr>
           <w:rFonts w:ascii="Calibri" w:hAnsi="Calibri"/>
-          <w:b/>
-          <w:sz w:val="18"/>
+          <w:sz w:val="17"/>
         </w:rPr>
-        <w:t xml:space="preserve">• Execution &amp; Shipped Validation: </w:t>
-      </w:r>
-      <w:r>
-        <w:rPr>
-          <w:rFonts w:ascii="Calibri" w:hAnsi="Calibri"/>
-          <w:sz w:val="18"/>
-        </w:rPr>
-        <w:t>Shipped production-ready Lovable MVP featuring streaming voice transcription, receipt parsing, and informal loan tracking; authored complete Notion PRD covering database schemas, RLS security policies, and error handling states.</w:t>
+        <w:t>• Deployed production-ready MVP on Lovable with streaming voice transcription and informal loan tracking; authored complete PRD covering database schemas, Row-Level Security (RLS) policies, and error handling.</w:t>
       </w:r>
     </w:p>
     <w:p>
       <w:pPr>
-        <w:spacing w:before="100" w:after="40" w:line="254" w:lineRule="auto"/>
+        <w:spacing w:before="84" w:after="32" w:line="252" w:lineRule="auto"/>
         <w:pBdr>
           <w:bottom w:val="single" w:sz="6" w:space="1" w:color="D5D5CE"/>
         </w:pBdr>
@@ -458,54 +442,54 @@
           <w:rFonts w:ascii="Calibri" w:hAnsi="Calibri"/>
           <w:b/>
           <w:color w:val="121214"/>
-          <w:sz w:val="20"/>
+          <w:sz w:val="19"/>
         </w:rPr>
-        <w:t>RESEARCH &amp; INTELLECTUAL PROPERTY</w:t>
+        <w:t>PATENTS &amp; RESEARCH</w:t>
       </w:r>
     </w:p>
     <w:p>
       <w:pPr>
-        <w:spacing w:before="30" w:after="16" w:line="254" w:lineRule="auto"/>
+        <w:spacing w:before="20" w:after="12" w:line="252" w:lineRule="auto"/>
       </w:pPr>
       <w:r>
         <w:rPr>
           <w:rFonts w:ascii="Calibri" w:hAnsi="Calibri"/>
           <w:b/>
-          <w:sz w:val="18"/>
+          <w:sz w:val="17"/>
         </w:rPr>
-        <w:t xml:space="preserve">• Empirical HCI Research Study: </w:t>
+        <w:t xml:space="preserve">• Filed Patent (South African Patent Office): </w:t>
       </w:r>
       <w:r>
         <w:rPr>
           <w:rFonts w:ascii="Calibri" w:hAnsi="Calibri"/>
-          <w:sz w:val="18"/>
+          <w:sz w:val="17"/>
         </w:rPr>
-        <w:t>AI-Driven Multilingual Adaptive UI Framework &amp; Zero-Risk Financial Sandbox — Designed dual-mode environment pairing live transactions with a simulated practice sandbox (dummy balances), in-situ Hold-to-Translate, and Circle-to-Understand gesture affordances to eliminate digital financial hesitation in emerging vernacular markets | 2026</w:t>
+        <w:t>AI-Powered Lost &amp; Found Matching System — Conceptualized 5-factor blind multimodal scoring architecture (image embeddings, NLP text, geolocation, timestamp) with automated urgency detection | 2025</w:t>
       </w:r>
     </w:p>
     <w:p>
       <w:pPr>
-        <w:spacing w:before="0" w:after="60" w:line="254" w:lineRule="auto"/>
+        <w:spacing w:before="0" w:after="40" w:line="252" w:lineRule="auto"/>
       </w:pPr>
       <w:r>
         <w:rPr>
           <w:rFonts w:ascii="Calibri" w:hAnsi="Calibri"/>
           <w:b/>
-          <w:sz w:val="18"/>
+          <w:sz w:val="17"/>
         </w:rPr>
-        <w:t xml:space="preserve">• Patent Filed (South African Patent Office): </w:t>
+        <w:t xml:space="preserve">• Published HCI Research Study: </w:t>
       </w:r>
       <w:r>
         <w:rPr>
           <w:rFonts w:ascii="Calibri" w:hAnsi="Calibri"/>
-          <w:sz w:val="18"/>
+          <w:sz w:val="17"/>
         </w:rPr>
-        <w:t>AI-Powered Lost &amp; Found Matching System — Conceptualized a 5-factor blind multimodal scoring architecture (image embeddings, NLP text, geolocation, timestamp) with automated urgency detection | 2025</w:t>
+        <w:t>AI-Driven Multilingual Adaptive UX Framework &amp; Zero-Risk Financial Sandbox — Designed dual-mode environment pairing live transactions with a simulated practice sandbox (dummy balances), in-situ Hold-to-Translate, and Circle-to-Understand gesture affordances | 2025</w:t>
       </w:r>
     </w:p>
     <w:p>
       <w:pPr>
-        <w:spacing w:before="100" w:after="40" w:line="254" w:lineRule="auto"/>
+        <w:spacing w:before="84" w:after="32" w:line="252" w:lineRule="auto"/>
         <w:pBdr>
           <w:bottom w:val="single" w:sz="6" w:space="1" w:color="D5D5CE"/>
         </w:pBdr>
@@ -515,54 +499,54 @@
           <w:rFonts w:ascii="Calibri" w:hAnsi="Calibri"/>
           <w:b/>
           <w:color w:val="121214"/>
-          <w:sz w:val="20"/>
+          <w:sz w:val="19"/>
         </w:rPr>
-        <w:t>HONORS &amp; COMPETITIONS</w:t>
+        <w:t>HONORS &amp; AWARDS</w:t>
       </w:r>
     </w:p>
     <w:p>
       <w:pPr>
-        <w:spacing w:before="30" w:after="16" w:line="254" w:lineRule="auto"/>
+        <w:spacing w:before="20" w:after="12" w:line="252" w:lineRule="auto"/>
       </w:pPr>
       <w:r>
         <w:rPr>
           <w:rFonts w:ascii="Calibri" w:hAnsi="Calibri"/>
           <w:b/>
-          <w:sz w:val="18"/>
+          <w:sz w:val="17"/>
         </w:rPr>
-        <w:t xml:space="preserve">• India Innovates Hackathon — National Finalist: </w:t>
+        <w:t xml:space="preserve">• Won National Finalist at India Innovates Hackathon: </w:t>
       </w:r>
       <w:r>
         <w:rPr>
           <w:rFonts w:ascii="Calibri" w:hAnsi="Calibri"/>
-          <w:sz w:val="18"/>
+          <w:sz w:val="17"/>
         </w:rPr>
-        <w:t>Selected among top finalist teams nationwide out of 6,000+ participating teams</w:t>
+        <w:t>Ranked among top finalist teams nationwide out of 6,000+ participating teams across India | 2024</w:t>
       </w:r>
     </w:p>
     <w:p>
       <w:pPr>
-        <w:spacing w:before="0" w:after="60" w:line="254" w:lineRule="auto"/>
+        <w:spacing w:before="0" w:after="40" w:line="252" w:lineRule="auto"/>
       </w:pPr>
       <w:r>
         <w:rPr>
           <w:rFonts w:ascii="Calibri" w:hAnsi="Calibri"/>
           <w:b/>
-          <w:sz w:val="18"/>
+          <w:sz w:val="17"/>
         </w:rPr>
-        <w:t xml:space="preserve">• GHCI 25 Hackathon — Round 2 Qualifier: </w:t>
+        <w:t xml:space="preserve">• Qualified for Round 2 in GHCI 25 National GenAI Hackathon: </w:t>
       </w:r>
       <w:r>
         <w:rPr>
           <w:rFonts w:ascii="Calibri" w:hAnsi="Calibri"/>
-          <w:sz w:val="18"/>
+          <w:sz w:val="17"/>
         </w:rPr>
-        <w:t>AnitaB.org India &amp; Backbase | National GenAI Hackathon: 'Unbound with GenAI: Breaking Barriers, Creating Impact'</w:t>
+        <w:t>AnitaB.org India &amp; Backbase | 'Unbound with GenAI: Breaking Barriers, Creating Impact' | 2025</w:t>
       </w:r>
     </w:p>
     <w:p>
       <w:pPr>
-        <w:spacing w:before="100" w:after="40" w:line="254" w:lineRule="auto"/>
+        <w:spacing w:before="84" w:after="32" w:line="252" w:lineRule="auto"/>
         <w:pBdr>
           <w:bottom w:val="single" w:sz="6" w:space="1" w:color="D5D5CE"/>
         </w:pBdr>
@@ -572,74 +556,94 @@
           <w:rFonts w:ascii="Calibri" w:hAnsi="Calibri"/>
           <w:b/>
           <w:color w:val="121214"/>
-          <w:sz w:val="20"/>
+          <w:sz w:val="19"/>
         </w:rPr>
-        <w:t>PRODUCT MANAGEMENT &amp; TECHNICAL SKILLS</w:t>
+        <w:t>SKILLS</w:t>
       </w:r>
     </w:p>
     <w:p>
       <w:pPr>
-        <w:spacing w:before="30" w:after="16" w:line="254" w:lineRule="auto"/>
+        <w:spacing w:before="20" w:after="12" w:line="252" w:lineRule="auto"/>
       </w:pPr>
       <w:r>
         <w:rPr>
           <w:rFonts w:ascii="Calibri" w:hAnsi="Calibri"/>
           <w:b/>
-          <w:sz w:val="18"/>
+          <w:sz w:val="17"/>
         </w:rPr>
         <w:t xml:space="preserve">• Product Management: </w:t>
       </w:r>
       <w:r>
         <w:rPr>
           <w:rFonts w:ascii="Calibri" w:hAnsi="Calibri"/>
-          <w:sz w:val="18"/>
+          <w:sz w:val="17"/>
         </w:rPr>
-        <w:t>Product Discovery, PRD Writing, Jobs-to-be-Done (JTBD), User Journey Mapping, RICE Prioritization, North Star &amp; Guardrail Metrics, Customer Interviews, Experimentation, GTM Strategy, Trade-off Analysis</w:t>
+        <w:t>Product Discovery, Product Requirements Document (PRD), Jobs-to-be-Done (JTBD), User Journey Mapping, RICE Prioritization, North Star &amp; Guardrail Metrics, Customer Interviews, Experimentation, Go-to-Market (GTM) Strategy, Trade-off Analysis, Figma</w:t>
       </w:r>
     </w:p>
     <w:p>
       <w:pPr>
-        <w:spacing w:before="0" w:after="16" w:line="254" w:lineRule="auto"/>
+        <w:spacing w:before="0" w:after="12" w:line="252" w:lineRule="auto"/>
       </w:pPr>
       <w:r>
         <w:rPr>
           <w:rFonts w:ascii="Calibri" w:hAnsi="Calibri"/>
           <w:b/>
-          <w:sz w:val="18"/>
+          <w:sz w:val="17"/>
         </w:rPr>
         <w:t xml:space="preserve">• AI &amp; Systems: </w:t>
       </w:r>
       <w:r>
         <w:rPr>
           <w:rFonts w:ascii="Calibri" w:hAnsi="Calibri"/>
-          <w:sz w:val="18"/>
+          <w:sz w:val="17"/>
         </w:rPr>
-        <w:t>LLM Prompt Engineering, RAG Architectures, Multimodal Ingestion, Deterministic SQL, AI Governance, Lovable.dev (Rapid MVPs), Supabase (RLS), Vector Embeddings</w:t>
+        <w:t>LLM Prompt Engineering, Retrieval-Augmented Generation (RAG), AI Governance, Vector Embeddings, Multimodal AI (Voice, Vision OCR), PostgreSQL Stored Procedures (RPC), REST APIs, High-Level Design (HLD)</w:t>
       </w:r>
     </w:p>
     <w:p>
       <w:pPr>
-        <w:spacing w:before="0" w:after="60" w:line="254" w:lineRule="auto"/>
+        <w:spacing w:before="0" w:after="12" w:line="252" w:lineRule="auto"/>
       </w:pPr>
       <w:r>
         <w:rPr>
           <w:rFonts w:ascii="Calibri" w:hAnsi="Calibri"/>
           <w:b/>
-          <w:sz w:val="18"/>
+          <w:sz w:val="17"/>
         </w:rPr>
-        <w:t xml:space="preserve">• Engineering &amp; Problem Solving: </w:t>
+        <w:t xml:space="preserve">• Technical &amp; Problem-Solving: </w:t>
       </w:r>
       <w:r>
         <w:rPr>
           <w:rFonts w:ascii="Calibri" w:hAnsi="Calibri"/>
-          <w:sz w:val="18"/>
+          <w:sz w:val="17"/>
         </w:rPr>
-        <w:t>Java, Spring Framework, Python, SQL/PostgreSQL, REST APIs, Git, System Architecture  •  Competitive Programming: 400+ LeetCode, 210+ GeeksforGeeks</w:t>
+        <w:t>Java, Spring Framework, Python, SQL/PostgreSQL, REST APIs, Git, LangChain, LangGraph, Rapid Prototyping (Lovable.dev)</w:t>
       </w:r>
     </w:p>
     <w:p>
       <w:pPr>
-        <w:spacing w:before="100" w:after="40" w:line="254" w:lineRule="auto"/>
+        <w:spacing w:before="0" w:after="40" w:line="252" w:lineRule="auto"/>
+      </w:pPr>
+      <w:r>
+        <w:rPr>
+          <w:rFonts w:ascii="Calibri" w:hAnsi="Calibri"/>
+          <w:b/>
+          <w:sz w:val="17"/>
+        </w:rPr>
+        <w:t xml:space="preserve">• DSA &amp; Competitive Programming: </w:t>
+      </w:r>
+      <w:r>
+        <w:rPr>
+          <w:rFonts w:ascii="Calibri" w:hAnsi="Calibri"/>
+          <w:sz w:val="17"/>
+        </w:rPr>
+        <w:t>610+ Solved Problems — 400+ LeetCode, 210+ GeeksforGeeks (Data Structures, Algorithms, Problem Solving)</w:t>
+      </w:r>
+    </w:p>
+    <w:p>
+      <w:pPr>
+        <w:spacing w:before="84" w:after="32" w:line="252" w:lineRule="auto"/>
         <w:pBdr>
           <w:bottom w:val="single" w:sz="6" w:space="1" w:color="D5D5CE"/>
         </w:pBdr>
@@ -649,26 +653,26 @@
           <w:rFonts w:ascii="Calibri" w:hAnsi="Calibri"/>
           <w:b/>
           <w:color w:val="121214"/>
-          <w:sz w:val="20"/>
+          <w:sz w:val="19"/>
         </w:rPr>
         <w:t>CERTIFICATIONS</w:t>
       </w:r>
     </w:p>
     <w:p>
       <w:pPr>
-        <w:spacing w:before="30" w:after="0" w:line="254" w:lineRule="auto"/>
+        <w:spacing w:before="20" w:after="0" w:line="252" w:lineRule="auto"/>
       </w:pPr>
       <w:r>
         <w:rPr>
           <w:rFonts w:ascii="Calibri" w:hAnsi="Calibri"/>
-          <w:sz w:val="18"/>
+          <w:sz w:val="17"/>
         </w:rPr>
-        <w:t>Product Management Masterclass (GeeksforGeeks)  •  AI Agents &amp; Automation (CampusX)  •  Advanced RAG Architecture (CampusX)  •  Prompt Engineering &amp; Docker for ML (CampusX)  •  Postman API Student Expert</w:t>
+        <w:t>Product Management Masterclass (GeeksforGeeks)  |  AI Agents &amp; Automation (CampusX)  |  Advanced RAG Architecture (CampusX)  |  Prompt Engineering &amp; Docker for ML (CampusX)</w:t>
       </w:r>
     </w:p>
     <w:sectPr>
       <w:pgSz w:w="12240" w:h="15840"/>
-      <w:pgMar w:top="547" w:right="648" w:bottom="547" w:left="648" w:header="720" w:footer="720" w:gutter="0"/>
+      <w:pgMar w:top="504" w:right="576" w:bottom="504" w:left="576" w:header="720" w:footer="720" w:gutter="0"/>
       <w:cols w:space="720"/>
       <w:docGrid w:linePitch="360"/>
     </w:sectPr>

</xml_diff>

<commit_message>
Update APM resume with 1-page layout, embedded logos, and sync to public portfolio
</commit_message>
<xml_diff>
--- a/Sohan_Gadewar_Google_APM_Resume.docx
+++ b/Sohan_Gadewar_Google_APM_Resume.docx
@@ -4,127 +4,309 @@
   <w:body>
     <w:p>
       <w:pPr>
-        <w:spacing w:before="0" w:after="16" w:line="252" w:lineRule="auto"/>
+        <w:spacing w:before="0" w:after="30" w:line="252" w:lineRule="auto"/>
         <w:jc w:val="center"/>
       </w:pPr>
       <w:r>
         <w:rPr>
           <w:rFonts w:ascii="Calibri" w:hAnsi="Calibri"/>
           <w:b/>
-          <w:color w:val="121214"/>
-          <w:sz w:val="31"/>
+          <w:color w:val="000000"/>
+          <w:sz w:val="35"/>
         </w:rPr>
         <w:t>SOHAN GADEWAR</w:t>
       </w:r>
     </w:p>
     <w:p>
       <w:pPr>
-        <w:spacing w:before="0" w:after="24" w:line="252" w:lineRule="auto"/>
+        <w:spacing w:before="0" w:after="64" w:line="252" w:lineRule="auto"/>
         <w:jc w:val="center"/>
       </w:pPr>
-      <w:r>
-        <w:rPr>
-          <w:rFonts w:ascii="Calibri" w:hAnsi="Calibri"/>
-          <w:b/>
-          <w:color w:val="1E1E23"/>
-          <w:sz w:val="18"/>
-        </w:rPr>
-        <w:t>Associate Product Manager | Product Builder | B.Tech IT, VIIT Pune (CGPA: 8.97 / 10.0)</w:t>
-      </w:r>
-    </w:p>
-    <w:p>
-      <w:pPr>
-        <w:spacing w:before="0" w:after="56" w:line="252" w:lineRule="auto"/>
-        <w:jc w:val="center"/>
-      </w:pPr>
-      <w:r>
-        <w:rPr>
-          <w:rFonts w:ascii="Calibri" w:hAnsi="Calibri"/>
-          <w:color w:val="46464B"/>
-          <w:sz w:val="17"/>
-        </w:rPr>
-        <w:t xml:space="preserve">Pune, India  |  +91 9022778561  |  </w:t>
-      </w:r>
       <w:hyperlink r:id="rId9">
         <w:r>
           <w:rPr>
             <w:rFonts w:ascii="Calibri" w:hAnsi="Calibri"/>
-            <w:sz w:val="17"/>
-            <w:color w:val="1D4ED8"/>
+            <w:sz w:val="16"/>
           </w:rPr>
-          <w:t xml:space="preserve">sohangadewar9022@gmail.com</w:t>
+          <w:drawing>
+            <wp:inline xmlns:a="http://schemas.openxmlformats.org/drawingml/2006/main" xmlns:pic="http://schemas.openxmlformats.org/drawingml/2006/picture">
+              <wp:extent cx="107950" cy="107950"/>
+              <wp:docPr id="1" name="Picture 1"/>
+              <wp:cNvGraphicFramePr>
+                <a:graphicFrameLocks noChangeAspect="1"/>
+              </wp:cNvGraphicFramePr>
+              <a:graphic>
+                <a:graphicData uri="http://schemas.openxmlformats.org/drawingml/2006/picture">
+                  <pic:pic>
+                    <pic:nvPicPr>
+                      <pic:cNvPr id="0" name="phone.png"/>
+                      <pic:cNvPicPr/>
+                    </pic:nvPicPr>
+                    <pic:blipFill>
+                      <a:blip r:embed="rId10"/>
+                      <a:stretch>
+                        <a:fillRect/>
+                      </a:stretch>
+                    </pic:blipFill>
+                    <pic:spPr>
+                      <a:xfrm>
+                        <a:off x="0" y="0"/>
+                        <a:ext cx="107950" cy="107950"/>
+                      </a:xfrm>
+                      <a:prstGeom prst="rect"/>
+                    </pic:spPr>
+                  </pic:pic>
+                </a:graphicData>
+              </a:graphic>
+            </wp:inline>
+          </w:drawing>
+        </w:r>
+        <w:r>
+          <w:rPr>
+            <w:rFonts w:ascii="Calibri" w:hAnsi="Calibri"/>
+            <w:sz w:val="16"/>
+            <w:color w:val="000000"/>
+          </w:rPr>
+          <w:t xml:space="preserve"> +91 9022778561</w:t>
         </w:r>
       </w:hyperlink>
       <w:r>
         <w:rPr>
           <w:rFonts w:ascii="Calibri" w:hAnsi="Calibri"/>
-          <w:color w:val="46464B"/>
-          <w:sz w:val="17"/>
+          <w:color w:val="94A3B8"/>
+          <w:sz w:val="16"/>
         </w:rPr>
-        <w:t xml:space="preserve">  |  </w:t>
+        <w:t xml:space="preserve">   •   </w:t>
       </w:r>
-      <w:hyperlink r:id="rId10">
+      <w:hyperlink r:id="rId11">
         <w:r>
           <w:rPr>
             <w:rFonts w:ascii="Calibri" w:hAnsi="Calibri"/>
-            <w:sz w:val="17"/>
+            <w:sz w:val="16"/>
+          </w:rPr>
+          <w:drawing>
+            <wp:inline xmlns:a="http://schemas.openxmlformats.org/drawingml/2006/main" xmlns:pic="http://schemas.openxmlformats.org/drawingml/2006/picture">
+              <wp:extent cx="107950" cy="107950"/>
+              <wp:docPr id="2" name="Picture 2"/>
+              <wp:cNvGraphicFramePr>
+                <a:graphicFrameLocks noChangeAspect="1"/>
+              </wp:cNvGraphicFramePr>
+              <a:graphic>
+                <a:graphicData uri="http://schemas.openxmlformats.org/drawingml/2006/picture">
+                  <pic:pic>
+                    <pic:nvPicPr>
+                      <pic:cNvPr id="0" name="gmail.png"/>
+                      <pic:cNvPicPr/>
+                    </pic:nvPicPr>
+                    <pic:blipFill>
+                      <a:blip r:embed="rId12"/>
+                      <a:stretch>
+                        <a:fillRect/>
+                      </a:stretch>
+                    </pic:blipFill>
+                    <pic:spPr>
+                      <a:xfrm>
+                        <a:off x="0" y="0"/>
+                        <a:ext cx="107950" cy="107950"/>
+                      </a:xfrm>
+                      <a:prstGeom prst="rect"/>
+                    </pic:spPr>
+                  </pic:pic>
+                </a:graphicData>
+              </a:graphic>
+            </wp:inline>
+          </w:drawing>
+        </w:r>
+        <w:r>
+          <w:rPr>
+            <w:rFonts w:ascii="Calibri" w:hAnsi="Calibri"/>
+            <w:sz w:val="16"/>
             <w:color w:val="1D4ED8"/>
-            <w:u w:val="single"/>
           </w:rPr>
-          <w:t xml:space="preserve">portfolio-sohan9022.vercel.app</w:t>
+          <w:t xml:space="preserve"> sohangadewar9022@gmail.com</w:t>
         </w:r>
       </w:hyperlink>
       <w:r>
         <w:rPr>
           <w:rFonts w:ascii="Calibri" w:hAnsi="Calibri"/>
-          <w:color w:val="46464B"/>
-          <w:sz w:val="17"/>
+          <w:color w:val="94A3B8"/>
+          <w:sz w:val="16"/>
         </w:rPr>
-        <w:t xml:space="preserve">  |  </w:t>
+        <w:t xml:space="preserve">   •   </w:t>
       </w:r>
-      <w:hyperlink r:id="rId11">
+      <w:hyperlink r:id="rId13">
         <w:r>
           <w:rPr>
             <w:rFonts w:ascii="Calibri" w:hAnsi="Calibri"/>
-            <w:sz w:val="17"/>
+            <w:sz w:val="16"/>
+          </w:rPr>
+          <w:drawing>
+            <wp:inline xmlns:a="http://schemas.openxmlformats.org/drawingml/2006/main" xmlns:pic="http://schemas.openxmlformats.org/drawingml/2006/picture">
+              <wp:extent cx="107950" cy="107950"/>
+              <wp:docPr id="3" name="Picture 3"/>
+              <wp:cNvGraphicFramePr>
+                <a:graphicFrameLocks noChangeAspect="1"/>
+              </wp:cNvGraphicFramePr>
+              <a:graphic>
+                <a:graphicData uri="http://schemas.openxmlformats.org/drawingml/2006/picture">
+                  <pic:pic>
+                    <pic:nvPicPr>
+                      <pic:cNvPr id="0" name="globe.png"/>
+                      <pic:cNvPicPr/>
+                    </pic:nvPicPr>
+                    <pic:blipFill>
+                      <a:blip r:embed="rId14"/>
+                      <a:stretch>
+                        <a:fillRect/>
+                      </a:stretch>
+                    </pic:blipFill>
+                    <pic:spPr>
+                      <a:xfrm>
+                        <a:off x="0" y="0"/>
+                        <a:ext cx="107950" cy="107950"/>
+                      </a:xfrm>
+                      <a:prstGeom prst="rect"/>
+                    </pic:spPr>
+                  </pic:pic>
+                </a:graphicData>
+              </a:graphic>
+            </wp:inline>
+          </w:drawing>
+        </w:r>
+        <w:r>
+          <w:rPr>
+            <w:rFonts w:ascii="Calibri" w:hAnsi="Calibri"/>
+            <w:sz w:val="16"/>
             <w:color w:val="1D4ED8"/>
-            <w:u w:val="single"/>
           </w:rPr>
-          <w:t xml:space="preserve">linkedin.com/in/sohangadewar</w:t>
+          <w:t xml:space="preserve"> Portfolio</w:t>
         </w:r>
       </w:hyperlink>
       <w:r>
         <w:rPr>
           <w:rFonts w:ascii="Calibri" w:hAnsi="Calibri"/>
-          <w:color w:val="46464B"/>
-          <w:sz w:val="17"/>
+          <w:color w:val="94A3B8"/>
+          <w:sz w:val="16"/>
         </w:rPr>
-        <w:t xml:space="preserve">  |  </w:t>
+        <w:t xml:space="preserve">   •   </w:t>
       </w:r>
-      <w:hyperlink r:id="rId12">
+      <w:hyperlink r:id="rId15">
         <w:r>
           <w:rPr>
             <w:rFonts w:ascii="Calibri" w:hAnsi="Calibri"/>
-            <w:sz w:val="17"/>
+            <w:sz w:val="16"/>
+          </w:rPr>
+          <w:drawing>
+            <wp:inline xmlns:a="http://schemas.openxmlformats.org/drawingml/2006/main" xmlns:pic="http://schemas.openxmlformats.org/drawingml/2006/picture">
+              <wp:extent cx="107950" cy="107950"/>
+              <wp:docPr id="4" name="Picture 4"/>
+              <wp:cNvGraphicFramePr>
+                <a:graphicFrameLocks noChangeAspect="1"/>
+              </wp:cNvGraphicFramePr>
+              <a:graphic>
+                <a:graphicData uri="http://schemas.openxmlformats.org/drawingml/2006/picture">
+                  <pic:pic>
+                    <pic:nvPicPr>
+                      <pic:cNvPr id="0" name="linkedin.png"/>
+                      <pic:cNvPicPr/>
+                    </pic:nvPicPr>
+                    <pic:blipFill>
+                      <a:blip r:embed="rId16"/>
+                      <a:stretch>
+                        <a:fillRect/>
+                      </a:stretch>
+                    </pic:blipFill>
+                    <pic:spPr>
+                      <a:xfrm>
+                        <a:off x="0" y="0"/>
+                        <a:ext cx="107950" cy="107950"/>
+                      </a:xfrm>
+                      <a:prstGeom prst="rect"/>
+                    </pic:spPr>
+                  </pic:pic>
+                </a:graphicData>
+              </a:graphic>
+            </wp:inline>
+          </w:drawing>
+        </w:r>
+        <w:r>
+          <w:rPr>
+            <w:rFonts w:ascii="Calibri" w:hAnsi="Calibri"/>
+            <w:sz w:val="16"/>
             <w:color w:val="1D4ED8"/>
-            <w:u w:val="single"/>
           </w:rPr>
-          <w:t xml:space="preserve">github.com/Sohan9022</w:t>
+          <w:t xml:space="preserve"> LinkedIn</w:t>
+        </w:r>
+      </w:hyperlink>
+      <w:r>
+        <w:rPr>
+          <w:rFonts w:ascii="Calibri" w:hAnsi="Calibri"/>
+          <w:color w:val="94A3B8"/>
+          <w:sz w:val="16"/>
+        </w:rPr>
+        <w:t xml:space="preserve">   •   </w:t>
+      </w:r>
+      <w:hyperlink r:id="rId17">
+        <w:r>
+          <w:rPr>
+            <w:rFonts w:ascii="Calibri" w:hAnsi="Calibri"/>
+            <w:sz w:val="16"/>
+          </w:rPr>
+          <w:drawing>
+            <wp:inline xmlns:a="http://schemas.openxmlformats.org/drawingml/2006/main" xmlns:pic="http://schemas.openxmlformats.org/drawingml/2006/picture">
+              <wp:extent cx="107950" cy="107950"/>
+              <wp:docPr id="5" name="Picture 5"/>
+              <wp:cNvGraphicFramePr>
+                <a:graphicFrameLocks noChangeAspect="1"/>
+              </wp:cNvGraphicFramePr>
+              <a:graphic>
+                <a:graphicData uri="http://schemas.openxmlformats.org/drawingml/2006/picture">
+                  <pic:pic>
+                    <pic:nvPicPr>
+                      <pic:cNvPr id="0" name="github.png"/>
+                      <pic:cNvPicPr/>
+                    </pic:nvPicPr>
+                    <pic:blipFill>
+                      <a:blip r:embed="rId18"/>
+                      <a:stretch>
+                        <a:fillRect/>
+                      </a:stretch>
+                    </pic:blipFill>
+                    <pic:spPr>
+                      <a:xfrm>
+                        <a:off x="0" y="0"/>
+                        <a:ext cx="107950" cy="107950"/>
+                      </a:xfrm>
+                      <a:prstGeom prst="rect"/>
+                    </pic:spPr>
+                  </pic:pic>
+                </a:graphicData>
+              </a:graphic>
+            </wp:inline>
+          </w:drawing>
+        </w:r>
+        <w:r>
+          <w:rPr>
+            <w:rFonts w:ascii="Calibri" w:hAnsi="Calibri"/>
+            <w:sz w:val="16"/>
+            <w:color w:val="1D4ED8"/>
+          </w:rPr>
+          <w:t xml:space="preserve"> GitHub</w:t>
         </w:r>
       </w:hyperlink>
     </w:p>
     <w:p>
       <w:pPr>
-        <w:spacing w:before="84" w:after="32" w:line="252" w:lineRule="auto"/>
+        <w:spacing w:before="104" w:after="40" w:line="252" w:lineRule="auto"/>
         <w:pBdr>
-          <w:bottom w:val="single" w:sz="6" w:space="1" w:color="D5D5CE"/>
+          <w:bottom w:val="single" w:sz="6" w:space="2" w:color="94A3B8"/>
         </w:pBdr>
       </w:pPr>
       <w:r>
         <w:rPr>
           <w:rFonts w:ascii="Calibri" w:hAnsi="Calibri"/>
           <w:b/>
-          <w:color w:val="121214"/>
+          <w:color w:val="000000"/>
           <w:sz w:val="19"/>
         </w:rPr>
         <w:t>PROFILE SUMMARY</w:t>
@@ -132,29 +314,29 @@
     </w:p>
     <w:p>
       <w:pPr>
-        <w:spacing w:before="10" w:after="50" w:line="252" w:lineRule="auto"/>
+        <w:spacing w:before="10" w:after="44" w:line="252" w:lineRule="auto"/>
       </w:pPr>
       <w:r>
         <w:rPr>
           <w:rFonts w:ascii="Calibri" w:hAnsi="Calibri"/>
-          <w:color w:val="28282D"/>
+          <w:color w:val="000000"/>
           <w:sz w:val="17"/>
         </w:rPr>
-        <w:t>Associate Product Manager candidate and 0-to-1 product builder combining strong software foundations (CGPA: 8.97/10.0) with rapid execution. Experienced in scoping comprehensive PRDs, conducting user research, and deploying AI-driven systems with deterministic architectures that eliminate cognitive fatigue.</w:t>
+        <w:t>Technical product builder combining strong software engineering foundations with user-centric 0-to-1 execution. Proven track record of conducting user research, framing product theses, and scoping comprehensive PRDs for AI-driven systems. Skilled at balancing technical feasibility with intuitive design to build deterministic architectures that eliminate workflow friction and earn user trust.</w:t>
       </w:r>
     </w:p>
     <w:p>
       <w:pPr>
-        <w:spacing w:before="84" w:after="32" w:line="252" w:lineRule="auto"/>
+        <w:spacing w:before="104" w:after="40" w:line="252" w:lineRule="auto"/>
         <w:pBdr>
-          <w:bottom w:val="single" w:sz="6" w:space="1" w:color="D5D5CE"/>
+          <w:bottom w:val="single" w:sz="6" w:space="2" w:color="94A3B8"/>
         </w:pBdr>
       </w:pPr>
       <w:r>
         <w:rPr>
           <w:rFonts w:ascii="Calibri" w:hAnsi="Calibri"/>
           <w:b/>
-          <w:color w:val="121214"/>
+          <w:color w:val="000000"/>
           <w:sz w:val="19"/>
         </w:rPr>
         <w:t>EDUCATION</w:t>
@@ -162,12 +344,16 @@
     </w:p>
     <w:p>
       <w:pPr>
-        <w:spacing w:before="10" w:after="10" w:line="252" w:lineRule="auto"/>
+        <w:tabs>
+          <w:tab w:pos="10973" w:val="right"/>
+        </w:tabs>
+        <w:spacing w:before="10" w:after="8" w:line="252" w:lineRule="auto"/>
       </w:pPr>
       <w:r>
         <w:rPr>
           <w:rFonts w:ascii="Calibri" w:hAnsi="Calibri"/>
           <w:b/>
+          <w:color w:val="000000"/>
           <w:sz w:val="18"/>
         </w:rPr>
         <w:t>Vishwakarma Institute of Information Technology (VIIT), Pune</w:t>
@@ -175,141 +361,34 @@
       <w:r>
         <w:rPr>
           <w:rFonts w:ascii="Calibri" w:hAnsi="Calibri"/>
-          <w:sz w:val="18"/>
+          <w:b/>
+          <w:color w:val="000000"/>
+          <w:sz w:val="17"/>
         </w:rPr>
-        <w:t xml:space="preserve">  |  Bachelor of Technology in Information Technology</w:t>
+        <w:tab/>
+        <w:t>2023 – 2027</w:t>
+      </w:r>
+    </w:p>
+    <w:p>
+      <w:pPr>
+        <w:spacing w:before="0" w:after="8" w:line="252" w:lineRule="auto"/>
+      </w:pPr>
+      <w:r>
+        <w:rPr>
+          <w:rFonts w:ascii="Calibri" w:hAnsi="Calibri"/>
+          <w:color w:val="000000"/>
+          <w:sz w:val="17"/>
+        </w:rPr>
+        <w:t xml:space="preserve">Bachelor of Technology in Information Technology  |  </w:t>
       </w:r>
       <w:r>
         <w:rPr>
           <w:rFonts w:ascii="Calibri" w:hAnsi="Calibri"/>
           <w:b/>
-          <w:sz w:val="18"/>
-        </w:rPr>
-        <w:t xml:space="preserve">  |  2023 – 2027 (Expected)  |  CGPA: 8.97 / 10.0</w:t>
-      </w:r>
-    </w:p>
-    <w:p>
-      <w:pPr>
-        <w:spacing w:before="0" w:after="48" w:line="252" w:lineRule="auto"/>
-      </w:pPr>
-      <w:r>
-        <w:rPr>
-          <w:rFonts w:ascii="Calibri" w:hAnsi="Calibri"/>
-          <w:color w:val="3C3C41"/>
+          <w:color w:val="000000"/>
           <w:sz w:val="17"/>
         </w:rPr>
-        <w:t>Relevant Coursework: Data Structures &amp; Algorithms (DSA), Database Management Systems (DBMS), Operating Systems, Computer Networks, System Design, Object-Oriented Programming (OOP)</w:t>
-      </w:r>
-    </w:p>
-    <w:p>
-      <w:pPr>
-        <w:spacing w:before="84" w:after="32" w:line="252" w:lineRule="auto"/>
-        <w:pBdr>
-          <w:bottom w:val="single" w:sz="6" w:space="1" w:color="D5D5CE"/>
-        </w:pBdr>
-      </w:pPr>
-      <w:r>
-        <w:rPr>
-          <w:rFonts w:ascii="Calibri" w:hAnsi="Calibri"/>
-          <w:b/>
-          <w:color w:val="121214"/>
-          <w:sz w:val="19"/>
-        </w:rPr>
-        <w:t>WORK EXPERIENCE &amp; PROJECTS</w:t>
-      </w:r>
-    </w:p>
-    <w:p>
-      <w:pPr>
-        <w:spacing w:before="30" w:after="10" w:line="252" w:lineRule="auto"/>
-      </w:pPr>
-      <w:r>
-        <w:rPr>
-          <w:rFonts w:ascii="Calibri" w:hAnsi="Calibri"/>
-          <w:b/>
-          <w:sz w:val="18"/>
-        </w:rPr>
-        <w:t>Project Sentinel — AI Decision Memory &amp; State-Drift Agent  |  Enterprise AI Product  |  2024 – 2025</w:t>
-      </w:r>
-    </w:p>
-    <w:p>
-      <w:pPr>
-        <w:spacing w:before="0" w:after="14" w:line="252" w:lineRule="auto"/>
-      </w:pPr>
-      <w:r>
-        <w:rPr>
-          <w:rFonts w:ascii="Calibri" w:hAnsi="Calibri"/>
-          <w:b/>
-          <w:sz w:val="17"/>
-        </w:rPr>
-        <w:t xml:space="preserve">Interactive Prototype: </w:t>
-      </w:r>
-      <w:hyperlink r:id="rId13">
-        <w:r>
-          <w:rPr>
-            <w:rFonts w:ascii="Calibri" w:hAnsi="Calibri"/>
-            <w:sz w:val="17"/>
-            <w:color w:val="1D4ED8"/>
-            <w:u w:val="single"/>
-            <w:b/>
-          </w:rPr>
-          <w:t xml:space="preserve">echo-sentinel-08.lovable.app</w:t>
-        </w:r>
-      </w:hyperlink>
-      <w:r>
-        <w:rPr>
-          <w:rFonts w:ascii="Calibri" w:hAnsi="Calibri"/>
-          <w:b/>
-          <w:sz w:val="17"/>
-        </w:rPr>
-        <w:t xml:space="preserve">  |  PRD Specification: </w:t>
-      </w:r>
-      <w:hyperlink r:id="rId14">
-        <w:r>
-          <w:rPr>
-            <w:rFonts w:ascii="Calibri" w:hAnsi="Calibri"/>
-            <w:sz w:val="17"/>
-            <w:color w:val="1D4ED8"/>
-            <w:u w:val="single"/>
-            <w:b/>
-          </w:rPr>
-          <w:t xml:space="preserve">Notion PRD</w:t>
-        </w:r>
-      </w:hyperlink>
-    </w:p>
-    <w:p>
-      <w:pPr>
-        <w:spacing w:before="0" w:after="12" w:line="252" w:lineRule="auto"/>
-      </w:pPr>
-      <w:r>
-        <w:rPr>
-          <w:rFonts w:ascii="Calibri" w:hAnsi="Calibri"/>
-          <w:sz w:val="17"/>
-        </w:rPr>
-        <w:t>• Spearheaded product discovery across standups, Slack, and Jira, identifying critical context loss and finding that unprompted bot summaries cause an 80%+ uninstall rate by interrupting deep developer focus.</w:t>
-      </w:r>
-    </w:p>
-    <w:p>
-      <w:pPr>
-        <w:spacing w:before="0" w:after="12" w:line="252" w:lineRule="auto"/>
-      </w:pPr>
-      <w:r>
-        <w:rPr>
-          <w:rFonts w:ascii="Calibri" w:hAnsi="Calibri"/>
-          <w:sz w:val="17"/>
-        </w:rPr>
-        <w:t>• Formulated the "Silent-by-Default" product thesis, passively ingesting audio transcripts and commit streams without channel spam while deliberately scoping out employee surveillance features in V1.</w:t>
-      </w:r>
-    </w:p>
-    <w:p>
-      <w:pPr>
-        <w:spacing w:before="0" w:after="12" w:line="252" w:lineRule="auto"/>
-      </w:pPr>
-      <w:r>
-        <w:rPr>
-          <w:rFonts w:ascii="Calibri" w:hAnsi="Calibri"/>
-          <w:sz w:val="17"/>
-        </w:rPr>
-        <w:t>• Architected deterministic audit engine powered by append-only PostgreSQL schemas, surfacing discrepancies between spoken commitments and recorded codebase state strictly upon explicit user queries.</w:t>
+        <w:t>CGPA: 8.97 / 10.0 (Pursuing)</w:t>
       </w:r>
     </w:p>
     <w:p>
@@ -319,266 +398,49 @@
       <w:r>
         <w:rPr>
           <w:rFonts w:ascii="Calibri" w:hAnsi="Calibri"/>
+          <w:color w:val="000000"/>
           <w:sz w:val="17"/>
         </w:rPr>
-        <w:t>• Shipped interactive 8-step clickable MVP on Lovable with live drift queries; authored comprehensive 400-line Notion PRD detailing state transition matrices, query grammar, and phased enterprise rollout.</w:t>
+        <w:t>Relevant Coursework: Data Structures &amp; Algorithms (DSA), Database Management Systems (DBMS), Operating Systems, Computer Networks, System Design, Object-Oriented Programming (OOP)</w:t>
       </w:r>
     </w:p>
     <w:p>
       <w:pPr>
-        <w:spacing w:before="30" w:after="10" w:line="252" w:lineRule="auto"/>
-      </w:pPr>
-      <w:r>
-        <w:rPr>
-          <w:rFonts w:ascii="Calibri" w:hAnsi="Calibri"/>
-          <w:b/>
-          <w:sz w:val="18"/>
-        </w:rPr>
-        <w:t>FinMate AI — Conversational Expense Memory &amp; Deterministic Accounting  |  FinTech Systems  |  2024 – 2025</w:t>
-      </w:r>
-    </w:p>
-    <w:p>
-      <w:pPr>
-        <w:spacing w:before="0" w:after="14" w:line="252" w:lineRule="auto"/>
-      </w:pPr>
-      <w:r>
-        <w:rPr>
-          <w:rFonts w:ascii="Calibri" w:hAnsi="Calibri"/>
-          <w:b/>
-          <w:sz w:val="17"/>
-        </w:rPr>
-        <w:t xml:space="preserve">Live Production MVP: </w:t>
-      </w:r>
-      <w:hyperlink r:id="rId15">
-        <w:r>
-          <w:rPr>
-            <w:rFonts w:ascii="Calibri" w:hAnsi="Calibri"/>
-            <w:sz w:val="17"/>
-            <w:color w:val="1D4ED8"/>
-            <w:u w:val="single"/>
-            <w:b/>
-          </w:rPr>
-          <w:t xml:space="preserve">tell-finmate-ai.lovable.app</w:t>
-        </w:r>
-      </w:hyperlink>
-      <w:r>
-        <w:rPr>
-          <w:rFonts w:ascii="Calibri" w:hAnsi="Calibri"/>
-          <w:b/>
-          <w:sz w:val="17"/>
-        </w:rPr>
-        <w:t xml:space="preserve">  |  Architecture &amp; PRD: </w:t>
-      </w:r>
-      <w:hyperlink r:id="rId16">
-        <w:r>
-          <w:rPr>
-            <w:rFonts w:ascii="Calibri" w:hAnsi="Calibri"/>
-            <w:sz w:val="17"/>
-            <w:color w:val="1D4ED8"/>
-            <w:u w:val="single"/>
-            <w:b/>
-          </w:rPr>
-          <w:t xml:space="preserve">Notion PRD</w:t>
-        </w:r>
-      </w:hyperlink>
-    </w:p>
-    <w:p>
-      <w:pPr>
-        <w:spacing w:before="0" w:after="12" w:line="252" w:lineRule="auto"/>
-      </w:pPr>
-      <w:r>
-        <w:rPr>
-          <w:rFonts w:ascii="Calibri" w:hAnsi="Calibri"/>
-          <w:sz w:val="17"/>
-        </w:rPr>
-        <w:t>• Uncovered key user friction in expense tracking where tedious 6-field forms trigger 70% onboarding drop-off, while identifying that pure LLM bots hallucinate arithmetic totals, destroying financial trust.</w:t>
-      </w:r>
-    </w:p>
-    <w:p>
-      <w:pPr>
-        <w:spacing w:before="0" w:after="12" w:line="252" w:lineRule="auto"/>
-      </w:pPr>
-      <w:r>
-        <w:rPr>
-          <w:rFonts w:ascii="Calibri" w:hAnsi="Calibri"/>
-          <w:sz w:val="17"/>
-        </w:rPr>
-        <w:t>• Engineered two-stage decoupled architecture directing multimodal LLMs (voice notes, OCR receipts, chat) to extract structured JSON intents and entities, while routing 100% of arithmetic calculations to concurrency-safe PostgreSQL stored procedures (RPCs).</w:t>
-      </w:r>
-    </w:p>
-    <w:p>
-      <w:pPr>
-        <w:spacing w:before="0" w:after="12" w:line="252" w:lineRule="auto"/>
-      </w:pPr>
-      <w:r>
-        <w:rPr>
-          <w:rFonts w:ascii="Calibri" w:hAnsi="Calibri"/>
-          <w:sz w:val="17"/>
-        </w:rPr>
-        <w:t>• Enforced complete financial auditability through evidence-linked ledger rows, guaranteeing clickable citations for every response and eliminating arithmetic discrepancies.</w:t>
-      </w:r>
-    </w:p>
-    <w:p>
-      <w:pPr>
-        <w:spacing w:before="0" w:after="44" w:line="252" w:lineRule="auto"/>
-      </w:pPr>
-      <w:r>
-        <w:rPr>
-          <w:rFonts w:ascii="Calibri" w:hAnsi="Calibri"/>
-          <w:sz w:val="17"/>
-        </w:rPr>
-        <w:t>• Deployed production-ready MVP on Lovable with streaming voice transcription and informal loan tracking; authored complete PRD covering database schemas, Row-Level Security (RLS) policies, and error handling.</w:t>
-      </w:r>
-    </w:p>
-    <w:p>
-      <w:pPr>
-        <w:spacing w:before="84" w:after="32" w:line="252" w:lineRule="auto"/>
+        <w:spacing w:before="104" w:after="40" w:line="252" w:lineRule="auto"/>
         <w:pBdr>
-          <w:bottom w:val="single" w:sz="6" w:space="1" w:color="D5D5CE"/>
+          <w:bottom w:val="single" w:sz="6" w:space="2" w:color="94A3B8"/>
         </w:pBdr>
       </w:pPr>
       <w:r>
         <w:rPr>
           <w:rFonts w:ascii="Calibri" w:hAnsi="Calibri"/>
           <w:b/>
-          <w:color w:val="121214"/>
+          <w:color w:val="000000"/>
           <w:sz w:val="19"/>
         </w:rPr>
-        <w:t>PATENTS &amp; RESEARCH</w:t>
+        <w:t>WORK EXPERIENCE &amp; PROJECTS</w:t>
       </w:r>
     </w:p>
     <w:p>
       <w:pPr>
-        <w:spacing w:before="20" w:after="12" w:line="252" w:lineRule="auto"/>
+        <w:spacing w:before="28" w:after="6" w:line="252" w:lineRule="auto"/>
       </w:pPr>
       <w:r>
         <w:rPr>
           <w:rFonts w:ascii="Calibri" w:hAnsi="Calibri"/>
           <w:b/>
-          <w:sz w:val="17"/>
+          <w:color w:val="000000"/>
+          <w:sz w:val="18"/>
         </w:rPr>
-        <w:t xml:space="preserve">• Filed Patent (South African Patent Office): </w:t>
+        <w:t>Project Sentinel — AI Decision Memory &amp; State-Drift Agent</w:t>
       </w:r>
       <w:r>
         <w:rPr>
           <w:rFonts w:ascii="Calibri" w:hAnsi="Calibri"/>
+          <w:color w:val="000000"/>
           <w:sz w:val="17"/>
         </w:rPr>
-        <w:t>AI-Powered Lost &amp; Found Matching System — Conceptualized 5-factor blind multimodal scoring architecture (image embeddings, NLP text, geolocation, timestamp) with automated urgency detection | 2025</w:t>
-      </w:r>
-    </w:p>
-    <w:p>
-      <w:pPr>
-        <w:spacing w:before="0" w:after="40" w:line="252" w:lineRule="auto"/>
-      </w:pPr>
-      <w:r>
-        <w:rPr>
-          <w:rFonts w:ascii="Calibri" w:hAnsi="Calibri"/>
-          <w:b/>
-          <w:sz w:val="17"/>
-        </w:rPr>
-        <w:t xml:space="preserve">• Published HCI Research Study: </w:t>
-      </w:r>
-      <w:r>
-        <w:rPr>
-          <w:rFonts w:ascii="Calibri" w:hAnsi="Calibri"/>
-          <w:sz w:val="17"/>
-        </w:rPr>
-        <w:t>AI-Driven Multilingual Adaptive UX Framework &amp; Zero-Risk Financial Sandbox — Designed dual-mode environment pairing live transactions with a simulated practice sandbox (dummy balances), in-situ Hold-to-Translate, and Circle-to-Understand gesture affordances | 2025</w:t>
-      </w:r>
-    </w:p>
-    <w:p>
-      <w:pPr>
-        <w:spacing w:before="84" w:after="32" w:line="252" w:lineRule="auto"/>
-        <w:pBdr>
-          <w:bottom w:val="single" w:sz="6" w:space="1" w:color="D5D5CE"/>
-        </w:pBdr>
-      </w:pPr>
-      <w:r>
-        <w:rPr>
-          <w:rFonts w:ascii="Calibri" w:hAnsi="Calibri"/>
-          <w:b/>
-          <w:color w:val="121214"/>
-          <w:sz w:val="19"/>
-        </w:rPr>
-        <w:t>HONORS &amp; AWARDS</w:t>
-      </w:r>
-    </w:p>
-    <w:p>
-      <w:pPr>
-        <w:spacing w:before="20" w:after="12" w:line="252" w:lineRule="auto"/>
-      </w:pPr>
-      <w:r>
-        <w:rPr>
-          <w:rFonts w:ascii="Calibri" w:hAnsi="Calibri"/>
-          <w:b/>
-          <w:sz w:val="17"/>
-        </w:rPr>
-        <w:t xml:space="preserve">• Won National Finalist at India Innovates Hackathon: </w:t>
-      </w:r>
-      <w:r>
-        <w:rPr>
-          <w:rFonts w:ascii="Calibri" w:hAnsi="Calibri"/>
-          <w:sz w:val="17"/>
-        </w:rPr>
-        <w:t>Ranked among top finalist teams nationwide out of 6,000+ participating teams across India | 2024</w:t>
-      </w:r>
-    </w:p>
-    <w:p>
-      <w:pPr>
-        <w:spacing w:before="0" w:after="40" w:line="252" w:lineRule="auto"/>
-      </w:pPr>
-      <w:r>
-        <w:rPr>
-          <w:rFonts w:ascii="Calibri" w:hAnsi="Calibri"/>
-          <w:b/>
-          <w:sz w:val="17"/>
-        </w:rPr>
-        <w:t xml:space="preserve">• Qualified for Round 2 in GHCI 25 National GenAI Hackathon: </w:t>
-      </w:r>
-      <w:r>
-        <w:rPr>
-          <w:rFonts w:ascii="Calibri" w:hAnsi="Calibri"/>
-          <w:sz w:val="17"/>
-        </w:rPr>
-        <w:t>AnitaB.org India &amp; Backbase | 'Unbound with GenAI: Breaking Barriers, Creating Impact' | 2025</w:t>
-      </w:r>
-    </w:p>
-    <w:p>
-      <w:pPr>
-        <w:spacing w:before="84" w:after="32" w:line="252" w:lineRule="auto"/>
-        <w:pBdr>
-          <w:bottom w:val="single" w:sz="6" w:space="1" w:color="D5D5CE"/>
-        </w:pBdr>
-      </w:pPr>
-      <w:r>
-        <w:rPr>
-          <w:rFonts w:ascii="Calibri" w:hAnsi="Calibri"/>
-          <w:b/>
-          <w:color w:val="121214"/>
-          <w:sz w:val="19"/>
-        </w:rPr>
-        <w:t>SKILLS</w:t>
-      </w:r>
-    </w:p>
-    <w:p>
-      <w:pPr>
-        <w:spacing w:before="20" w:after="12" w:line="252" w:lineRule="auto"/>
-      </w:pPr>
-      <w:r>
-        <w:rPr>
-          <w:rFonts w:ascii="Calibri" w:hAnsi="Calibri"/>
-          <w:b/>
-          <w:sz w:val="17"/>
-        </w:rPr>
-        <w:t xml:space="preserve">• Product Management: </w:t>
-      </w:r>
-      <w:r>
-        <w:rPr>
-          <w:rFonts w:ascii="Calibri" w:hAnsi="Calibri"/>
-          <w:sz w:val="17"/>
-        </w:rPr>
-        <w:t>Product Discovery, Product Requirements Document (PRD), Jobs-to-be-Done (JTBD), User Journey Mapping, RICE Prioritization, North Star &amp; Guardrail Metrics, Customer Interviews, Experimentation, Go-to-Market (GTM) Strategy, Trade-off Analysis, Figma</w:t>
+        <w:t xml:space="preserve">  |  Enterprise AI Product</w:t>
       </w:r>
     </w:p>
     <w:p>
@@ -589,16 +451,206 @@
         <w:rPr>
           <w:rFonts w:ascii="Calibri" w:hAnsi="Calibri"/>
           <w:b/>
+          <w:color w:val="000000"/>
           <w:sz w:val="17"/>
         </w:rPr>
-        <w:t xml:space="preserve">• AI &amp; Systems: </w:t>
+        <w:t xml:space="preserve">Interactive Prototype: </w:t>
+      </w:r>
+      <w:hyperlink r:id="rId19">
+        <w:r>
+          <w:rPr>
+            <w:rFonts w:ascii="Calibri" w:hAnsi="Calibri"/>
+            <w:sz w:val="17"/>
+            <w:color w:val="1D4ED8"/>
+            <w:u w:val="single"/>
+          </w:rPr>
+          <w:t xml:space="preserve">echo-sentinel-08.lovable.app</w:t>
+        </w:r>
+      </w:hyperlink>
+      <w:r>
+        <w:rPr>
+          <w:rFonts w:ascii="Calibri" w:hAnsi="Calibri"/>
+          <w:b/>
+          <w:color w:val="000000"/>
+          <w:sz w:val="17"/>
+        </w:rPr>
+        <w:t xml:space="preserve">   |   PRD Specification: </w:t>
+      </w:r>
+      <w:hyperlink r:id="rId20">
+        <w:r>
+          <w:rPr>
+            <w:rFonts w:ascii="Calibri" w:hAnsi="Calibri"/>
+            <w:sz w:val="17"/>
+            <w:color w:val="1D4ED8"/>
+            <w:u w:val="single"/>
+          </w:rPr>
+          <w:t xml:space="preserve">Notion PRD</w:t>
+        </w:r>
+      </w:hyperlink>
+    </w:p>
+    <w:p>
+      <w:pPr>
+        <w:spacing w:before="0" w:after="12" w:line="252" w:lineRule="auto"/>
+        <w:ind w:left="230" w:hanging="230"/>
+      </w:pPr>
+      <w:r>
+        <w:rPr>
+          <w:rFonts w:ascii="Calibri" w:hAnsi="Calibri"/>
+          <w:b/>
+          <w:color w:val="000000"/>
+          <w:sz w:val="17"/>
+        </w:rPr>
+        <w:t xml:space="preserve">• </w:t>
       </w:r>
       <w:r>
         <w:rPr>
           <w:rFonts w:ascii="Calibri" w:hAnsi="Calibri"/>
+          <w:color w:val="000000"/>
           <w:sz w:val="17"/>
         </w:rPr>
-        <w:t>LLM Prompt Engineering, Retrieval-Augmented Generation (RAG), AI Governance, Vector Embeddings, Multimodal AI (Voice, Vision OCR), PostgreSQL Stored Procedures (RPC), REST APIs, High-Level Design (HLD)</w:t>
+        <w:t>Spearheaded product discovery across engineering standups, Slack, and Jira, identifying critical context loss and finding that unprompted bot summaries cause heavy distraction by interrupting developer focus.</w:t>
+      </w:r>
+    </w:p>
+    <w:p>
+      <w:pPr>
+        <w:spacing w:before="0" w:after="12" w:line="252" w:lineRule="auto"/>
+        <w:ind w:left="230" w:hanging="230"/>
+      </w:pPr>
+      <w:r>
+        <w:rPr>
+          <w:rFonts w:ascii="Calibri" w:hAnsi="Calibri"/>
+          <w:b/>
+          <w:color w:val="000000"/>
+          <w:sz w:val="17"/>
+        </w:rPr>
+        <w:t xml:space="preserve">• </w:t>
+      </w:r>
+      <w:r>
+        <w:rPr>
+          <w:rFonts w:ascii="Calibri" w:hAnsi="Calibri"/>
+          <w:color w:val="000000"/>
+          <w:sz w:val="17"/>
+        </w:rPr>
+        <w:t xml:space="preserve">Formulated the </w:t>
+      </w:r>
+      <w:r>
+        <w:rPr>
+          <w:rFonts w:ascii="Calibri" w:hAnsi="Calibri"/>
+          <w:b/>
+          <w:color w:val="000000"/>
+          <w:sz w:val="17"/>
+        </w:rPr>
+        <w:t>"Silent-by-Default"</w:t>
+      </w:r>
+      <w:r>
+        <w:rPr>
+          <w:rFonts w:ascii="Calibri" w:hAnsi="Calibri"/>
+          <w:color w:val="000000"/>
+          <w:sz w:val="17"/>
+        </w:rPr>
+        <w:t xml:space="preserve"> product thesis, passively ingesting audio transcripts and commit streams without channel spam while deliberately scoping out employee surveillance features in V1.</w:t>
+      </w:r>
+    </w:p>
+    <w:p>
+      <w:pPr>
+        <w:spacing w:before="0" w:after="12" w:line="252" w:lineRule="auto"/>
+        <w:ind w:left="230" w:hanging="230"/>
+      </w:pPr>
+      <w:r>
+        <w:rPr>
+          <w:rFonts w:ascii="Calibri" w:hAnsi="Calibri"/>
+          <w:b/>
+          <w:color w:val="000000"/>
+          <w:sz w:val="17"/>
+        </w:rPr>
+        <w:t xml:space="preserve">• </w:t>
+      </w:r>
+      <w:r>
+        <w:rPr>
+          <w:rFonts w:ascii="Calibri" w:hAnsi="Calibri"/>
+          <w:color w:val="000000"/>
+          <w:sz w:val="17"/>
+        </w:rPr>
+        <w:t xml:space="preserve">Architected deterministic audit engine powered by </w:t>
+      </w:r>
+      <w:r>
+        <w:rPr>
+          <w:rFonts w:ascii="Calibri" w:hAnsi="Calibri"/>
+          <w:b/>
+          <w:color w:val="000000"/>
+          <w:sz w:val="17"/>
+        </w:rPr>
+        <w:t>append-only PostgreSQL schemas</w:t>
+      </w:r>
+      <w:r>
+        <w:rPr>
+          <w:rFonts w:ascii="Calibri" w:hAnsi="Calibri"/>
+          <w:color w:val="000000"/>
+          <w:sz w:val="17"/>
+        </w:rPr>
+        <w:t>, surfacing discrepancies between spoken commitments and recorded codebase state strictly upon explicit user queries.</w:t>
+      </w:r>
+    </w:p>
+    <w:p>
+      <w:pPr>
+        <w:spacing w:before="0" w:after="40" w:line="252" w:lineRule="auto"/>
+        <w:ind w:left="230" w:hanging="230"/>
+      </w:pPr>
+      <w:r>
+        <w:rPr>
+          <w:rFonts w:ascii="Calibri" w:hAnsi="Calibri"/>
+          <w:b/>
+          <w:color w:val="000000"/>
+          <w:sz w:val="17"/>
+        </w:rPr>
+        <w:t xml:space="preserve">• </w:t>
+      </w:r>
+      <w:r>
+        <w:rPr>
+          <w:rFonts w:ascii="Calibri" w:hAnsi="Calibri"/>
+          <w:color w:val="000000"/>
+          <w:sz w:val="17"/>
+        </w:rPr>
+        <w:t xml:space="preserve">Shipped interactive clickable MVP on Lovable with live drift queries; authored comprehensive </w:t>
+      </w:r>
+      <w:r>
+        <w:rPr>
+          <w:rFonts w:ascii="Calibri" w:hAnsi="Calibri"/>
+          <w:b/>
+          <w:color w:val="000000"/>
+          <w:sz w:val="17"/>
+        </w:rPr>
+        <w:t>Notion PRD</w:t>
+      </w:r>
+      <w:r>
+        <w:rPr>
+          <w:rFonts w:ascii="Calibri" w:hAnsi="Calibri"/>
+          <w:color w:val="000000"/>
+          <w:sz w:val="17"/>
+        </w:rPr>
+        <w:t xml:space="preserve"> detailing state transition matrices, query grammar, and phased enterprise rollout.</w:t>
+      </w:r>
+    </w:p>
+    <w:p>
+      <w:pPr>
+        <w:spacing w:before="28" w:after="6" w:line="252" w:lineRule="auto"/>
+      </w:pPr>
+      <w:r>
+        <w:rPr>
+          <w:rFonts w:ascii="Calibri" w:hAnsi="Calibri"/>
+          <w:b/>
+          <w:color w:val="000000"/>
+          <w:sz w:val="18"/>
+        </w:rPr>
+        <w:t>FinMate AI — Conversational Expense Memory &amp; Deterministic Accounting</w:t>
+      </w:r>
+      <w:r>
+        <w:rPr>
+          <w:rFonts w:ascii="Calibri" w:hAnsi="Calibri"/>
+          <w:color w:val="000000"/>
+          <w:sz w:val="17"/>
+        </w:rPr>
+        <w:t xml:space="preserve">  |  FinTech Systems</w:t>
       </w:r>
     </w:p>
     <w:p>
@@ -609,13 +661,510 @@
         <w:rPr>
           <w:rFonts w:ascii="Calibri" w:hAnsi="Calibri"/>
           <w:b/>
+          <w:color w:val="000000"/>
           <w:sz w:val="17"/>
         </w:rPr>
-        <w:t xml:space="preserve">• Technical &amp; Problem-Solving: </w:t>
+        <w:t xml:space="preserve">Live Production MVP: </w:t>
+      </w:r>
+      <w:hyperlink r:id="rId21">
+        <w:r>
+          <w:rPr>
+            <w:rFonts w:ascii="Calibri" w:hAnsi="Calibri"/>
+            <w:sz w:val="17"/>
+            <w:color w:val="1D4ED8"/>
+            <w:u w:val="single"/>
+          </w:rPr>
+          <w:t xml:space="preserve">tell-finmate-ai.lovable.app</w:t>
+        </w:r>
+      </w:hyperlink>
+      <w:r>
+        <w:rPr>
+          <w:rFonts w:ascii="Calibri" w:hAnsi="Calibri"/>
+          <w:b/>
+          <w:color w:val="000000"/>
+          <w:sz w:val="17"/>
+        </w:rPr>
+        <w:t xml:space="preserve">   |   Architecture &amp; PRD: </w:t>
+      </w:r>
+      <w:hyperlink r:id="rId22">
+        <w:r>
+          <w:rPr>
+            <w:rFonts w:ascii="Calibri" w:hAnsi="Calibri"/>
+            <w:sz w:val="17"/>
+            <w:color w:val="1D4ED8"/>
+            <w:u w:val="single"/>
+          </w:rPr>
+          <w:t xml:space="preserve">Notion PRD</w:t>
+        </w:r>
+      </w:hyperlink>
+    </w:p>
+    <w:p>
+      <w:pPr>
+        <w:spacing w:before="0" w:after="12" w:line="252" w:lineRule="auto"/>
+        <w:ind w:left="230" w:hanging="230"/>
+      </w:pPr>
+      <w:r>
+        <w:rPr>
+          <w:rFonts w:ascii="Calibri" w:hAnsi="Calibri"/>
+          <w:b/>
+          <w:color w:val="000000"/>
+          <w:sz w:val="17"/>
+        </w:rPr>
+        <w:t xml:space="preserve">• </w:t>
       </w:r>
       <w:r>
         <w:rPr>
           <w:rFonts w:ascii="Calibri" w:hAnsi="Calibri"/>
+          <w:color w:val="000000"/>
+          <w:sz w:val="17"/>
+        </w:rPr>
+        <w:t>Uncovered key user friction in expense tracking where tedious manual multi-field forms trigger severe drop-off, while identifying that pure LLM bots hallucinate arithmetic totals, destroying financial trust.</w:t>
+      </w:r>
+    </w:p>
+    <w:p>
+      <w:pPr>
+        <w:spacing w:before="0" w:after="12" w:line="252" w:lineRule="auto"/>
+        <w:ind w:left="230" w:hanging="230"/>
+      </w:pPr>
+      <w:r>
+        <w:rPr>
+          <w:rFonts w:ascii="Calibri" w:hAnsi="Calibri"/>
+          <w:b/>
+          <w:color w:val="000000"/>
+          <w:sz w:val="17"/>
+        </w:rPr>
+        <w:t xml:space="preserve">• </w:t>
+      </w:r>
+      <w:r>
+        <w:rPr>
+          <w:rFonts w:ascii="Calibri" w:hAnsi="Calibri"/>
+          <w:color w:val="000000"/>
+          <w:sz w:val="17"/>
+        </w:rPr>
+        <w:t xml:space="preserve">Engineered </w:t>
+      </w:r>
+      <w:r>
+        <w:rPr>
+          <w:rFonts w:ascii="Calibri" w:hAnsi="Calibri"/>
+          <w:b/>
+          <w:color w:val="000000"/>
+          <w:sz w:val="17"/>
+        </w:rPr>
+        <w:t>two-stage decoupled architecture</w:t>
+      </w:r>
+      <w:r>
+        <w:rPr>
+          <w:rFonts w:ascii="Calibri" w:hAnsi="Calibri"/>
+          <w:color w:val="000000"/>
+          <w:sz w:val="17"/>
+        </w:rPr>
+        <w:t xml:space="preserve"> directing multimodal LLMs (voice notes, OCR receipts, chat) to extract structured JSON intents and entities, while routing all arithmetic calculations to concurrency-safe PostgreSQL stored procedures (RPCs).</w:t>
+      </w:r>
+    </w:p>
+    <w:p>
+      <w:pPr>
+        <w:spacing w:before="0" w:after="12" w:line="252" w:lineRule="auto"/>
+        <w:ind w:left="230" w:hanging="230"/>
+      </w:pPr>
+      <w:r>
+        <w:rPr>
+          <w:rFonts w:ascii="Calibri" w:hAnsi="Calibri"/>
+          <w:b/>
+          <w:color w:val="000000"/>
+          <w:sz w:val="17"/>
+        </w:rPr>
+        <w:t xml:space="preserve">• </w:t>
+      </w:r>
+      <w:r>
+        <w:rPr>
+          <w:rFonts w:ascii="Calibri" w:hAnsi="Calibri"/>
+          <w:color w:val="000000"/>
+          <w:sz w:val="17"/>
+        </w:rPr>
+        <w:t xml:space="preserve">Enforced complete financial auditability through </w:t>
+      </w:r>
+      <w:r>
+        <w:rPr>
+          <w:rFonts w:ascii="Calibri" w:hAnsi="Calibri"/>
+          <w:b/>
+          <w:color w:val="000000"/>
+          <w:sz w:val="17"/>
+        </w:rPr>
+        <w:t>evidence-linked ledger rows</w:t>
+      </w:r>
+      <w:r>
+        <w:rPr>
+          <w:rFonts w:ascii="Calibri" w:hAnsi="Calibri"/>
+          <w:color w:val="000000"/>
+          <w:sz w:val="17"/>
+        </w:rPr>
+        <w:t>, guaranteeing clickable citations for every balance response and preventing arithmetic discrepancies.</w:t>
+      </w:r>
+    </w:p>
+    <w:p>
+      <w:pPr>
+        <w:spacing w:before="0" w:after="40" w:line="252" w:lineRule="auto"/>
+        <w:ind w:left="230" w:hanging="230"/>
+      </w:pPr>
+      <w:r>
+        <w:rPr>
+          <w:rFonts w:ascii="Calibri" w:hAnsi="Calibri"/>
+          <w:b/>
+          <w:color w:val="000000"/>
+          <w:sz w:val="17"/>
+        </w:rPr>
+        <w:t xml:space="preserve">• </w:t>
+      </w:r>
+      <w:r>
+        <w:rPr>
+          <w:rFonts w:ascii="Calibri" w:hAnsi="Calibri"/>
+          <w:color w:val="000000"/>
+          <w:sz w:val="17"/>
+        </w:rPr>
+        <w:t xml:space="preserve">Deployed production-ready MVP on Lovable with </w:t>
+      </w:r>
+      <w:r>
+        <w:rPr>
+          <w:rFonts w:ascii="Calibri" w:hAnsi="Calibri"/>
+          <w:b/>
+          <w:color w:val="000000"/>
+          <w:sz w:val="17"/>
+        </w:rPr>
+        <w:t>streaming voice transcription</w:t>
+      </w:r>
+      <w:r>
+        <w:rPr>
+          <w:rFonts w:ascii="Calibri" w:hAnsi="Calibri"/>
+          <w:color w:val="000000"/>
+          <w:sz w:val="17"/>
+        </w:rPr>
+        <w:t xml:space="preserve"> and informal loan tracking; authored complete PRD covering database schemas, Row-Level Security (RLS) policies, and error handling.</w:t>
+      </w:r>
+    </w:p>
+    <w:p>
+      <w:pPr>
+        <w:spacing w:before="104" w:after="40" w:line="252" w:lineRule="auto"/>
+        <w:pBdr>
+          <w:bottom w:val="single" w:sz="6" w:space="2" w:color="94A3B8"/>
+        </w:pBdr>
+      </w:pPr>
+      <w:r>
+        <w:rPr>
+          <w:rFonts w:ascii="Calibri" w:hAnsi="Calibri"/>
+          <w:b/>
+          <w:color w:val="000000"/>
+          <w:sz w:val="19"/>
+        </w:rPr>
+        <w:t>PATENTS &amp; RESEARCH</w:t>
+      </w:r>
+    </w:p>
+    <w:p>
+      <w:pPr>
+        <w:spacing w:before="16" w:after="12" w:line="252" w:lineRule="auto"/>
+        <w:ind w:left="230" w:hanging="230"/>
+      </w:pPr>
+      <w:r>
+        <w:rPr>
+          <w:rFonts w:ascii="Calibri" w:hAnsi="Calibri"/>
+          <w:b/>
+          <w:color w:val="000000"/>
+          <w:sz w:val="17"/>
+        </w:rPr>
+        <w:t xml:space="preserve">• </w:t>
+      </w:r>
+      <w:r>
+        <w:rPr>
+          <w:rFonts w:ascii="Calibri" w:hAnsi="Calibri"/>
+          <w:b/>
+          <w:color w:val="000000"/>
+          <w:sz w:val="17"/>
+        </w:rPr>
+        <w:t xml:space="preserve">Filed Patent (South African Patent Office): </w:t>
+      </w:r>
+      <w:r>
+        <w:rPr>
+          <w:rFonts w:ascii="Calibri" w:hAnsi="Calibri"/>
+          <w:color w:val="000000"/>
+          <w:sz w:val="17"/>
+        </w:rPr>
+        <w:t>AI-Powered Lost &amp; Found Matching System — Conceptualized 5-factor blind multimodal scoring architecture (image embeddings, NLP text, geolocation, timestamp) with automated urgency detection | 2025</w:t>
+      </w:r>
+    </w:p>
+    <w:p>
+      <w:pPr>
+        <w:spacing w:before="0" w:after="40" w:line="252" w:lineRule="auto"/>
+        <w:ind w:left="230" w:hanging="230"/>
+      </w:pPr>
+      <w:r>
+        <w:rPr>
+          <w:rFonts w:ascii="Calibri" w:hAnsi="Calibri"/>
+          <w:b/>
+          <w:color w:val="000000"/>
+          <w:sz w:val="17"/>
+        </w:rPr>
+        <w:t xml:space="preserve">• </w:t>
+      </w:r>
+      <w:r>
+        <w:rPr>
+          <w:rFonts w:ascii="Calibri" w:hAnsi="Calibri"/>
+          <w:b/>
+          <w:color w:val="000000"/>
+          <w:sz w:val="17"/>
+        </w:rPr>
+        <w:t xml:space="preserve">HCI Research Study (Submitted to JASE for Peer Review): </w:t>
+      </w:r>
+      <w:r>
+        <w:rPr>
+          <w:rFonts w:ascii="Calibri" w:hAnsi="Calibri"/>
+          <w:color w:val="000000"/>
+          <w:sz w:val="17"/>
+        </w:rPr>
+        <w:t>AI-Driven Multilingual Adaptive UX Framework &amp; Zero-Risk Financial Sandbox — Designed dual-mode environment pairing live transactions with a simulated practice sandbox (dummy balances), in-situ Hold-to-Translate, and Circle-to-Understand gesture affordances | 2025</w:t>
+      </w:r>
+    </w:p>
+    <w:p>
+      <w:pPr>
+        <w:spacing w:before="104" w:after="40" w:line="252" w:lineRule="auto"/>
+        <w:pBdr>
+          <w:bottom w:val="single" w:sz="6" w:space="2" w:color="94A3B8"/>
+        </w:pBdr>
+      </w:pPr>
+      <w:r>
+        <w:rPr>
+          <w:rFonts w:ascii="Calibri" w:hAnsi="Calibri"/>
+          <w:b/>
+          <w:color w:val="000000"/>
+          <w:sz w:val="19"/>
+        </w:rPr>
+        <w:t>HONORS &amp; AWARDS</w:t>
+      </w:r>
+    </w:p>
+    <w:p>
+      <w:pPr>
+        <w:spacing w:before="16" w:after="12" w:line="252" w:lineRule="auto"/>
+        <w:ind w:left="230" w:hanging="230"/>
+      </w:pPr>
+      <w:r>
+        <w:rPr>
+          <w:rFonts w:ascii="Calibri" w:hAnsi="Calibri"/>
+          <w:b/>
+          <w:color w:val="000000"/>
+          <w:sz w:val="17"/>
+        </w:rPr>
+        <w:t xml:space="preserve">• </w:t>
+      </w:r>
+      <w:r>
+        <w:rPr>
+          <w:rFonts w:ascii="Calibri" w:hAnsi="Calibri"/>
+          <w:b/>
+          <w:color w:val="000000"/>
+          <w:sz w:val="17"/>
+        </w:rPr>
+        <w:t xml:space="preserve">National Finalist at India Innovates Hackathon: </w:t>
+      </w:r>
+      <w:r>
+        <w:rPr>
+          <w:rFonts w:ascii="Calibri" w:hAnsi="Calibri"/>
+          <w:color w:val="000000"/>
+          <w:sz w:val="17"/>
+        </w:rPr>
+        <w:t xml:space="preserve">Ranked among </w:t>
+      </w:r>
+      <w:r>
+        <w:rPr>
+          <w:rFonts w:ascii="Calibri" w:hAnsi="Calibri"/>
+          <w:b/>
+          <w:color w:val="000000"/>
+          <w:sz w:val="17"/>
+        </w:rPr>
+        <w:t>top 20% finalist teams</w:t>
+      </w:r>
+      <w:r>
+        <w:rPr>
+          <w:rFonts w:ascii="Calibri" w:hAnsi="Calibri"/>
+          <w:color w:val="000000"/>
+          <w:sz w:val="17"/>
+        </w:rPr>
+        <w:t xml:space="preserve"> nationwide out of </w:t>
+      </w:r>
+      <w:r>
+        <w:rPr>
+          <w:rFonts w:ascii="Calibri" w:hAnsi="Calibri"/>
+          <w:b/>
+          <w:color w:val="000000"/>
+          <w:sz w:val="17"/>
+        </w:rPr>
+        <w:t>6,000+ participating teams</w:t>
+      </w:r>
+      <w:r>
+        <w:rPr>
+          <w:rFonts w:ascii="Calibri" w:hAnsi="Calibri"/>
+          <w:color w:val="000000"/>
+          <w:sz w:val="17"/>
+        </w:rPr>
+        <w:t xml:space="preserve"> across India | 2026</w:t>
+      </w:r>
+    </w:p>
+    <w:p>
+      <w:pPr>
+        <w:spacing w:before="0" w:after="40" w:line="252" w:lineRule="auto"/>
+        <w:ind w:left="230" w:hanging="230"/>
+      </w:pPr>
+      <w:r>
+        <w:rPr>
+          <w:rFonts w:ascii="Calibri" w:hAnsi="Calibri"/>
+          <w:b/>
+          <w:color w:val="000000"/>
+          <w:sz w:val="17"/>
+        </w:rPr>
+        <w:t xml:space="preserve">• </w:t>
+      </w:r>
+      <w:r>
+        <w:rPr>
+          <w:rFonts w:ascii="Calibri" w:hAnsi="Calibri"/>
+          <w:b/>
+          <w:color w:val="000000"/>
+          <w:sz w:val="17"/>
+        </w:rPr>
+        <w:t xml:space="preserve">Qualified for Round 2 in GHCI 25 National GenAI Hackathon: </w:t>
+      </w:r>
+      <w:r>
+        <w:rPr>
+          <w:rFonts w:ascii="Calibri" w:hAnsi="Calibri"/>
+          <w:color w:val="000000"/>
+          <w:sz w:val="17"/>
+        </w:rPr>
+        <w:t xml:space="preserve">AnitaB.org India &amp; Backbase | 'Unbound with GenAI: Breaking Barriers, Creating Impact' | </w:t>
+      </w:r>
+      <w:hyperlink r:id="rId23">
+        <w:r>
+          <w:rPr>
+            <w:rFonts w:ascii="Calibri" w:hAnsi="Calibri"/>
+            <w:sz w:val="17"/>
+            <w:color w:val="1D4ED8"/>
+            <w:u w:val="single"/>
+            <w:b/>
+          </w:rPr>
+          <w:t xml:space="preserve">Certificate</w:t>
+        </w:r>
+      </w:hyperlink>
+      <w:r>
+        <w:rPr>
+          <w:rFonts w:ascii="Calibri" w:hAnsi="Calibri"/>
+          <w:color w:val="000000"/>
+          <w:sz w:val="17"/>
+        </w:rPr>
+        <w:t xml:space="preserve"> | 2025</w:t>
+      </w:r>
+    </w:p>
+    <w:p>
+      <w:pPr>
+        <w:spacing w:before="104" w:after="40" w:line="252" w:lineRule="auto"/>
+        <w:pBdr>
+          <w:bottom w:val="single" w:sz="6" w:space="2" w:color="94A3B8"/>
+        </w:pBdr>
+      </w:pPr>
+      <w:r>
+        <w:rPr>
+          <w:rFonts w:ascii="Calibri" w:hAnsi="Calibri"/>
+          <w:b/>
+          <w:color w:val="000000"/>
+          <w:sz w:val="19"/>
+        </w:rPr>
+        <w:t>SKILLS</w:t>
+      </w:r>
+    </w:p>
+    <w:p>
+      <w:pPr>
+        <w:spacing w:before="16" w:after="12" w:line="252" w:lineRule="auto"/>
+        <w:ind w:left="230" w:hanging="230"/>
+      </w:pPr>
+      <w:r>
+        <w:rPr>
+          <w:rFonts w:ascii="Calibri" w:hAnsi="Calibri"/>
+          <w:b/>
+          <w:color w:val="000000"/>
+          <w:sz w:val="17"/>
+        </w:rPr>
+        <w:t xml:space="preserve">• </w:t>
+      </w:r>
+      <w:r>
+        <w:rPr>
+          <w:rFonts w:ascii="Calibri" w:hAnsi="Calibri"/>
+          <w:b/>
+          <w:color w:val="000000"/>
+          <w:sz w:val="17"/>
+        </w:rPr>
+        <w:t xml:space="preserve">Product Management: </w:t>
+      </w:r>
+      <w:r>
+        <w:rPr>
+          <w:rFonts w:ascii="Calibri" w:hAnsi="Calibri"/>
+          <w:color w:val="000000"/>
+          <w:sz w:val="17"/>
+        </w:rPr>
+        <w:t>Product Discovery, Product Requirements Document (PRD), Jobs-to-be-Done (JTBD), User Journey Mapping, RICE Prioritization, North Star &amp; Guardrail Metrics, Customer Interviews, Experimentation, Go-to-Market (GTM) Strategy, Trade-off Analysis, Figma</w:t>
+      </w:r>
+    </w:p>
+    <w:p>
+      <w:pPr>
+        <w:spacing w:before="0" w:after="12" w:line="252" w:lineRule="auto"/>
+        <w:ind w:left="230" w:hanging="230"/>
+      </w:pPr>
+      <w:r>
+        <w:rPr>
+          <w:rFonts w:ascii="Calibri" w:hAnsi="Calibri"/>
+          <w:b/>
+          <w:color w:val="000000"/>
+          <w:sz w:val="17"/>
+        </w:rPr>
+        <w:t xml:space="preserve">• </w:t>
+      </w:r>
+      <w:r>
+        <w:rPr>
+          <w:rFonts w:ascii="Calibri" w:hAnsi="Calibri"/>
+          <w:b/>
+          <w:color w:val="000000"/>
+          <w:sz w:val="17"/>
+        </w:rPr>
+        <w:t xml:space="preserve">AI &amp; Systems: </w:t>
+      </w:r>
+      <w:r>
+        <w:rPr>
+          <w:rFonts w:ascii="Calibri" w:hAnsi="Calibri"/>
+          <w:color w:val="000000"/>
+          <w:sz w:val="17"/>
+        </w:rPr>
+        <w:t>LLM Prompt Engineering, Retrieval-Augmented Generation (RAG), AI Governance, Vector Embeddings, Multimodal AI (Voice, Vision OCR), PostgreSQL Stored Procedures (RPC), REST APIs, High-Level Design (HLD)</w:t>
+      </w:r>
+    </w:p>
+    <w:p>
+      <w:pPr>
+        <w:spacing w:before="0" w:after="12" w:line="252" w:lineRule="auto"/>
+        <w:ind w:left="230" w:hanging="230"/>
+      </w:pPr>
+      <w:r>
+        <w:rPr>
+          <w:rFonts w:ascii="Calibri" w:hAnsi="Calibri"/>
+          <w:b/>
+          <w:color w:val="000000"/>
+          <w:sz w:val="17"/>
+        </w:rPr>
+        <w:t xml:space="preserve">• </w:t>
+      </w:r>
+      <w:r>
+        <w:rPr>
+          <w:rFonts w:ascii="Calibri" w:hAnsi="Calibri"/>
+          <w:b/>
+          <w:color w:val="000000"/>
+          <w:sz w:val="17"/>
+        </w:rPr>
+        <w:t xml:space="preserve">Technical &amp; Problem-Solving: </w:t>
+      </w:r>
+      <w:r>
+        <w:rPr>
+          <w:rFonts w:ascii="Calibri" w:hAnsi="Calibri"/>
+          <w:color w:val="000000"/>
           <w:sz w:val="17"/>
         </w:rPr>
         <w:t>Java, Spring Framework, Python, SQL/PostgreSQL, REST APIs, Git, LangChain, LangGraph, Rapid Prototyping (Lovable.dev)</w:t>
@@ -624,18 +1173,30 @@
     <w:p>
       <w:pPr>
         <w:spacing w:before="0" w:after="40" w:line="252" w:lineRule="auto"/>
+        <w:ind w:left="230" w:hanging="230"/>
       </w:pPr>
       <w:r>
         <w:rPr>
           <w:rFonts w:ascii="Calibri" w:hAnsi="Calibri"/>
           <w:b/>
+          <w:color w:val="000000"/>
           <w:sz w:val="17"/>
         </w:rPr>
-        <w:t xml:space="preserve">• DSA &amp; Competitive Programming: </w:t>
+        <w:t xml:space="preserve">• </w:t>
       </w:r>
       <w:r>
         <w:rPr>
           <w:rFonts w:ascii="Calibri" w:hAnsi="Calibri"/>
+          <w:b/>
+          <w:color w:val="000000"/>
+          <w:sz w:val="17"/>
+        </w:rPr>
+        <w:t xml:space="preserve">DSA &amp; Competitive Programming: </w:t>
+      </w:r>
+      <w:r>
+        <w:rPr>
+          <w:rFonts w:ascii="Calibri" w:hAnsi="Calibri"/>
+          <w:color w:val="000000"/>
           <w:sz w:val="17"/>
         </w:rPr>
         <w:t>610+ Solved Problems — 400+ LeetCode, 210+ GeeksforGeeks (Data Structures, Algorithms, Problem Solving)</w:t>
@@ -643,16 +1204,16 @@
     </w:p>
     <w:p>
       <w:pPr>
-        <w:spacing w:before="84" w:after="32" w:line="252" w:lineRule="auto"/>
+        <w:spacing w:before="104" w:after="40" w:line="252" w:lineRule="auto"/>
         <w:pBdr>
-          <w:bottom w:val="single" w:sz="6" w:space="1" w:color="D5D5CE"/>
+          <w:bottom w:val="single" w:sz="6" w:space="2" w:color="94A3B8"/>
         </w:pBdr>
       </w:pPr>
       <w:r>
         <w:rPr>
           <w:rFonts w:ascii="Calibri" w:hAnsi="Calibri"/>
           <w:b/>
-          <w:color w:val="121214"/>
+          <w:color w:val="000000"/>
           <w:sz w:val="19"/>
         </w:rPr>
         <w:t>CERTIFICATIONS</w:t>
@@ -660,19 +1221,96 @@
     </w:p>
     <w:p>
       <w:pPr>
-        <w:spacing w:before="20" w:after="0" w:line="252" w:lineRule="auto"/>
+        <w:spacing w:before="16" w:after="0" w:line="252" w:lineRule="auto"/>
       </w:pPr>
+      <w:hyperlink r:id="rId24">
+        <w:r>
+          <w:rPr>
+            <w:rFonts w:ascii="Calibri" w:hAnsi="Calibri"/>
+            <w:sz w:val="17"/>
+            <w:color w:val="1D4ED8"/>
+            <w:u w:val="single"/>
+          </w:rPr>
+          <w:t xml:space="preserve">Product Management Masterclass (GeeksforGeeks)</w:t>
+        </w:r>
+      </w:hyperlink>
       <w:r>
         <w:rPr>
           <w:rFonts w:ascii="Calibri" w:hAnsi="Calibri"/>
+          <w:color w:val="000000"/>
           <w:sz w:val="17"/>
         </w:rPr>
-        <w:t>Product Management Masterclass (GeeksforGeeks)  |  AI Agents &amp; Automation (CampusX)  |  Advanced RAG Architecture (CampusX)  |  Prompt Engineering &amp; Docker for ML (CampusX)</w:t>
+        <w:t xml:space="preserve">   |   </w:t>
       </w:r>
+      <w:hyperlink r:id="rId25">
+        <w:r>
+          <w:rPr>
+            <w:rFonts w:ascii="Calibri" w:hAnsi="Calibri"/>
+            <w:sz w:val="17"/>
+            <w:color w:val="1D4ED8"/>
+            <w:u w:val="single"/>
+          </w:rPr>
+          <w:t xml:space="preserve">n8n Workflow Automation (CampusX)</w:t>
+        </w:r>
+      </w:hyperlink>
+      <w:r>
+        <w:rPr>
+          <w:rFonts w:ascii="Calibri" w:hAnsi="Calibri"/>
+          <w:color w:val="000000"/>
+          <w:sz w:val="17"/>
+        </w:rPr>
+        <w:t xml:space="preserve">   |   </w:t>
+      </w:r>
+      <w:r>
+        <w:rPr>
+          <w:rFonts w:ascii="Calibri" w:hAnsi="Calibri"/>
+          <w:color w:val="000000"/>
+          <w:sz w:val="17"/>
+        </w:rPr>
+        <w:t>Advanced RAG (CampusX)</w:t>
+      </w:r>
+      <w:r>
+        <w:rPr>
+          <w:rFonts w:ascii="Calibri" w:hAnsi="Calibri"/>
+          <w:color w:val="000000"/>
+          <w:sz w:val="17"/>
+        </w:rPr>
+        <w:t xml:space="preserve">   |   </w:t>
+      </w:r>
+      <w:hyperlink r:id="rId26">
+        <w:r>
+          <w:rPr>
+            <w:rFonts w:ascii="Calibri" w:hAnsi="Calibri"/>
+            <w:sz w:val="17"/>
+            <w:color w:val="1D4ED8"/>
+            <w:u w:val="single"/>
+          </w:rPr>
+          <w:t xml:space="preserve">Prompt Engineering</w:t>
+        </w:r>
+      </w:hyperlink>
+      <w:r>
+        <w:rPr>
+          <w:rFonts w:ascii="Calibri" w:hAnsi="Calibri"/>
+          <w:color w:val="000000"/>
+          <w:sz w:val="17"/>
+        </w:rPr>
+        <w:t xml:space="preserve">   |   </w:t>
+      </w:r>
+      <w:hyperlink r:id="rId27">
+        <w:r>
+          <w:rPr>
+            <w:rFonts w:ascii="Calibri" w:hAnsi="Calibri"/>
+            <w:sz w:val="17"/>
+            <w:color w:val="1D4ED8"/>
+            <w:u w:val="single"/>
+          </w:rPr>
+          <w:t xml:space="preserve">Docker for ML (CampusX)</w:t>
+        </w:r>
+      </w:hyperlink>
     </w:p>
     <w:sectPr>
       <w:pgSz w:w="12240" w:h="15840"/>
-      <w:pgMar w:top="504" w:right="576" w:bottom="504" w:left="576" w:header="720" w:footer="720" w:gutter="0"/>
+      <w:pgMar w:top="504" w:right="634" w:bottom="504" w:left="634" w:header="720" w:footer="720" w:gutter="0"/>
       <w:cols w:space="720"/>
       <w:docGrid w:linePitch="360"/>
     </w:sectPr>

</xml_diff>